<commit_message>
Update Practical 6 document
</commit_message>
<xml_diff>
--- a/docs/Prac6-COS 214.docx
+++ b/docs/Prac6-COS 214.docx
@@ -31,31 +31,7 @@
         <w:t xml:space="preserve">What is a workflow? </w:t>
       </w:r>
       <w:r>
-        <w:t xml:space="preserve">A workflow is </w:t>
-      </w:r>
-      <w:proofErr w:type="gramStart"/>
-      <w:r>
-        <w:t>basically a</w:t>
-      </w:r>
-      <w:proofErr w:type="gramEnd"/>
-      <w:r>
-        <w:t xml:space="preserve"> business process that has </w:t>
-      </w:r>
-      <w:proofErr w:type="gramStart"/>
-      <w:r>
-        <w:t>been automated</w:t>
-      </w:r>
-      <w:proofErr w:type="gramEnd"/>
-      <w:r>
-        <w:t xml:space="preserve">, where documents, information or tasks </w:t>
-      </w:r>
-      <w:proofErr w:type="gramStart"/>
-      <w:r>
-        <w:t>get passed</w:t>
-      </w:r>
-      <w:proofErr w:type="gramEnd"/>
-      <w:r>
-        <w:t xml:space="preserve"> between people following a set of rules. A workflow management system (WfMS) is the software that sets these workflows up and runs them, and the workflow engine is the part that does the actual running. Business process management (BPM) is the bigger picture, because it also covers analysing processes and how work is organised, not just automating it</w:t>
+        <w:t>A workflow is basically a business process that has been automated, where documents, information or tasks get passed between people following a set of rules. A workflow management system (WfMS) is the software that sets these workflows up and runs them, and the workflow engine is the part that does the actual running. Business process management (BPM) is the bigger picture, because it also covers analysing processes and how work is organised, not just automating it</w:t>
       </w:r>
       <w:sdt>
         <w:sdtPr>
@@ -107,15 +83,7 @@
         <w:t xml:space="preserve">Definition vs instance. </w:t>
       </w:r>
       <w:r>
-        <w:t xml:space="preserve">The definition is the blueprint: the steps in a process and the rules for moving between them. An instance is one running copy of that blueprint. </w:t>
-      </w:r>
-      <w:proofErr w:type="gramStart"/>
-      <w:r>
-        <w:t>Lots of</w:t>
-      </w:r>
-      <w:proofErr w:type="gramEnd"/>
-      <w:r>
-        <w:t xml:space="preserve"> instances can run at the same time from one model, and each one deals with its own case, so each needs its own state and data </w:t>
+        <w:t xml:space="preserve">The definition is the blueprint: the steps in a process and the rules for moving between them. An instance is one running copy of that blueprint. Lots of instances can run at the same time from one model, and each one deals with its own case, so each needs its own state and data </w:t>
       </w:r>
       <w:sdt>
         <w:sdtPr>
@@ -200,15 +168,7 @@
         <w:t>must</w:t>
       </w:r>
       <w:r>
-        <w:t xml:space="preserve"> do it, a work item shows up on their worklist. BPMN 2.0 splits tasks into user tasks (a human does it) and service tasks (a system does it). It also has sub-processes, which are activities with their own flow inside, and call activities, which reuse a process that </w:t>
-      </w:r>
-      <w:proofErr w:type="gramStart"/>
-      <w:r>
-        <w:t>is defined</w:t>
-      </w:r>
-      <w:proofErr w:type="gramEnd"/>
-      <w:r>
-        <w:t xml:space="preserve"> somewhere else</w:t>
+        <w:t xml:space="preserve"> do it, a work item shows up on their worklist. BPMN 2.0 splits tasks into user tasks (a human does it) and service tasks (a system does it). It also has sub-processes, which are activities with their own flow inside, and call activities, which reuse a process that is defined somewhere else</w:t>
       </w:r>
       <w:sdt>
         <w:sdtPr>
@@ -260,23 +220,7 @@
         <w:t xml:space="preserve">Routing. </w:t>
       </w:r>
       <w:r>
-        <w:t>The workflow patterns research lists the basic ways to route work: sequence, parallel split (AND), synchronisation, exclusive choice (XOR), simple merge, multi-</w:t>
-      </w:r>
-      <w:proofErr w:type="gramStart"/>
-      <w:r>
-        <w:t>choice</w:t>
-      </w:r>
-      <w:proofErr w:type="gramEnd"/>
-      <w:r>
-        <w:t xml:space="preserve"> and loops. </w:t>
-      </w:r>
-      <w:proofErr w:type="gramStart"/>
-      <w:r>
-        <w:t>Different products</w:t>
-      </w:r>
-      <w:proofErr w:type="gramEnd"/>
-      <w:r>
-        <w:t xml:space="preserve"> support different ones, so it makes sense to keep routing flexible and not hard-code it </w:t>
+        <w:t xml:space="preserve">The workflow patterns research lists the basic ways to route work: sequence, parallel split (AND), synchronisation, exclusive choice (XOR), simple merge, multi-choice and loops. Different products support different ones, so it makes sense to keep routing flexible and not hard-code it </w:t>
       </w:r>
       <w:sdt>
         <w:sdtPr>
@@ -322,15 +266,7 @@
         <w:t xml:space="preserve">Participants and assigning work. </w:t>
       </w:r>
       <w:r>
-        <w:t xml:space="preserve">Engines look after worklists and who </w:t>
-      </w:r>
-      <w:proofErr w:type="gramStart"/>
-      <w:r>
-        <w:t>is signed</w:t>
-      </w:r>
-      <w:proofErr w:type="gramEnd"/>
-      <w:r>
-        <w:t xml:space="preserve"> in. The BPM survey describes people using roles and organisational units, </w:t>
+        <w:t xml:space="preserve">Engines look after worklists and who is signed in. The BPM survey describes people using roles and organisational units, </w:t>
       </w:r>
       <w:r>
         <w:t>including</w:t>
@@ -391,36 +327,10 @@
           <w:bCs/>
           <w:color w:val="1F3864"/>
         </w:rPr>
-        <w:t xml:space="preserve">Events, </w:t>
-      </w:r>
-      <w:proofErr w:type="gramStart"/>
-      <w:r>
-        <w:rPr>
-          <w:b/>
-          <w:bCs/>
-          <w:color w:val="1F3864"/>
-        </w:rPr>
-        <w:t>failures</w:t>
-      </w:r>
-      <w:proofErr w:type="gramEnd"/>
-      <w:r>
-        <w:rPr>
-          <w:b/>
-          <w:bCs/>
-          <w:color w:val="1F3864"/>
-        </w:rPr>
-        <w:t xml:space="preserve"> and external systems. </w:t>
-      </w:r>
-      <w:r>
-        <w:t xml:space="preserve">In BPMN, boundary events sit on the edge of an activity and react while it is running. There are timer, message, </w:t>
-      </w:r>
-      <w:proofErr w:type="gramStart"/>
-      <w:r>
-        <w:t>error</w:t>
-      </w:r>
-      <w:proofErr w:type="gramEnd"/>
-      <w:r>
-        <w:t xml:space="preserve"> and escalation events. Compensation can undo activities that already finished if something goes wrong. The WfMC model also has separate interfaces for calling outside applications and talking to other workflow systems </w:t>
+        <w:t xml:space="preserve">Events, failures and external systems. </w:t>
+      </w:r>
+      <w:r>
+        <w:t xml:space="preserve">In BPMN, boundary events sit on the edge of an activity and react while it is running. There are timer, message, error and escalation events. Compensation can undo activities that already finished if something goes wrong. The WfMC model also has separate interfaces for calling outside applications and talking to other workflow systems </w:t>
       </w:r>
       <w:sdt>
         <w:sdtPr>
@@ -466,34 +376,10 @@
         <w:t xml:space="preserve">History and changing definitions. </w:t>
       </w:r>
       <w:r>
-        <w:t xml:space="preserve">Everything that happens </w:t>
-      </w:r>
-      <w:proofErr w:type="gramStart"/>
-      <w:r>
-        <w:t>gets saved</w:t>
-      </w:r>
-      <w:proofErr w:type="gramEnd"/>
-      <w:r>
-        <w:t xml:space="preserve"> in event logs, where each event points to an activity and a case, and process mining uses these logs to find out how processes really run. The WfMC treats audit as part of monitoring. </w:t>
-      </w:r>
-      <w:r>
-        <w:t xml:space="preserve">To see how a real product deals with a definition changing while work is still running, we looked at the documentation of Camunda, a company that makes a workflow engine. In Camunda, a changed definition </w:t>
-      </w:r>
-      <w:proofErr w:type="gramStart"/>
-      <w:r>
-        <w:t>is saved</w:t>
-      </w:r>
-      <w:proofErr w:type="gramEnd"/>
-      <w:r>
-        <w:t xml:space="preserve"> as </w:t>
-      </w:r>
-      <w:proofErr w:type="gramStart"/>
-      <w:r>
-        <w:t>a new version</w:t>
-      </w:r>
-      <w:proofErr w:type="gramEnd"/>
-      <w:r>
-        <w:t xml:space="preserve">. Running instances stay on the old version, new ones use the latest, and teams can choose to move running instances over without losing their history </w:t>
+        <w:t xml:space="preserve">Everything that happens gets saved in event logs, where each event points to an activity and a case, and process mining uses these logs to find out how processes really run. The WfMC treats audit as part of monitoring. </w:t>
+      </w:r>
+      <w:r>
+        <w:t xml:space="preserve">To see how a real product deals with a definition changing while work is still running, we looked at the documentation of Camunda, a company that makes a workflow engine. In Camunda, a changed definition is saved as a new version. Running instances stay on the old version, new ones use the latest, and teams can choose to move running instances over without losing their history </w:t>
       </w:r>
       <w:sdt>
         <w:sdtPr>
@@ -605,23 +491,7 @@
         <w:t xml:space="preserve">What this means for TIVIDY. </w:t>
       </w:r>
       <w:r>
-        <w:t xml:space="preserve">Our takeaway is that the engine should only know generic things like activities, instances, states, </w:t>
-      </w:r>
-      <w:proofErr w:type="gramStart"/>
-      <w:r>
-        <w:t>participants</w:t>
-      </w:r>
-      <w:proofErr w:type="gramEnd"/>
-      <w:r>
-        <w:t xml:space="preserve"> and events. Anything that changes between processes (the structure and versions, how work </w:t>
-      </w:r>
-      <w:proofErr w:type="gramStart"/>
-      <w:r>
-        <w:t>is grouped</w:t>
-      </w:r>
-      <w:proofErr w:type="gramEnd"/>
-      <w:r>
-        <w:t>, routing, assignment and approval rules, events and integrations, and reports and rollback) should be able to change without touching the rest.</w:t>
+        <w:t>Our takeaway is that the engine should only know generic things like activities, instances, states, participants and events. Anything that changes between processes (the structure and versions, how work is grouped, routing, assignment and approval rules, events and integrations, and reports and rollback) should be able to change without touching the rest.</w:t>
       </w:r>
     </w:p>
     <w:p>
@@ -666,15 +536,7 @@
     <w:p/>
     <w:p>
       <w:r>
-        <w:t xml:space="preserve">In a meal plan order-to-delivery shopping system that offers custom meal packages for </w:t>
-      </w:r>
-      <w:proofErr w:type="gramStart"/>
-      <w:r>
-        <w:t>customers;</w:t>
-      </w:r>
-      <w:proofErr w:type="gramEnd"/>
-      <w:r>
-        <w:t xml:space="preserve"> Breakfast, Lunch and </w:t>
+        <w:t xml:space="preserve">In a meal plan order-to-delivery shopping system that offers custom meal packages for customers; Breakfast, Lunch and </w:t>
       </w:r>
       <w:proofErr w:type="spellStart"/>
       <w:r>
@@ -866,26 +728,13 @@
         <w:t>3 Delivery Services:</w:t>
       </w:r>
       <w:r>
-        <w:t xml:space="preserve"> Three different third-party courier companies that </w:t>
-      </w:r>
-      <w:proofErr w:type="gramStart"/>
-      <w:r>
-        <w:t>handle</w:t>
-      </w:r>
-      <w:proofErr w:type="gramEnd"/>
-      <w:r>
-        <w:t xml:space="preserve"> final delivery in different regions.</w:t>
+        <w:t xml:space="preserve"> Three different third-party courier companies that handle final delivery in different regions.</w:t>
       </w:r>
       <w:r>
         <w:t xml:space="preserve"> </w:t>
       </w:r>
-      <w:proofErr w:type="gramStart"/>
-      <w:r>
-        <w:t>TIVIDY</w:t>
-      </w:r>
-      <w:proofErr w:type="gramEnd"/>
-      <w:r>
-        <w:t xml:space="preserve"> connects their different systems using special bridges (</w:t>
+      <w:r>
+        <w:t>TIVIDY connects their different systems using special bridges (</w:t>
       </w:r>
       <w:r>
         <w:rPr>
@@ -1041,25 +890,7 @@
           <w:bCs/>
           <w:color w:val="1F3864"/>
         </w:rPr>
-        <w:t xml:space="preserve">Decisions, </w:t>
-      </w:r>
-      <w:proofErr w:type="gramStart"/>
-      <w:r>
-        <w:rPr>
-          <w:b/>
-          <w:bCs/>
-          <w:color w:val="1F3864"/>
-        </w:rPr>
-        <w:t>Rules</w:t>
-      </w:r>
-      <w:proofErr w:type="gramEnd"/>
-      <w:r>
-        <w:rPr>
-          <w:b/>
-          <w:bCs/>
-          <w:color w:val="1F3864"/>
-        </w:rPr>
-        <w:t xml:space="preserve"> and Steps</w:t>
+        <w:t>Decisions, Rules and Steps</w:t>
       </w:r>
     </w:p>
     <w:p>
@@ -1115,15 +946,7 @@
         <w:t>Dependencies:</w:t>
       </w:r>
       <w:r>
-        <w:t xml:space="preserve"> Packing can only start after all selected meals in a bundle </w:t>
-      </w:r>
-      <w:proofErr w:type="gramStart"/>
-      <w:r>
-        <w:t>are cooked</w:t>
-      </w:r>
-      <w:proofErr w:type="gramEnd"/>
-      <w:r>
-        <w:t xml:space="preserve"> and ready.</w:t>
+        <w:t xml:space="preserve"> Packing can only start after all selected meals in a bundle are cooked and ready.</w:t>
       </w:r>
     </w:p>
     <w:p>
@@ -1142,23 +965,7 @@
         <w:t xml:space="preserve">Delivery Routing: </w:t>
       </w:r>
       <w:r>
-        <w:t xml:space="preserve">TIVIDY automatically picks </w:t>
-      </w:r>
-      <w:proofErr w:type="gramStart"/>
-      <w:r>
-        <w:t>1</w:t>
-      </w:r>
-      <w:proofErr w:type="gramEnd"/>
-      <w:r>
-        <w:t xml:space="preserve"> of the </w:t>
-      </w:r>
-      <w:proofErr w:type="gramStart"/>
-      <w:r>
-        <w:t>3</w:t>
-      </w:r>
-      <w:proofErr w:type="gramEnd"/>
-      <w:r>
-        <w:t xml:space="preserve"> delivery companies based on the customer’s delivery area (</w:t>
+        <w:t>TIVIDY automatically picks 1 of the 3 delivery companies based on the customer’s delivery area (</w:t>
       </w:r>
       <w:r>
         <w:rPr>
@@ -1234,15 +1041,7 @@
         <w:t>Out of stock issues:</w:t>
       </w:r>
       <w:r>
-        <w:t xml:space="preserve"> If ingredients run out, the issue </w:t>
-      </w:r>
-      <w:proofErr w:type="gramStart"/>
-      <w:r>
-        <w:t>gets passed</w:t>
-      </w:r>
-      <w:proofErr w:type="gramEnd"/>
-      <w:r>
-        <w:t xml:space="preserve"> up the chain from Kitchen staff to Supervisor to Manager until its solved (</w:t>
+        <w:t xml:space="preserve"> If ingredients run out, the issue gets passed up the chain from Kitchen staff to Supervisor to Manager until its solved (</w:t>
       </w:r>
       <w:r>
         <w:rPr>
@@ -1318,10 +1117,18 @@
           <w:szCs w:val="30"/>
         </w:rPr>
         <w:lastRenderedPageBreak/>
-        <w:t xml:space="preserve">Task </w:t>
-      </w:r>
-      <w:proofErr w:type="gramStart"/>
-      <w:r>
+        <w:t>Task 3</w:t>
+      </w:r>
+    </w:p>
+    <w:p>
+      <w:r>
+        <w:br w:type="page"/>
+      </w:r>
+    </w:p>
+    <w:p>
+      <w:pPr>
+        <w:pStyle w:val="Heading1"/>
+        <w:spacing w:after="140"/>
         <w:rPr>
           <w:b/>
           <w:bCs/>
@@ -1329,19 +1136,8 @@
           <w:sz w:val="30"/>
           <w:szCs w:val="30"/>
         </w:rPr>
-        <w:t>3</w:t>
-      </w:r>
-      <w:proofErr w:type="gramEnd"/>
-    </w:p>
-    <w:p>
-      <w:r>
-        <w:br w:type="page"/>
-      </w:r>
-    </w:p>
-    <w:p>
-      <w:pPr>
-        <w:pStyle w:val="Heading1"/>
-        <w:spacing w:after="140"/>
+      </w:pPr>
+      <w:r>
         <w:rPr>
           <w:b/>
           <w:bCs/>
@@ -1349,62 +1145,11 @@
           <w:sz w:val="30"/>
           <w:szCs w:val="30"/>
         </w:rPr>
-      </w:pPr>
-      <w:r>
-        <w:rPr>
-          <w:b/>
-          <w:bCs/>
-          <w:color w:val="1F3864"/>
-          <w:sz w:val="30"/>
-          <w:szCs w:val="30"/>
-        </w:rPr>
         <w:lastRenderedPageBreak/>
-        <w:t xml:space="preserve">Task </w:t>
-      </w:r>
-      <w:r>
-        <w:rPr>
-          <w:b/>
-          <w:bCs/>
-          <w:color w:val="1F3864"/>
-          <w:sz w:val="30"/>
-          <w:szCs w:val="30"/>
-        </w:rPr>
-        <w:t>4</w:t>
-      </w:r>
-      <w:r>
-        <w:rPr>
-          <w:b/>
-          <w:bCs/>
-          <w:color w:val="1F3864"/>
-          <w:sz w:val="30"/>
-          <w:szCs w:val="30"/>
-        </w:rPr>
-        <w:t xml:space="preserve">: </w:t>
-      </w:r>
-      <w:r>
-        <w:rPr>
-          <w:b/>
-          <w:bCs/>
-          <w:color w:val="1F3864"/>
-          <w:sz w:val="30"/>
-          <w:szCs w:val="30"/>
-        </w:rPr>
-        <w:t>Design Patterns</w:t>
-      </w:r>
-    </w:p>
-    <w:p>
-      <w:pPr>
-        <w:pStyle w:val="Heading1"/>
-        <w:spacing w:after="140"/>
-        <w:rPr>
-          <w:b/>
-          <w:bCs/>
-          <w:color w:val="1F3864"/>
-          <w:sz w:val="30"/>
-          <w:szCs w:val="30"/>
-        </w:rPr>
-      </w:pPr>
-    </w:p>
+        <w:t>Task 4: Design Patterns</w:t>
+      </w:r>
+    </w:p>
+    <w:p/>
     <w:p>
       <w:pPr>
         <w:rPr>
@@ -1455,23 +1200,7 @@
         <w:t xml:space="preserve"> </w:t>
       </w:r>
       <w:r>
-        <w:t xml:space="preserve">A meal-plan definition </w:t>
-      </w:r>
-      <w:proofErr w:type="gramStart"/>
-      <w:r>
-        <w:t>is assembled</w:t>
-      </w:r>
-      <w:proofErr w:type="gramEnd"/>
-      <w:r>
-        <w:t xml:space="preserve"> in </w:t>
-      </w:r>
-      <w:proofErr w:type="gramStart"/>
-      <w:r>
-        <w:t>several</w:t>
-      </w:r>
-      <w:proofErr w:type="gramEnd"/>
-      <w:r>
-        <w:t xml:space="preserve"> steps (validate coupon → prepare meals → package → courier delivery), with routing rules and an escalation chain attached. It must be complete and validated before any customer order runs from it, and it must not change under running orders.</w:t>
+        <w:t>A meal-plan definition is assembled in several steps (validate coupon → prepare meals → package → courier delivery), with routing rules and an escalation chain attached. It must be complete and validated before any customer order runs from it, and it must not change under running orders.</w:t>
       </w:r>
     </w:p>
     <w:p/>
@@ -1482,15 +1211,7 @@
           <w:bCs/>
           <w:color w:val="1F3864"/>
         </w:rPr>
-        <w:t>Participants</w:t>
-      </w:r>
-      <w:r>
-        <w:rPr>
-          <w:b/>
-          <w:bCs/>
-          <w:color w:val="1F3864"/>
-        </w:rPr>
-        <w:t>:</w:t>
+        <w:t>Participants:</w:t>
       </w:r>
       <w:r>
         <w:t xml:space="preserve"> </w:t>
@@ -1645,29 +1366,13 @@
           <w:bCs/>
           <w:color w:val="1F3864"/>
         </w:rPr>
-        <w:t>Collaboration</w:t>
-      </w:r>
-      <w:r>
-        <w:rPr>
-          <w:b/>
-          <w:bCs/>
-          <w:color w:val="1F3864"/>
-        </w:rPr>
-        <w:t>:</w:t>
+        <w:t>Collaboration:</w:t>
       </w:r>
       <w:r>
         <w:t xml:space="preserve"> </w:t>
       </w:r>
       <w:r>
-        <w:t xml:space="preserve">The WorkflowDesigner directs the WorkflowDefinitionBuilder step by step, telling it which stages, work items, assignment </w:t>
-      </w:r>
-      <w:proofErr w:type="gramStart"/>
-      <w:r>
-        <w:t>rules</w:t>
-      </w:r>
-      <w:proofErr w:type="gramEnd"/>
-      <w:r>
-        <w:t xml:space="preserve"> and escalation chain to include. MealOrderDefinitionBuilder records each step into the definition under construction. Once the designer finishes, the builder checks that the definition is complete and hands back a versioned WorkflowDefinition.</w:t>
+        <w:t>The WorkflowDesigner directs the WorkflowDefinitionBuilder step by step, telling it which stages, work items, assignment rules and escalation chain to include. MealOrderDefinitionBuilder records each step into the definition under construction. Once the designer finishes, the builder checks that the definition is complete and hands back a versioned WorkflowDefinition.</w:t>
       </w:r>
     </w:p>
     <w:p/>
@@ -1678,37 +1383,13 @@
           <w:bCs/>
           <w:color w:val="1F3864"/>
         </w:rPr>
-        <w:t>Variation</w:t>
-      </w:r>
-      <w:r>
-        <w:rPr>
-          <w:b/>
-          <w:bCs/>
-          <w:color w:val="1F3864"/>
-        </w:rPr>
-        <w:t>:</w:t>
+        <w:t>Variation:</w:t>
       </w:r>
       <w:r>
         <w:t xml:space="preserve"> </w:t>
       </w:r>
       <w:r>
-        <w:t xml:space="preserve">The steps, their order and the rules attached to them (assignment strategy, escalation chain) differ for every kind of process. </w:t>
-      </w:r>
-      <w:proofErr w:type="gramStart"/>
-      <w:r>
-        <w:t>A new version</w:t>
-      </w:r>
-      <w:proofErr w:type="gramEnd"/>
-      <w:r>
-        <w:t xml:space="preserve"> of the definition </w:t>
-      </w:r>
-      <w:proofErr w:type="gramStart"/>
-      <w:r>
-        <w:t>is produced</w:t>
-      </w:r>
-      <w:proofErr w:type="gramEnd"/>
-      <w:r>
-        <w:t xml:space="preserve"> whenever any of them changes.</w:t>
+        <w:t>The steps, their order and the rules attached to them (assignment strategy, escalation chain) differ for every kind of process. A new version of the definition is produced whenever any of them changes.</w:t>
       </w:r>
     </w:p>
     <w:p/>
@@ -1719,37 +1400,13 @@
           <w:bCs/>
           <w:color w:val="1F3864"/>
         </w:rPr>
-        <w:t>Why is it appropriate</w:t>
-      </w:r>
-      <w:r>
-        <w:rPr>
-          <w:b/>
-          <w:bCs/>
-          <w:color w:val="1F3864"/>
-        </w:rPr>
-        <w:t>:</w:t>
+        <w:t>Why is it appropriate:</w:t>
       </w:r>
       <w:r>
         <w:t xml:space="preserve"> </w:t>
       </w:r>
       <w:r>
-        <w:t xml:space="preserve">The Builder is the construction side of the definition/instance split and the only place where a definition </w:t>
-      </w:r>
-      <w:proofErr w:type="gramStart"/>
-      <w:r>
-        <w:t>is created</w:t>
-      </w:r>
-      <w:proofErr w:type="gramEnd"/>
-      <w:r>
-        <w:t xml:space="preserve">. By the </w:t>
-      </w:r>
-      <w:proofErr w:type="gramStart"/>
-      <w:r>
-        <w:t>time</w:t>
-      </w:r>
-      <w:proofErr w:type="gramEnd"/>
-      <w:r>
-        <w:t xml:space="preserve"> a WorkflowDefinition reaches the engine it is complete, validated and read-only, so later edits cannot disturb orders already running</w:t>
+        <w:t>The Builder is the construction side of the definition/instance split and the only place where a definition is created. By the time a WorkflowDefinition reaches the engine it is complete, validated and read-only, so later edits cannot disturb orders already running</w:t>
       </w:r>
       <w:r>
         <w:t>.</w:t>
@@ -2393,47 +2050,7 @@
         <w:t xml:space="preserve"> </w:t>
       </w:r>
       <w:r>
-        <w:t xml:space="preserve">An order's valid actions depend on where it is. It </w:t>
-      </w:r>
-      <w:proofErr w:type="gramStart"/>
-      <w:r>
-        <w:t>can't</w:t>
-      </w:r>
-      <w:proofErr w:type="gramEnd"/>
-      <w:r>
-        <w:t xml:space="preserve"> </w:t>
-      </w:r>
-      <w:proofErr w:type="gramStart"/>
-      <w:r>
-        <w:t>be cancelled</w:t>
-      </w:r>
-      <w:proofErr w:type="gramEnd"/>
-      <w:r>
-        <w:t xml:space="preserve"> once in transit, and it </w:t>
-      </w:r>
-      <w:proofErr w:type="gramStart"/>
-      <w:r>
-        <w:t>can't</w:t>
-      </w:r>
-      <w:proofErr w:type="gramEnd"/>
-      <w:r>
-        <w:t xml:space="preserve"> </w:t>
-      </w:r>
-      <w:proofErr w:type="gramStart"/>
-      <w:r>
-        <w:t>be advanced</w:t>
-      </w:r>
-      <w:proofErr w:type="gramEnd"/>
-      <w:r>
-        <w:t xml:space="preserve"> to "In transit" before packaging </w:t>
-      </w:r>
-      <w:proofErr w:type="gramStart"/>
-      <w:r>
-        <w:t>is done</w:t>
-      </w:r>
-      <w:proofErr w:type="gramEnd"/>
-      <w:r>
-        <w:t>.</w:t>
+        <w:t>An order's valid actions depend on where it is. It can't be cancelled once in transit, and it can't be advanced to "In transit" before packaging is done.</w:t>
       </w:r>
     </w:p>
     <w:p/>
@@ -2586,15 +2203,7 @@
         <w:t xml:space="preserve"> </w:t>
       </w:r>
       <w:r>
-        <w:t xml:space="preserve">The WorkflowInstance hands every request it receives to its current InstanceState and does not decide anything itself. Each ConcreteState either </w:t>
-      </w:r>
-      <w:proofErr w:type="gramStart"/>
-      <w:r>
-        <w:t>carries out</w:t>
-      </w:r>
-      <w:proofErr w:type="gramEnd"/>
-      <w:r>
-        <w:t xml:space="preserve"> the request and switches the instance to the next state, such as PreparingState moving the order on to PackagingState, or refuses it, such as InTransitState refusing a cancellation.</w:t>
+        <w:t>The WorkflowInstance hands every request it receives to its current InstanceState and does not decide anything itself. Each ConcreteState either carries out the request and switches the instance to the next state, such as PreparingState moving the order on to PackagingState, or refuses it, such as InTransitState refusing a cancellation.</w:t>
       </w:r>
     </w:p>
     <w:p/>
@@ -2628,23 +2237,7 @@
         <w:t xml:space="preserve"> </w:t>
       </w:r>
       <w:r>
-        <w:t xml:space="preserve">The State pattern gives the running instance a controlled lifecycle. Every operation </w:t>
-      </w:r>
-      <w:proofErr w:type="gramStart"/>
-      <w:r>
-        <w:t>is checked</w:t>
-      </w:r>
-      <w:proofErr w:type="gramEnd"/>
-      <w:r>
-        <w:t xml:space="preserve"> by the current state, so invalid actions such as cancelling an order in transit </w:t>
-      </w:r>
-      <w:proofErr w:type="gramStart"/>
-      <w:r>
-        <w:t>are rejected</w:t>
-      </w:r>
-      <w:proofErr w:type="gramEnd"/>
-      <w:r>
-        <w:t xml:space="preserve"> in one place instead of through status flags and switch statements</w:t>
+        <w:t>The State pattern gives the running instance a controlled lifecycle. Every operation is checked by the current state, so invalid actions such as cancelling an order in transit are rejected in one place instead of through status flags and switch statements</w:t>
       </w:r>
       <w:r>
         <w:t>.</w:t>
@@ -2878,23 +2471,7 @@
         <w:t xml:space="preserve"> </w:t>
       </w:r>
       <w:r>
-        <w:t xml:space="preserve">How work </w:t>
-      </w:r>
-      <w:proofErr w:type="gramStart"/>
-      <w:r>
-        <w:t>is assigned</w:t>
-      </w:r>
-      <w:proofErr w:type="gramEnd"/>
-      <w:r>
-        <w:t xml:space="preserve"> differs between organisations and even between work items, whether by role, by workload or by a rule on workflow data such as delivery area. Each of these rules is a separate algorithm that can </w:t>
-      </w:r>
-      <w:proofErr w:type="gramStart"/>
-      <w:r>
-        <w:t>be swapped</w:t>
-      </w:r>
-      <w:proofErr w:type="gramEnd"/>
-      <w:r>
-        <w:t xml:space="preserve"> without touching the tasks.</w:t>
+        <w:t>How work is assigned differs between organisations and even between work items, whether by role, by workload or by a rule on workflow data such as delivery area. Each of these rules is a separate algorithm that can be swapped without touching the tasks.</w:t>
       </w:r>
     </w:p>
     <w:p/>
@@ -2962,15 +2539,7 @@
         <w:t xml:space="preserve"> </w:t>
       </w:r>
       <w:r>
-        <w:t xml:space="preserve">When ingredients run out or a delivery fails, the issue must climb from kitchen staff to supervisor to branch manager until someone resolves it, and nobody should need to know who </w:t>
-      </w:r>
-      <w:proofErr w:type="gramStart"/>
-      <w:r>
-        <w:t>handles</w:t>
-      </w:r>
-      <w:proofErr w:type="gramEnd"/>
-      <w:r>
-        <w:t xml:space="preserve"> what.</w:t>
+        <w:t>When ingredients run out or a delivery fails, the issue must climb from kitchen staff to supervisor to branch manager until someone resolves it, and nobody should need to know who handles what.</w:t>
       </w:r>
     </w:p>
     <w:p/>
@@ -3220,55 +2789,15 @@
         <w:t xml:space="preserve"> </w:t>
       </w:r>
       <w:r>
-        <w:t xml:space="preserve">When packaging finishes, </w:t>
+        <w:t xml:space="preserve">When packaging finishes, several unrelated things must </w:t>
       </w:r>
       <w:proofErr w:type="gramStart"/>
       <w:r>
-        <w:t>several</w:t>
+        <w:t>happen:</w:t>
       </w:r>
       <w:proofErr w:type="gramEnd"/>
       <w:r>
-        <w:t xml:space="preserve"> unrelated things must </w:t>
-      </w:r>
-      <w:proofErr w:type="gramStart"/>
-      <w:r>
-        <w:t>happen:</w:t>
-      </w:r>
-      <w:proofErr w:type="gramEnd"/>
-      <w:r>
-        <w:t xml:space="preserve"> customer support </w:t>
-      </w:r>
-      <w:proofErr w:type="gramStart"/>
-      <w:r>
-        <w:t>is alerted</w:t>
-      </w:r>
-      <w:proofErr w:type="gramEnd"/>
-      <w:r>
-        <w:t xml:space="preserve">, an SMS goes out, the audit log </w:t>
-      </w:r>
-      <w:proofErr w:type="gramStart"/>
-      <w:r>
-        <w:t>is written</w:t>
-      </w:r>
-      <w:proofErr w:type="gramEnd"/>
-      <w:r>
-        <w:t xml:space="preserve">, and the next step </w:t>
-      </w:r>
-      <w:proofErr w:type="gramStart"/>
-      <w:r>
-        <w:t>is made</w:t>
-      </w:r>
-      <w:proofErr w:type="gramEnd"/>
-      <w:r>
-        <w:t xml:space="preserve"> available. The core model </w:t>
-      </w:r>
-      <w:proofErr w:type="gramStart"/>
-      <w:r>
-        <w:t>shouldn't</w:t>
-      </w:r>
-      <w:proofErr w:type="gramEnd"/>
-      <w:r>
-        <w:t xml:space="preserve"> know about any of them.</w:t>
+        <w:t xml:space="preserve"> customer support is alerted, an SMS goes out, the audit log is written, and the next step is made available. The core model shouldn't know about any of them.</w:t>
       </w:r>
     </w:p>
     <w:p/>
@@ -3444,15 +2973,7 @@
         <w:t xml:space="preserve"> </w:t>
       </w:r>
       <w:r>
-        <w:t xml:space="preserve">The listeners register with the WorkflowInstance when it </w:t>
-      </w:r>
-      <w:proofErr w:type="gramStart"/>
-      <w:r>
-        <w:t>is created</w:t>
-      </w:r>
-      <w:proofErr w:type="gramEnd"/>
-      <w:r>
-        <w:t>. When a task finishes, the instance publishes an event to all of them without knowing what they do. SmsNotifier messages the customer, SupportDashboardListener alerts customer support, AuditLogger adds the event to the history, and NextItemActivator makes the next work item available, which can also move the instance on to its next state. The listeners work independently and do not know about each other.</w:t>
+        <w:t>The listeners register with the WorkflowInstance when it is created. When a task finishes, the instance publishes an event to all of them without knowing what they do. SmsNotifier messages the customer, SupportDashboardListener alerts customer support, AuditLogger adds the event to the history, and NextItemActivator makes the next work item available, which can also move the instance on to its next state. The listeners work independently and do not know about each other.</w:t>
       </w:r>
     </w:p>
     <w:p/>
@@ -3486,13 +3007,8 @@
         <w:t xml:space="preserve"> </w:t>
       </w:r>
       <w:r>
-        <w:t xml:space="preserve">The Observer decouples the core model from everything that reacts to it. The model publishes events without knowing who receives them, so a new notification or integration only needs a new listener to </w:t>
-      </w:r>
-      <w:proofErr w:type="gramStart"/>
-      <w:r>
-        <w:t>be attached</w:t>
-      </w:r>
-      <w:proofErr w:type="gramEnd"/>
+        <w:t>The Observer decouples the core model from everything that reacts to it. The model publishes events without knowing who receives them, so a new notification or integration only needs a new listener to be attached</w:t>
+      </w:r>
       <w:r>
         <w:t>.</w:t>
       </w:r>
@@ -3799,15 +3315,7 @@
         <w:t xml:space="preserve"> </w:t>
       </w:r>
       <w:r>
-        <w:t xml:space="preserve">A work element sometimes needs extra behaviour wrapped around it, such as applying a discount coupon to the order cost, writing audit </w:t>
-      </w:r>
-      <w:proofErr w:type="gramStart"/>
-      <w:r>
-        <w:t>entries</w:t>
-      </w:r>
-      <w:proofErr w:type="gramEnd"/>
-      <w:r>
-        <w:t xml:space="preserve"> or raising its priority. These extras must be combinable in any order without a separate subclass for every combination, and without making the task a different kind of task.</w:t>
+        <w:t>A work element sometimes needs extra behaviour wrapped around it, such as applying a discount coupon to the order cost, writing audit entries or raising its priority. These extras must be combinable in any order without a separate subclass for every combination, and without making the task a different kind of task.</w:t>
       </w:r>
     </w:p>
     <w:p/>
@@ -3995,22 +3503,14 @@
         <w:t>FullDayPackage</w:t>
       </w:r>
       <w:r>
-        <w:t xml:space="preserve"> and lowers the order cost by the coupon rule before the cost reaches the engine. Decorators can </w:t>
+        <w:t xml:space="preserve"> and lowers the order cost by the coupon rule before the cost reaches the engine. Decorators can be wrapped around each other, such as AuditedDecorator around CouponDecorator around the bundle, and each </w:t>
       </w:r>
       <w:proofErr w:type="gramStart"/>
       <w:r>
-        <w:t>be wrapped</w:t>
+        <w:t>passes</w:t>
       </w:r>
       <w:proofErr w:type="gramEnd"/>
       <w:r>
-        <w:t xml:space="preserve"> around each other, such as AuditedDecorator around CouponDecorator around the bundle, and each </w:t>
-      </w:r>
-      <w:proofErr w:type="gramStart"/>
-      <w:r>
-        <w:t>passes</w:t>
-      </w:r>
-      <w:proofErr w:type="gramEnd"/>
-      <w:r>
         <w:t xml:space="preserve"> everything else straight through to the element inside it.</w:t>
       </w:r>
     </w:p>
@@ -4028,15 +3528,7 @@
         <w:t xml:space="preserve"> </w:t>
       </w:r>
       <w:r>
-        <w:t xml:space="preserve">Which extras apply to an item (one or </w:t>
-      </w:r>
-      <w:proofErr w:type="gramStart"/>
-      <w:r>
-        <w:t>several</w:t>
-      </w:r>
-      <w:proofErr w:type="gramEnd"/>
-      <w:r>
-        <w:t xml:space="preserve"> coupons, auditing, priority) differs per order and per workflow. </w:t>
+        <w:t xml:space="preserve">Which extras apply to an item (one or several coupons, auditing, priority) differs per order and per workflow. </w:t>
       </w:r>
     </w:p>
     <w:p/>
@@ -4053,15 +3545,7 @@
         <w:t xml:space="preserve"> </w:t>
       </w:r>
       <w:r>
-        <w:t xml:space="preserve">The Decorator lets cross-cutting behaviour </w:t>
-      </w:r>
-      <w:proofErr w:type="gramStart"/>
-      <w:r>
-        <w:t>be attached</w:t>
-      </w:r>
-      <w:proofErr w:type="gramEnd"/>
-      <w:r>
-        <w:t xml:space="preserve"> to tasks and bundles without modifying them or creating a subclass per combination.</w:t>
+        <w:t>The Decorator lets cross-cutting behaviour be attached to tasks and bundles without modifying them or creating a subclass per combination.</w:t>
       </w:r>
     </w:p>
     <w:p/>
@@ -4115,15 +3599,7 @@
         <w:t xml:space="preserve"> </w:t>
       </w:r>
       <w:r>
-        <w:t xml:space="preserve">If the customer cancels or changes a coupon or address, the order must return to its previous state cleanly, and the history of what happened must not </w:t>
-      </w:r>
-      <w:proofErr w:type="gramStart"/>
-      <w:r>
-        <w:t>be erased</w:t>
-      </w:r>
-      <w:proofErr w:type="gramEnd"/>
-      <w:r>
-        <w:t>.</w:t>
+        <w:t>If the customer cancels or changes a coupon or address, the order must return to its previous state cleanly, and the history of what happened must not be erased.</w:t>
       </w:r>
     </w:p>
     <w:p/>
@@ -4290,31 +3766,7 @@
         <w:t xml:space="preserve"> </w:t>
       </w:r>
       <w:r>
-        <w:t xml:space="preserve">What needs to </w:t>
-      </w:r>
-      <w:proofErr w:type="gramStart"/>
-      <w:r>
-        <w:t>be captured</w:t>
-      </w:r>
-      <w:proofErr w:type="gramEnd"/>
-      <w:r>
-        <w:t xml:space="preserve"> (payload, states, assignments) and how </w:t>
-      </w:r>
-      <w:proofErr w:type="gramStart"/>
-      <w:r>
-        <w:t>many</w:t>
-      </w:r>
-      <w:proofErr w:type="gramEnd"/>
-      <w:r>
-        <w:t xml:space="preserve"> levels of undo </w:t>
-      </w:r>
-      <w:proofErr w:type="gramStart"/>
-      <w:r>
-        <w:t>are kept</w:t>
-      </w:r>
-      <w:proofErr w:type="gramEnd"/>
-      <w:r>
-        <w:t xml:space="preserve"> can differ between workflows.</w:t>
+        <w:t>What needs to be captured (payload, states, assignments) and how many levels of undo are kept can differ between workflows.</w:t>
       </w:r>
     </w:p>
     <w:p/>
@@ -4338,6 +3790,256 @@
       </w:r>
     </w:p>
     <w:p/>
+    <w:p>
+      <w:r>
+        <w:br w:type="page"/>
+      </w:r>
+    </w:p>
+    <w:p>
+      <w:pPr>
+        <w:pStyle w:val="Heading1"/>
+        <w:spacing w:after="140"/>
+        <w:rPr>
+          <w:b/>
+          <w:bCs/>
+          <w:color w:val="1F3864"/>
+          <w:sz w:val="30"/>
+          <w:szCs w:val="30"/>
+        </w:rPr>
+      </w:pPr>
+      <w:r>
+        <w:rPr>
+          <w:b/>
+          <w:bCs/>
+          <w:color w:val="1F3864"/>
+          <w:sz w:val="30"/>
+          <w:szCs w:val="30"/>
+        </w:rPr>
+        <w:lastRenderedPageBreak/>
+        <w:t xml:space="preserve">Task </w:t>
+      </w:r>
+      <w:r>
+        <w:rPr>
+          <w:b/>
+          <w:bCs/>
+          <w:color w:val="1F3864"/>
+          <w:sz w:val="30"/>
+          <w:szCs w:val="30"/>
+        </w:rPr>
+        <w:t>6</w:t>
+      </w:r>
+      <w:r>
+        <w:rPr>
+          <w:b/>
+          <w:bCs/>
+          <w:color w:val="1F3864"/>
+          <w:sz w:val="30"/>
+          <w:szCs w:val="30"/>
+        </w:rPr>
+        <w:t>:</w:t>
+      </w:r>
+      <w:r>
+        <w:rPr>
+          <w:b/>
+          <w:bCs/>
+          <w:color w:val="1F3864"/>
+          <w:sz w:val="30"/>
+          <w:szCs w:val="30"/>
+        </w:rPr>
+        <w:t xml:space="preserve"> Runtime Behaviour Diagrams</w:t>
+      </w:r>
+    </w:p>
+    <w:p>
+      <w:pPr>
+        <w:pStyle w:val="Heading2"/>
+      </w:pPr>
+      <w:r>
+        <w:t>UML Sequence Diagram: Creating and starting a workflow instance</w:t>
+      </w:r>
+    </w:p>
+    <w:p/>
+    <w:p>
+      <w:r>
+        <w:rPr>
+          <w:noProof/>
+        </w:rPr>
+        <w:drawing>
+          <wp:inline distT="0" distB="0" distL="0" distR="0" wp14:anchorId="30D068E7" wp14:editId="24EE30AC">
+            <wp:extent cx="5806209" cy="3995420"/>
+            <wp:effectExtent l="0" t="0" r="4445" b="5080"/>
+            <wp:docPr id="239558196" name="Picture 2"/>
+            <wp:cNvGraphicFramePr>
+              <a:graphicFrameLocks xmlns:a="http://schemas.openxmlformats.org/drawingml/2006/main" noChangeAspect="1"/>
+            </wp:cNvGraphicFramePr>
+            <a:graphic xmlns:a="http://schemas.openxmlformats.org/drawingml/2006/main">
+              <a:graphicData uri="http://schemas.openxmlformats.org/drawingml/2006/picture">
+                <pic:pic xmlns:pic="http://schemas.openxmlformats.org/drawingml/2006/picture">
+                  <pic:nvPicPr>
+                    <pic:cNvPr id="239558196" name="Picture 2"/>
+                    <pic:cNvPicPr/>
+                  </pic:nvPicPr>
+                  <pic:blipFill>
+                    <a:blip r:embed="rId6" cstate="print">
+                      <a:extLst>
+                        <a:ext uri="{28A0092B-C50C-407E-A947-70E740481C1C}">
+                          <a14:useLocalDpi xmlns:a14="http://schemas.microsoft.com/office/drawing/2010/main" val="0"/>
+                        </a:ext>
+                      </a:extLst>
+                    </a:blip>
+                    <a:stretch>
+                      <a:fillRect/>
+                    </a:stretch>
+                  </pic:blipFill>
+                  <pic:spPr>
+                    <a:xfrm>
+                      <a:off x="0" y="0"/>
+                      <a:ext cx="5806209" cy="3995420"/>
+                    </a:xfrm>
+                    <a:prstGeom prst="rect">
+                      <a:avLst/>
+                    </a:prstGeom>
+                  </pic:spPr>
+                </pic:pic>
+              </a:graphicData>
+            </a:graphic>
+          </wp:inline>
+        </w:drawing>
+      </w:r>
+    </w:p>
+    <w:p/>
+    <w:p>
+      <w:pPr>
+        <w:pStyle w:val="Heading2"/>
+      </w:pPr>
+      <w:r>
+        <w:t>UML Sequence Diagram: C</w:t>
+      </w:r>
+      <w:r>
+        <w:t>ompleting a work item, assigning the next one, and handling a courier failure</w:t>
+      </w:r>
+    </w:p>
+    <w:p/>
+    <w:p>
+      <w:r>
+        <w:rPr>
+          <w:noProof/>
+        </w:rPr>
+        <w:lastRenderedPageBreak/>
+        <w:drawing>
+          <wp:inline distT="0" distB="0" distL="0" distR="0" wp14:anchorId="3AE3165F" wp14:editId="4B318B5F">
+            <wp:extent cx="6120130" cy="4547870"/>
+            <wp:effectExtent l="0" t="0" r="0" b="5080"/>
+            <wp:docPr id="635206058" name="Picture 4"/>
+            <wp:cNvGraphicFramePr>
+              <a:graphicFrameLocks xmlns:a="http://schemas.openxmlformats.org/drawingml/2006/main" noChangeAspect="1"/>
+            </wp:cNvGraphicFramePr>
+            <a:graphic xmlns:a="http://schemas.openxmlformats.org/drawingml/2006/main">
+              <a:graphicData uri="http://schemas.openxmlformats.org/drawingml/2006/picture">
+                <pic:pic xmlns:pic="http://schemas.openxmlformats.org/drawingml/2006/picture">
+                  <pic:nvPicPr>
+                    <pic:cNvPr id="635206058" name="Picture 635206058"/>
+                    <pic:cNvPicPr/>
+                  </pic:nvPicPr>
+                  <pic:blipFill>
+                    <a:blip r:embed="rId7" cstate="print">
+                      <a:extLst>
+                        <a:ext uri="{28A0092B-C50C-407E-A947-70E740481C1C}">
+                          <a14:useLocalDpi xmlns:a14="http://schemas.microsoft.com/office/drawing/2010/main" val="0"/>
+                        </a:ext>
+                      </a:extLst>
+                    </a:blip>
+                    <a:stretch>
+                      <a:fillRect/>
+                    </a:stretch>
+                  </pic:blipFill>
+                  <pic:spPr>
+                    <a:xfrm>
+                      <a:off x="0" y="0"/>
+                      <a:ext cx="6120130" cy="4547870"/>
+                    </a:xfrm>
+                    <a:prstGeom prst="rect">
+                      <a:avLst/>
+                    </a:prstGeom>
+                  </pic:spPr>
+                </pic:pic>
+              </a:graphicData>
+            </a:graphic>
+          </wp:inline>
+        </w:drawing>
+      </w:r>
+    </w:p>
+    <w:p/>
+    <w:p>
+      <w:pPr>
+        <w:pStyle w:val="Heading2"/>
+      </w:pPr>
+      <w:r>
+        <w:t>UML S</w:t>
+      </w:r>
+      <w:r>
+        <w:t>tate</w:t>
+      </w:r>
+      <w:r>
+        <w:t xml:space="preserve"> Diagram: </w:t>
+      </w:r>
+      <w:r>
+        <w:t>W</w:t>
+      </w:r>
+      <w:r>
+        <w:t>orkflow instance</w:t>
+      </w:r>
+      <w:r>
+        <w:t xml:space="preserve"> lifecycle</w:t>
+      </w:r>
+    </w:p>
+    <w:p>
+      <w:r>
+        <w:rPr>
+          <w:noProof/>
+        </w:rPr>
+        <w:drawing>
+          <wp:inline distT="0" distB="0" distL="0" distR="0" wp14:anchorId="27759F9F" wp14:editId="7B077B4E">
+            <wp:extent cx="6120130" cy="4040505"/>
+            <wp:effectExtent l="0" t="0" r="0" b="0"/>
+            <wp:docPr id="52598792" name="Picture 3"/>
+            <wp:cNvGraphicFramePr>
+              <a:graphicFrameLocks xmlns:a="http://schemas.openxmlformats.org/drawingml/2006/main" noChangeAspect="1"/>
+            </wp:cNvGraphicFramePr>
+            <a:graphic xmlns:a="http://schemas.openxmlformats.org/drawingml/2006/main">
+              <a:graphicData uri="http://schemas.openxmlformats.org/drawingml/2006/picture">
+                <pic:pic xmlns:pic="http://schemas.openxmlformats.org/drawingml/2006/picture">
+                  <pic:nvPicPr>
+                    <pic:cNvPr id="52598792" name="Picture 52598792"/>
+                    <pic:cNvPicPr/>
+                  </pic:nvPicPr>
+                  <pic:blipFill>
+                    <a:blip r:embed="rId8">
+                      <a:extLst>
+                        <a:ext uri="{28A0092B-C50C-407E-A947-70E740481C1C}">
+                          <a14:useLocalDpi xmlns:a14="http://schemas.microsoft.com/office/drawing/2010/main" val="0"/>
+                        </a:ext>
+                      </a:extLst>
+                    </a:blip>
+                    <a:stretch>
+                      <a:fillRect/>
+                    </a:stretch>
+                  </pic:blipFill>
+                  <pic:spPr>
+                    <a:xfrm>
+                      <a:off x="0" y="0"/>
+                      <a:ext cx="6120130" cy="4040505"/>
+                    </a:xfrm>
+                    <a:prstGeom prst="rect">
+                      <a:avLst/>
+                    </a:prstGeom>
+                  </pic:spPr>
+                </pic:pic>
+              </a:graphicData>
+            </a:graphic>
+          </wp:inline>
+        </w:drawing>
+      </w:r>
+    </w:p>
     <w:p>
       <w:r>
         <w:br w:type="page"/>
@@ -5618,8 +5320,8 @@
   </w:style>
   <w:style w:type="paragraph" w:styleId="Heading2">
     <w:name w:val="heading 2"/>
+    <w:link w:val="Heading2Char"/>
     <w:uiPriority w:val="9"/>
-    <w:semiHidden/>
     <w:unhideWhenUsed/>
     <w:qFormat/>
     <w:pPr>
@@ -5690,6 +5392,7 @@
   <w:style w:type="character" w:default="1" w:styleId="DefaultParagraphFont">
     <w:name w:val="Default Paragraph Font"/>
     <w:uiPriority w:val="1"/>
+    <w:semiHidden/>
     <w:unhideWhenUsed/>
   </w:style>
   <w:style w:type="table" w:default="1" w:styleId="TableNormal">
@@ -5840,6 +5543,18 @@
         <w:insideV w:val="single" w:sz="4" w:space="0" w:color="auto"/>
       </w:tblBorders>
     </w:tblPr>
+  </w:style>
+  <w:style w:type="character" w:customStyle="1" w:styleId="Heading2Char">
+    <w:name w:val="Heading 2 Char"/>
+    <w:basedOn w:val="DefaultParagraphFont"/>
+    <w:link w:val="Heading2"/>
+    <w:uiPriority w:val="9"/>
+    <w:rsid w:val="000E52A2"/>
+    <w:rPr>
+      <w:color w:val="2E74B5"/>
+      <w:sz w:val="26"/>
+      <w:szCs w:val="26"/>
+    </w:rPr>
   </w:style>
 </w:styles>
 </file>

</xml_diff>

<commit_message>
Add updated Practical 6 document with Task 6 diagrams
</commit_message>
<xml_diff>
--- a/docs/Prac6-COS 214.docx
+++ b/docs/Prac6-COS 214.docx
@@ -31,31 +31,7 @@
         <w:t xml:space="preserve">What is a workflow? </w:t>
       </w:r>
       <w:r>
-        <w:t xml:space="preserve">A workflow is </w:t>
-      </w:r>
-      <w:proofErr w:type="gramStart"/>
-      <w:r>
-        <w:t>basically a</w:t>
-      </w:r>
-      <w:proofErr w:type="gramEnd"/>
-      <w:r>
-        <w:t xml:space="preserve"> business process that has </w:t>
-      </w:r>
-      <w:proofErr w:type="gramStart"/>
-      <w:r>
-        <w:t>been automated</w:t>
-      </w:r>
-      <w:proofErr w:type="gramEnd"/>
-      <w:r>
-        <w:t xml:space="preserve">, where documents, information or tasks </w:t>
-      </w:r>
-      <w:proofErr w:type="gramStart"/>
-      <w:r>
-        <w:t>get passed</w:t>
-      </w:r>
-      <w:proofErr w:type="gramEnd"/>
-      <w:r>
-        <w:t xml:space="preserve"> between people following a set of rules. A workflow management system (WfMS) is the software that sets these workflows up and runs them, and the workflow engine is the part that does the actual running. Business process management (BPM) is the bigger picture, because it also covers analysing processes and how work is organised, not just automating it</w:t>
+        <w:t>A workflow is basically a business process that has been automated, where documents, information or tasks get passed between people following a set of rules. A workflow management system (WfMS) is the software that sets these workflows up and runs them, and the workflow engine is the part that does the actual running. Business process management (BPM) is the bigger picture, because it also covers analysing processes and how work is organised, not just automating it</w:t>
       </w:r>
       <w:sdt>
         <w:sdtPr>
@@ -107,15 +83,7 @@
         <w:t xml:space="preserve">Definition vs instance. </w:t>
       </w:r>
       <w:r>
-        <w:t xml:space="preserve">The definition is the blueprint: the steps in a process and the rules for moving between them. An instance is one running copy of that blueprint. </w:t>
-      </w:r>
-      <w:proofErr w:type="gramStart"/>
-      <w:r>
-        <w:t>Lots of</w:t>
-      </w:r>
-      <w:proofErr w:type="gramEnd"/>
-      <w:r>
-        <w:t xml:space="preserve"> instances can run at the same time from one model, and each one deals with its own case, so each needs its own state and data </w:t>
+        <w:t xml:space="preserve">The definition is the blueprint: the steps in a process and the rules for moving between them. An instance is one running copy of that blueprint. Lots of instances can run at the same time from one model, and each one deals with its own case, so each needs its own state and data </w:t>
       </w:r>
       <w:sdt>
         <w:sdtPr>
@@ -200,15 +168,7 @@
         <w:t>must</w:t>
       </w:r>
       <w:r>
-        <w:t xml:space="preserve"> do it, a work item shows up on their worklist. BPMN 2.0 splits tasks into user tasks (a human does it) and service tasks (a system does it). It also has sub-processes, which are activities with their own flow inside, and call activities, which reuse a process that </w:t>
-      </w:r>
-      <w:proofErr w:type="gramStart"/>
-      <w:r>
-        <w:t>is defined</w:t>
-      </w:r>
-      <w:proofErr w:type="gramEnd"/>
-      <w:r>
-        <w:t xml:space="preserve"> somewhere else</w:t>
+        <w:t xml:space="preserve"> do it, a work item shows up on their worklist. BPMN 2.0 splits tasks into user tasks (a human does it) and service tasks (a system does it). It also has sub-processes, which are activities with their own flow inside, and call activities, which reuse a process that is defined somewhere else</w:t>
       </w:r>
       <w:sdt>
         <w:sdtPr>
@@ -260,23 +220,7 @@
         <w:t xml:space="preserve">Routing. </w:t>
       </w:r>
       <w:r>
-        <w:t>The workflow patterns research lists the basic ways to route work: sequence, parallel split (AND), synchronisation, exclusive choice (XOR), simple merge, multi-</w:t>
-      </w:r>
-      <w:proofErr w:type="gramStart"/>
-      <w:r>
-        <w:t>choice</w:t>
-      </w:r>
-      <w:proofErr w:type="gramEnd"/>
-      <w:r>
-        <w:t xml:space="preserve"> and loops. </w:t>
-      </w:r>
-      <w:proofErr w:type="gramStart"/>
-      <w:r>
-        <w:t>Different products</w:t>
-      </w:r>
-      <w:proofErr w:type="gramEnd"/>
-      <w:r>
-        <w:t xml:space="preserve"> support different ones, so it makes sense to keep routing flexible and not hard-code it </w:t>
+        <w:t xml:space="preserve">The workflow patterns research lists the basic ways to route work: sequence, parallel split (AND), synchronisation, exclusive choice (XOR), simple merge, multi-choice and loops. Different products support different ones, so it makes sense to keep routing flexible and not hard-code it </w:t>
       </w:r>
       <w:sdt>
         <w:sdtPr>
@@ -322,15 +266,7 @@
         <w:t xml:space="preserve">Participants and assigning work. </w:t>
       </w:r>
       <w:r>
-        <w:t xml:space="preserve">Engines look after worklists and who </w:t>
-      </w:r>
-      <w:proofErr w:type="gramStart"/>
-      <w:r>
-        <w:t>is signed</w:t>
-      </w:r>
-      <w:proofErr w:type="gramEnd"/>
-      <w:r>
-        <w:t xml:space="preserve"> in. The BPM survey describes people using roles and organisational units, </w:t>
+        <w:t xml:space="preserve">Engines look after worklists and who is signed in. The BPM survey describes people using roles and organisational units, </w:t>
       </w:r>
       <w:r>
         <w:t>including</w:t>
@@ -391,36 +327,10 @@
           <w:bCs/>
           <w:color w:val="1F3864"/>
         </w:rPr>
-        <w:t xml:space="preserve">Events, </w:t>
-      </w:r>
-      <w:proofErr w:type="gramStart"/>
-      <w:r>
-        <w:rPr>
-          <w:b/>
-          <w:bCs/>
-          <w:color w:val="1F3864"/>
-        </w:rPr>
-        <w:t>failures</w:t>
-      </w:r>
-      <w:proofErr w:type="gramEnd"/>
-      <w:r>
-        <w:rPr>
-          <w:b/>
-          <w:bCs/>
-          <w:color w:val="1F3864"/>
-        </w:rPr>
-        <w:t xml:space="preserve"> and external systems. </w:t>
-      </w:r>
-      <w:r>
-        <w:t xml:space="preserve">In BPMN, boundary events sit on the edge of an activity and react while it is running. There are timer, message, </w:t>
-      </w:r>
-      <w:proofErr w:type="gramStart"/>
-      <w:r>
-        <w:t>error</w:t>
-      </w:r>
-      <w:proofErr w:type="gramEnd"/>
-      <w:r>
-        <w:t xml:space="preserve"> and escalation events. Compensation can undo activities that already finished if something goes wrong. The WfMC model also has separate interfaces for calling outside applications and talking to other workflow systems </w:t>
+        <w:t xml:space="preserve">Events, failures and external systems. </w:t>
+      </w:r>
+      <w:r>
+        <w:t xml:space="preserve">In BPMN, boundary events sit on the edge of an activity and react while it is running. There are timer, message, error and escalation events. Compensation can undo activities that already finished if something goes wrong. The WfMC model also has separate interfaces for calling outside applications and talking to other workflow systems </w:t>
       </w:r>
       <w:sdt>
         <w:sdtPr>
@@ -466,34 +376,10 @@
         <w:t xml:space="preserve">History and changing definitions. </w:t>
       </w:r>
       <w:r>
-        <w:t xml:space="preserve">Everything that happens </w:t>
-      </w:r>
-      <w:proofErr w:type="gramStart"/>
-      <w:r>
-        <w:t>gets saved</w:t>
-      </w:r>
-      <w:proofErr w:type="gramEnd"/>
-      <w:r>
-        <w:t xml:space="preserve"> in event logs, where each event points to an activity and a case, and process mining uses these logs to find out how processes really run. The WfMC treats audit as part of monitoring. </w:t>
-      </w:r>
-      <w:r>
-        <w:t xml:space="preserve">To see how a real product deals with a definition changing while work is still running, we looked at the documentation of Camunda, a company that makes a workflow engine. In Camunda, a changed definition </w:t>
-      </w:r>
-      <w:proofErr w:type="gramStart"/>
-      <w:r>
-        <w:t>is saved</w:t>
-      </w:r>
-      <w:proofErr w:type="gramEnd"/>
-      <w:r>
-        <w:t xml:space="preserve"> as </w:t>
-      </w:r>
-      <w:proofErr w:type="gramStart"/>
-      <w:r>
-        <w:t>a new version</w:t>
-      </w:r>
-      <w:proofErr w:type="gramEnd"/>
-      <w:r>
-        <w:t xml:space="preserve">. Running instances stay on the old version, new ones use the latest, and teams can choose to move running instances over without losing their history </w:t>
+        <w:t xml:space="preserve">Everything that happens gets saved in event logs, where each event points to an activity and a case, and process mining uses these logs to find out how processes really run. The WfMC treats audit as part of monitoring. </w:t>
+      </w:r>
+      <w:r>
+        <w:t xml:space="preserve">To see how a real product deals with a definition changing while work is still running, we looked at the documentation of Camunda, a company that makes a workflow engine. In Camunda, a changed definition is saved as a new version. Running instances stay on the old version, new ones use the latest, and teams can choose to move running instances over without losing their history </w:t>
       </w:r>
       <w:sdt>
         <w:sdtPr>
@@ -605,23 +491,7 @@
         <w:t xml:space="preserve">What this means for TIVIDY. </w:t>
       </w:r>
       <w:r>
-        <w:t xml:space="preserve">Our takeaway is that the engine should only know generic things like activities, instances, states, </w:t>
-      </w:r>
-      <w:proofErr w:type="gramStart"/>
-      <w:r>
-        <w:t>participants</w:t>
-      </w:r>
-      <w:proofErr w:type="gramEnd"/>
-      <w:r>
-        <w:t xml:space="preserve"> and events. Anything that changes between processes (the structure and versions, how work </w:t>
-      </w:r>
-      <w:proofErr w:type="gramStart"/>
-      <w:r>
-        <w:t>is grouped</w:t>
-      </w:r>
-      <w:proofErr w:type="gramEnd"/>
-      <w:r>
-        <w:t>, routing, assignment and approval rules, events and integrations, and reports and rollback) should be able to change without touching the rest.</w:t>
+        <w:t>Our takeaway is that the engine should only know generic things like activities, instances, states, participants and events. Anything that changes between processes (the structure and versions, how work is grouped, routing, assignment and approval rules, events and integrations, and reports and rollback) should be able to change without touching the rest.</w:t>
       </w:r>
     </w:p>
     <w:p>
@@ -666,15 +536,7 @@
     <w:p/>
     <w:p>
       <w:r>
-        <w:t xml:space="preserve">In a meal plan order-to-delivery shopping system that offers custom meal packages for </w:t>
-      </w:r>
-      <w:proofErr w:type="gramStart"/>
-      <w:r>
-        <w:t>customers;</w:t>
-      </w:r>
-      <w:proofErr w:type="gramEnd"/>
-      <w:r>
-        <w:t xml:space="preserve"> Breakfast, Lunch and </w:t>
+        <w:t xml:space="preserve">In a meal plan order-to-delivery shopping system that offers custom meal packages for customers; Breakfast, Lunch and </w:t>
       </w:r>
       <w:proofErr w:type="spellStart"/>
       <w:r>
@@ -866,26 +728,13 @@
         <w:t>3 Delivery Services:</w:t>
       </w:r>
       <w:r>
-        <w:t xml:space="preserve"> Three different third-party courier companies that </w:t>
-      </w:r>
-      <w:proofErr w:type="gramStart"/>
-      <w:r>
-        <w:t>handle</w:t>
-      </w:r>
-      <w:proofErr w:type="gramEnd"/>
-      <w:r>
-        <w:t xml:space="preserve"> final delivery in different regions.</w:t>
+        <w:t xml:space="preserve"> Three different third-party courier companies that handle final delivery in different regions.</w:t>
       </w:r>
       <w:r>
         <w:t xml:space="preserve"> </w:t>
       </w:r>
-      <w:proofErr w:type="gramStart"/>
-      <w:r>
-        <w:t>TIVIDY</w:t>
-      </w:r>
-      <w:proofErr w:type="gramEnd"/>
-      <w:r>
-        <w:t xml:space="preserve"> connects their different systems using special bridges (</w:t>
+      <w:r>
+        <w:t>TIVIDY connects their different systems using special bridges (</w:t>
       </w:r>
       <w:r>
         <w:rPr>
@@ -1041,25 +890,7 @@
           <w:bCs/>
           <w:color w:val="1F3864"/>
         </w:rPr>
-        <w:t xml:space="preserve">Decisions, </w:t>
-      </w:r>
-      <w:proofErr w:type="gramStart"/>
-      <w:r>
-        <w:rPr>
-          <w:b/>
-          <w:bCs/>
-          <w:color w:val="1F3864"/>
-        </w:rPr>
-        <w:t>Rules</w:t>
-      </w:r>
-      <w:proofErr w:type="gramEnd"/>
-      <w:r>
-        <w:rPr>
-          <w:b/>
-          <w:bCs/>
-          <w:color w:val="1F3864"/>
-        </w:rPr>
-        <w:t xml:space="preserve"> and Steps</w:t>
+        <w:t>Decisions, Rules and Steps</w:t>
       </w:r>
     </w:p>
     <w:p>
@@ -1115,15 +946,7 @@
         <w:t>Dependencies:</w:t>
       </w:r>
       <w:r>
-        <w:t xml:space="preserve"> Packing can only start after all selected meals in a bundle </w:t>
-      </w:r>
-      <w:proofErr w:type="gramStart"/>
-      <w:r>
-        <w:t>are cooked</w:t>
-      </w:r>
-      <w:proofErr w:type="gramEnd"/>
-      <w:r>
-        <w:t xml:space="preserve"> and ready.</w:t>
+        <w:t xml:space="preserve"> Packing can only start after all selected meals in a bundle are cooked and ready.</w:t>
       </w:r>
     </w:p>
     <w:p>
@@ -1142,23 +965,7 @@
         <w:t xml:space="preserve">Delivery Routing: </w:t>
       </w:r>
       <w:r>
-        <w:t xml:space="preserve">TIVIDY automatically picks </w:t>
-      </w:r>
-      <w:proofErr w:type="gramStart"/>
-      <w:r>
-        <w:t>1</w:t>
-      </w:r>
-      <w:proofErr w:type="gramEnd"/>
-      <w:r>
-        <w:t xml:space="preserve"> of the </w:t>
-      </w:r>
-      <w:proofErr w:type="gramStart"/>
-      <w:r>
-        <w:t>3</w:t>
-      </w:r>
-      <w:proofErr w:type="gramEnd"/>
-      <w:r>
-        <w:t xml:space="preserve"> delivery companies based on the customer’s delivery area (</w:t>
+        <w:t>TIVIDY automatically picks 1 of the 3 delivery companies based on the customer’s delivery area (</w:t>
       </w:r>
       <w:r>
         <w:rPr>
@@ -1234,15 +1041,7 @@
         <w:t>Out of stock issues:</w:t>
       </w:r>
       <w:r>
-        <w:t xml:space="preserve"> If ingredients run out, the issue </w:t>
-      </w:r>
-      <w:proofErr w:type="gramStart"/>
-      <w:r>
-        <w:t>gets passed</w:t>
-      </w:r>
-      <w:proofErr w:type="gramEnd"/>
-      <w:r>
-        <w:t xml:space="preserve"> up the chain from Kitchen staff to Supervisor to Manager until its solved (</w:t>
+        <w:t xml:space="preserve"> If ingredients run out, the issue gets passed up the chain from Kitchen staff to Supervisor to Manager until its solved (</w:t>
       </w:r>
       <w:r>
         <w:rPr>
@@ -1318,10 +1117,18 @@
           <w:szCs w:val="30"/>
         </w:rPr>
         <w:lastRenderedPageBreak/>
-        <w:t xml:space="preserve">Task </w:t>
-      </w:r>
-      <w:proofErr w:type="gramStart"/>
-      <w:r>
+        <w:t>Task 3</w:t>
+      </w:r>
+    </w:p>
+    <w:p>
+      <w:r>
+        <w:br w:type="page"/>
+      </w:r>
+    </w:p>
+    <w:p>
+      <w:pPr>
+        <w:pStyle w:val="Heading1"/>
+        <w:spacing w:after="140"/>
         <w:rPr>
           <w:b/>
           <w:bCs/>
@@ -1329,19 +1136,8 @@
           <w:sz w:val="30"/>
           <w:szCs w:val="30"/>
         </w:rPr>
-        <w:t>3</w:t>
-      </w:r>
-      <w:proofErr w:type="gramEnd"/>
-    </w:p>
-    <w:p>
-      <w:r>
-        <w:br w:type="page"/>
-      </w:r>
-    </w:p>
-    <w:p>
-      <w:pPr>
-        <w:pStyle w:val="Heading1"/>
-        <w:spacing w:after="140"/>
+      </w:pPr>
+      <w:r>
         <w:rPr>
           <w:b/>
           <w:bCs/>
@@ -1349,62 +1145,11 @@
           <w:sz w:val="30"/>
           <w:szCs w:val="30"/>
         </w:rPr>
-      </w:pPr>
-      <w:r>
-        <w:rPr>
-          <w:b/>
-          <w:bCs/>
-          <w:color w:val="1F3864"/>
-          <w:sz w:val="30"/>
-          <w:szCs w:val="30"/>
-        </w:rPr>
         <w:lastRenderedPageBreak/>
-        <w:t xml:space="preserve">Task </w:t>
-      </w:r>
-      <w:r>
-        <w:rPr>
-          <w:b/>
-          <w:bCs/>
-          <w:color w:val="1F3864"/>
-          <w:sz w:val="30"/>
-          <w:szCs w:val="30"/>
-        </w:rPr>
-        <w:t>4</w:t>
-      </w:r>
-      <w:r>
-        <w:rPr>
-          <w:b/>
-          <w:bCs/>
-          <w:color w:val="1F3864"/>
-          <w:sz w:val="30"/>
-          <w:szCs w:val="30"/>
-        </w:rPr>
-        <w:t xml:space="preserve">: </w:t>
-      </w:r>
-      <w:r>
-        <w:rPr>
-          <w:b/>
-          <w:bCs/>
-          <w:color w:val="1F3864"/>
-          <w:sz w:val="30"/>
-          <w:szCs w:val="30"/>
-        </w:rPr>
-        <w:t>Design Patterns</w:t>
-      </w:r>
-    </w:p>
-    <w:p>
-      <w:pPr>
-        <w:pStyle w:val="Heading1"/>
-        <w:spacing w:after="140"/>
-        <w:rPr>
-          <w:b/>
-          <w:bCs/>
-          <w:color w:val="1F3864"/>
-          <w:sz w:val="30"/>
-          <w:szCs w:val="30"/>
-        </w:rPr>
-      </w:pPr>
-    </w:p>
+        <w:t>Task 4: Design Patterns</w:t>
+      </w:r>
+    </w:p>
+    <w:p/>
     <w:p>
       <w:pPr>
         <w:rPr>
@@ -1455,23 +1200,7 @@
         <w:t xml:space="preserve"> </w:t>
       </w:r>
       <w:r>
-        <w:t xml:space="preserve">A meal-plan definition </w:t>
-      </w:r>
-      <w:proofErr w:type="gramStart"/>
-      <w:r>
-        <w:t>is assembled</w:t>
-      </w:r>
-      <w:proofErr w:type="gramEnd"/>
-      <w:r>
-        <w:t xml:space="preserve"> in </w:t>
-      </w:r>
-      <w:proofErr w:type="gramStart"/>
-      <w:r>
-        <w:t>several</w:t>
-      </w:r>
-      <w:proofErr w:type="gramEnd"/>
-      <w:r>
-        <w:t xml:space="preserve"> steps (validate coupon → prepare meals → package → courier delivery), with routing rules and an escalation chain attached. It must be complete and validated before any customer order runs from it, and it must not change under running orders.</w:t>
+        <w:t>A meal-plan definition is assembled in several steps (validate coupon → prepare meals → package → courier delivery), with routing rules and an escalation chain attached. It must be complete and validated before any customer order runs from it, and it must not change under running orders.</w:t>
       </w:r>
     </w:p>
     <w:p/>
@@ -1482,15 +1211,7 @@
           <w:bCs/>
           <w:color w:val="1F3864"/>
         </w:rPr>
-        <w:t>Participants</w:t>
-      </w:r>
-      <w:r>
-        <w:rPr>
-          <w:b/>
-          <w:bCs/>
-          <w:color w:val="1F3864"/>
-        </w:rPr>
-        <w:t>:</w:t>
+        <w:t>Participants:</w:t>
       </w:r>
       <w:r>
         <w:t xml:space="preserve"> </w:t>
@@ -1645,29 +1366,13 @@
           <w:bCs/>
           <w:color w:val="1F3864"/>
         </w:rPr>
-        <w:t>Collaboration</w:t>
-      </w:r>
-      <w:r>
-        <w:rPr>
-          <w:b/>
-          <w:bCs/>
-          <w:color w:val="1F3864"/>
-        </w:rPr>
-        <w:t>:</w:t>
+        <w:t>Collaboration:</w:t>
       </w:r>
       <w:r>
         <w:t xml:space="preserve"> </w:t>
       </w:r>
       <w:r>
-        <w:t xml:space="preserve">The WorkflowDesigner directs the WorkflowDefinitionBuilder step by step, telling it which stages, work items, assignment </w:t>
-      </w:r>
-      <w:proofErr w:type="gramStart"/>
-      <w:r>
-        <w:t>rules</w:t>
-      </w:r>
-      <w:proofErr w:type="gramEnd"/>
-      <w:r>
-        <w:t xml:space="preserve"> and escalation chain to include. MealOrderDefinitionBuilder records each step into the definition under construction. Once the designer finishes, the builder checks that the definition is complete and hands back a versioned WorkflowDefinition.</w:t>
+        <w:t>The WorkflowDesigner directs the WorkflowDefinitionBuilder step by step, telling it which stages, work items, assignment rules and escalation chain to include. MealOrderDefinitionBuilder records each step into the definition under construction. Once the designer finishes, the builder checks that the definition is complete and hands back a versioned WorkflowDefinition.</w:t>
       </w:r>
     </w:p>
     <w:p/>
@@ -1678,37 +1383,13 @@
           <w:bCs/>
           <w:color w:val="1F3864"/>
         </w:rPr>
-        <w:t>Variation</w:t>
-      </w:r>
-      <w:r>
-        <w:rPr>
-          <w:b/>
-          <w:bCs/>
-          <w:color w:val="1F3864"/>
-        </w:rPr>
-        <w:t>:</w:t>
+        <w:t>Variation:</w:t>
       </w:r>
       <w:r>
         <w:t xml:space="preserve"> </w:t>
       </w:r>
       <w:r>
-        <w:t xml:space="preserve">The steps, their order and the rules attached to them (assignment strategy, escalation chain) differ for every kind of process. </w:t>
-      </w:r>
-      <w:proofErr w:type="gramStart"/>
-      <w:r>
-        <w:t>A new version</w:t>
-      </w:r>
-      <w:proofErr w:type="gramEnd"/>
-      <w:r>
-        <w:t xml:space="preserve"> of the definition </w:t>
-      </w:r>
-      <w:proofErr w:type="gramStart"/>
-      <w:r>
-        <w:t>is produced</w:t>
-      </w:r>
-      <w:proofErr w:type="gramEnd"/>
-      <w:r>
-        <w:t xml:space="preserve"> whenever any of them changes.</w:t>
+        <w:t>The steps, their order and the rules attached to them (assignment strategy, escalation chain) differ for every kind of process. A new version of the definition is produced whenever any of them changes.</w:t>
       </w:r>
     </w:p>
     <w:p/>
@@ -1719,37 +1400,13 @@
           <w:bCs/>
           <w:color w:val="1F3864"/>
         </w:rPr>
-        <w:t>Why is it appropriate</w:t>
-      </w:r>
-      <w:r>
-        <w:rPr>
-          <w:b/>
-          <w:bCs/>
-          <w:color w:val="1F3864"/>
-        </w:rPr>
-        <w:t>:</w:t>
+        <w:t>Why is it appropriate:</w:t>
       </w:r>
       <w:r>
         <w:t xml:space="preserve"> </w:t>
       </w:r>
       <w:r>
-        <w:t xml:space="preserve">The Builder is the construction side of the definition/instance split and the only place where a definition </w:t>
-      </w:r>
-      <w:proofErr w:type="gramStart"/>
-      <w:r>
-        <w:t>is created</w:t>
-      </w:r>
-      <w:proofErr w:type="gramEnd"/>
-      <w:r>
-        <w:t xml:space="preserve">. By the </w:t>
-      </w:r>
-      <w:proofErr w:type="gramStart"/>
-      <w:r>
-        <w:t>time</w:t>
-      </w:r>
-      <w:proofErr w:type="gramEnd"/>
-      <w:r>
-        <w:t xml:space="preserve"> a WorkflowDefinition reaches the engine it is complete, validated and read-only, so later edits cannot disturb orders already running</w:t>
+        <w:t>The Builder is the construction side of the definition/instance split and the only place where a definition is created. By the time a WorkflowDefinition reaches the engine it is complete, validated and read-only, so later edits cannot disturb orders already running</w:t>
       </w:r>
       <w:r>
         <w:t>.</w:t>
@@ -2393,47 +2050,7 @@
         <w:t xml:space="preserve"> </w:t>
       </w:r>
       <w:r>
-        <w:t xml:space="preserve">An order's valid actions depend on where it is. It </w:t>
-      </w:r>
-      <w:proofErr w:type="gramStart"/>
-      <w:r>
-        <w:t>can't</w:t>
-      </w:r>
-      <w:proofErr w:type="gramEnd"/>
-      <w:r>
-        <w:t xml:space="preserve"> </w:t>
-      </w:r>
-      <w:proofErr w:type="gramStart"/>
-      <w:r>
-        <w:t>be cancelled</w:t>
-      </w:r>
-      <w:proofErr w:type="gramEnd"/>
-      <w:r>
-        <w:t xml:space="preserve"> once in transit, and it </w:t>
-      </w:r>
-      <w:proofErr w:type="gramStart"/>
-      <w:r>
-        <w:t>can't</w:t>
-      </w:r>
-      <w:proofErr w:type="gramEnd"/>
-      <w:r>
-        <w:t xml:space="preserve"> </w:t>
-      </w:r>
-      <w:proofErr w:type="gramStart"/>
-      <w:r>
-        <w:t>be advanced</w:t>
-      </w:r>
-      <w:proofErr w:type="gramEnd"/>
-      <w:r>
-        <w:t xml:space="preserve"> to "In transit" before packaging </w:t>
-      </w:r>
-      <w:proofErr w:type="gramStart"/>
-      <w:r>
-        <w:t>is done</w:t>
-      </w:r>
-      <w:proofErr w:type="gramEnd"/>
-      <w:r>
-        <w:t>.</w:t>
+        <w:t>An order's valid actions depend on where it is. It can't be cancelled once in transit, and it can't be advanced to "In transit" before packaging is done.</w:t>
       </w:r>
     </w:p>
     <w:p/>
@@ -2586,15 +2203,7 @@
         <w:t xml:space="preserve"> </w:t>
       </w:r>
       <w:r>
-        <w:t xml:space="preserve">The WorkflowInstance hands every request it receives to its current InstanceState and does not decide anything itself. Each ConcreteState either </w:t>
-      </w:r>
-      <w:proofErr w:type="gramStart"/>
-      <w:r>
-        <w:t>carries out</w:t>
-      </w:r>
-      <w:proofErr w:type="gramEnd"/>
-      <w:r>
-        <w:t xml:space="preserve"> the request and switches the instance to the next state, such as PreparingState moving the order on to PackagingState, or refuses it, such as InTransitState refusing a cancellation.</w:t>
+        <w:t>The WorkflowInstance hands every request it receives to its current InstanceState and does not decide anything itself. Each ConcreteState either carries out the request and switches the instance to the next state, such as PreparingState moving the order on to PackagingState, or refuses it, such as InTransitState refusing a cancellation.</w:t>
       </w:r>
     </w:p>
     <w:p/>
@@ -2628,23 +2237,7 @@
         <w:t xml:space="preserve"> </w:t>
       </w:r>
       <w:r>
-        <w:t xml:space="preserve">The State pattern gives the running instance a controlled lifecycle. Every operation </w:t>
-      </w:r>
-      <w:proofErr w:type="gramStart"/>
-      <w:r>
-        <w:t>is checked</w:t>
-      </w:r>
-      <w:proofErr w:type="gramEnd"/>
-      <w:r>
-        <w:t xml:space="preserve"> by the current state, so invalid actions such as cancelling an order in transit </w:t>
-      </w:r>
-      <w:proofErr w:type="gramStart"/>
-      <w:r>
-        <w:t>are rejected</w:t>
-      </w:r>
-      <w:proofErr w:type="gramEnd"/>
-      <w:r>
-        <w:t xml:space="preserve"> in one place instead of through status flags and switch statements</w:t>
+        <w:t>The State pattern gives the running instance a controlled lifecycle. Every operation is checked by the current state, so invalid actions such as cancelling an order in transit are rejected in one place instead of through status flags and switch statements</w:t>
       </w:r>
       <w:r>
         <w:t>.</w:t>
@@ -2878,23 +2471,7 @@
         <w:t xml:space="preserve"> </w:t>
       </w:r>
       <w:r>
-        <w:t xml:space="preserve">How work </w:t>
-      </w:r>
-      <w:proofErr w:type="gramStart"/>
-      <w:r>
-        <w:t>is assigned</w:t>
-      </w:r>
-      <w:proofErr w:type="gramEnd"/>
-      <w:r>
-        <w:t xml:space="preserve"> differs between organisations and even between work items, whether by role, by workload or by a rule on workflow data such as delivery area. Each of these rules is a separate algorithm that can </w:t>
-      </w:r>
-      <w:proofErr w:type="gramStart"/>
-      <w:r>
-        <w:t>be swapped</w:t>
-      </w:r>
-      <w:proofErr w:type="gramEnd"/>
-      <w:r>
-        <w:t xml:space="preserve"> without touching the tasks.</w:t>
+        <w:t>How work is assigned differs between organisations and even between work items, whether by role, by workload or by a rule on workflow data such as delivery area. Each of these rules is a separate algorithm that can be swapped without touching the tasks.</w:t>
       </w:r>
     </w:p>
     <w:p/>
@@ -2962,15 +2539,7 @@
         <w:t xml:space="preserve"> </w:t>
       </w:r>
       <w:r>
-        <w:t xml:space="preserve">When ingredients run out or a delivery fails, the issue must climb from kitchen staff to supervisor to branch manager until someone resolves it, and nobody should need to know who </w:t>
-      </w:r>
-      <w:proofErr w:type="gramStart"/>
-      <w:r>
-        <w:t>handles</w:t>
-      </w:r>
-      <w:proofErr w:type="gramEnd"/>
-      <w:r>
-        <w:t xml:space="preserve"> what.</w:t>
+        <w:t>When ingredients run out or a delivery fails, the issue must climb from kitchen staff to supervisor to branch manager until someone resolves it, and nobody should need to know who handles what.</w:t>
       </w:r>
     </w:p>
     <w:p/>
@@ -3220,55 +2789,15 @@
         <w:t xml:space="preserve"> </w:t>
       </w:r>
       <w:r>
-        <w:t xml:space="preserve">When packaging finishes, </w:t>
+        <w:t xml:space="preserve">When packaging finishes, several unrelated things must </w:t>
       </w:r>
       <w:proofErr w:type="gramStart"/>
       <w:r>
-        <w:t>several</w:t>
+        <w:t>happen:</w:t>
       </w:r>
       <w:proofErr w:type="gramEnd"/>
       <w:r>
-        <w:t xml:space="preserve"> unrelated things must </w:t>
-      </w:r>
-      <w:proofErr w:type="gramStart"/>
-      <w:r>
-        <w:t>happen:</w:t>
-      </w:r>
-      <w:proofErr w:type="gramEnd"/>
-      <w:r>
-        <w:t xml:space="preserve"> customer support </w:t>
-      </w:r>
-      <w:proofErr w:type="gramStart"/>
-      <w:r>
-        <w:t>is alerted</w:t>
-      </w:r>
-      <w:proofErr w:type="gramEnd"/>
-      <w:r>
-        <w:t xml:space="preserve">, an SMS goes out, the audit log </w:t>
-      </w:r>
-      <w:proofErr w:type="gramStart"/>
-      <w:r>
-        <w:t>is written</w:t>
-      </w:r>
-      <w:proofErr w:type="gramEnd"/>
-      <w:r>
-        <w:t xml:space="preserve">, and the next step </w:t>
-      </w:r>
-      <w:proofErr w:type="gramStart"/>
-      <w:r>
-        <w:t>is made</w:t>
-      </w:r>
-      <w:proofErr w:type="gramEnd"/>
-      <w:r>
-        <w:t xml:space="preserve"> available. The core model </w:t>
-      </w:r>
-      <w:proofErr w:type="gramStart"/>
-      <w:r>
-        <w:t>shouldn't</w:t>
-      </w:r>
-      <w:proofErr w:type="gramEnd"/>
-      <w:r>
-        <w:t xml:space="preserve"> know about any of them.</w:t>
+        <w:t xml:space="preserve"> customer support is alerted, an SMS goes out, the audit log is written, and the next step is made available. The core model shouldn't know about any of them.</w:t>
       </w:r>
     </w:p>
     <w:p/>
@@ -3444,15 +2973,7 @@
         <w:t xml:space="preserve"> </w:t>
       </w:r>
       <w:r>
-        <w:t xml:space="preserve">The listeners register with the WorkflowInstance when it </w:t>
-      </w:r>
-      <w:proofErr w:type="gramStart"/>
-      <w:r>
-        <w:t>is created</w:t>
-      </w:r>
-      <w:proofErr w:type="gramEnd"/>
-      <w:r>
-        <w:t>. When a task finishes, the instance publishes an event to all of them without knowing what they do. SmsNotifier messages the customer, SupportDashboardListener alerts customer support, AuditLogger adds the event to the history, and NextItemActivator makes the next work item available, which can also move the instance on to its next state. The listeners work independently and do not know about each other.</w:t>
+        <w:t>The listeners register with the WorkflowInstance when it is created. When a task finishes, the instance publishes an event to all of them without knowing what they do. SmsNotifier messages the customer, SupportDashboardListener alerts customer support, AuditLogger adds the event to the history, and NextItemActivator makes the next work item available, which can also move the instance on to its next state. The listeners work independently and do not know about each other.</w:t>
       </w:r>
     </w:p>
     <w:p/>
@@ -3486,13 +3007,8 @@
         <w:t xml:space="preserve"> </w:t>
       </w:r>
       <w:r>
-        <w:t xml:space="preserve">The Observer decouples the core model from everything that reacts to it. The model publishes events without knowing who receives them, so a new notification or integration only needs a new listener to </w:t>
-      </w:r>
-      <w:proofErr w:type="gramStart"/>
-      <w:r>
-        <w:t>be attached</w:t>
-      </w:r>
-      <w:proofErr w:type="gramEnd"/>
+        <w:t>The Observer decouples the core model from everything that reacts to it. The model publishes events without knowing who receives them, so a new notification or integration only needs a new listener to be attached</w:t>
+      </w:r>
       <w:r>
         <w:t>.</w:t>
       </w:r>
@@ -3799,15 +3315,7 @@
         <w:t xml:space="preserve"> </w:t>
       </w:r>
       <w:r>
-        <w:t xml:space="preserve">A work element sometimes needs extra behaviour wrapped around it, such as applying a discount coupon to the order cost, writing audit </w:t>
-      </w:r>
-      <w:proofErr w:type="gramStart"/>
-      <w:r>
-        <w:t>entries</w:t>
-      </w:r>
-      <w:proofErr w:type="gramEnd"/>
-      <w:r>
-        <w:t xml:space="preserve"> or raising its priority. These extras must be combinable in any order without a separate subclass for every combination, and without making the task a different kind of task.</w:t>
+        <w:t>A work element sometimes needs extra behaviour wrapped around it, such as applying a discount coupon to the order cost, writing audit entries or raising its priority. These extras must be combinable in any order without a separate subclass for every combination, and without making the task a different kind of task.</w:t>
       </w:r>
     </w:p>
     <w:p/>
@@ -3995,22 +3503,14 @@
         <w:t>FullDayPackage</w:t>
       </w:r>
       <w:r>
-        <w:t xml:space="preserve"> and lowers the order cost by the coupon rule before the cost reaches the engine. Decorators can </w:t>
+        <w:t xml:space="preserve"> and lowers the order cost by the coupon rule before the cost reaches the engine. Decorators can be wrapped around each other, such as AuditedDecorator around CouponDecorator around the bundle, and each </w:t>
       </w:r>
       <w:proofErr w:type="gramStart"/>
       <w:r>
-        <w:t>be wrapped</w:t>
+        <w:t>passes</w:t>
       </w:r>
       <w:proofErr w:type="gramEnd"/>
       <w:r>
-        <w:t xml:space="preserve"> around each other, such as AuditedDecorator around CouponDecorator around the bundle, and each </w:t>
-      </w:r>
-      <w:proofErr w:type="gramStart"/>
-      <w:r>
-        <w:t>passes</w:t>
-      </w:r>
-      <w:proofErr w:type="gramEnd"/>
-      <w:r>
         <w:t xml:space="preserve"> everything else straight through to the element inside it.</w:t>
       </w:r>
     </w:p>
@@ -4028,15 +3528,7 @@
         <w:t xml:space="preserve"> </w:t>
       </w:r>
       <w:r>
-        <w:t xml:space="preserve">Which extras apply to an item (one or </w:t>
-      </w:r>
-      <w:proofErr w:type="gramStart"/>
-      <w:r>
-        <w:t>several</w:t>
-      </w:r>
-      <w:proofErr w:type="gramEnd"/>
-      <w:r>
-        <w:t xml:space="preserve"> coupons, auditing, priority) differs per order and per workflow. </w:t>
+        <w:t xml:space="preserve">Which extras apply to an item (one or several coupons, auditing, priority) differs per order and per workflow. </w:t>
       </w:r>
     </w:p>
     <w:p/>
@@ -4053,15 +3545,7 @@
         <w:t xml:space="preserve"> </w:t>
       </w:r>
       <w:r>
-        <w:t xml:space="preserve">The Decorator lets cross-cutting behaviour </w:t>
-      </w:r>
-      <w:proofErr w:type="gramStart"/>
-      <w:r>
-        <w:t>be attached</w:t>
-      </w:r>
-      <w:proofErr w:type="gramEnd"/>
-      <w:r>
-        <w:t xml:space="preserve"> to tasks and bundles without modifying them or creating a subclass per combination.</w:t>
+        <w:t>The Decorator lets cross-cutting behaviour be attached to tasks and bundles without modifying them or creating a subclass per combination.</w:t>
       </w:r>
     </w:p>
     <w:p/>
@@ -4115,15 +3599,7 @@
         <w:t xml:space="preserve"> </w:t>
       </w:r>
       <w:r>
-        <w:t xml:space="preserve">If the customer cancels or changes a coupon or address, the order must return to its previous state cleanly, and the history of what happened must not </w:t>
-      </w:r>
-      <w:proofErr w:type="gramStart"/>
-      <w:r>
-        <w:t>be erased</w:t>
-      </w:r>
-      <w:proofErr w:type="gramEnd"/>
-      <w:r>
-        <w:t>.</w:t>
+        <w:t>If the customer cancels or changes a coupon or address, the order must return to its previous state cleanly, and the history of what happened must not be erased.</w:t>
       </w:r>
     </w:p>
     <w:p/>
@@ -4290,31 +3766,7 @@
         <w:t xml:space="preserve"> </w:t>
       </w:r>
       <w:r>
-        <w:t xml:space="preserve">What needs to </w:t>
-      </w:r>
-      <w:proofErr w:type="gramStart"/>
-      <w:r>
-        <w:t>be captured</w:t>
-      </w:r>
-      <w:proofErr w:type="gramEnd"/>
-      <w:r>
-        <w:t xml:space="preserve"> (payload, states, assignments) and how </w:t>
-      </w:r>
-      <w:proofErr w:type="gramStart"/>
-      <w:r>
-        <w:t>many</w:t>
-      </w:r>
-      <w:proofErr w:type="gramEnd"/>
-      <w:r>
-        <w:t xml:space="preserve"> levels of undo </w:t>
-      </w:r>
-      <w:proofErr w:type="gramStart"/>
-      <w:r>
-        <w:t>are kept</w:t>
-      </w:r>
-      <w:proofErr w:type="gramEnd"/>
-      <w:r>
-        <w:t xml:space="preserve"> can differ between workflows.</w:t>
+        <w:t>What needs to be captured (payload, states, assignments) and how many levels of undo are kept can differ between workflows.</w:t>
       </w:r>
     </w:p>
     <w:p/>
@@ -4338,6 +3790,256 @@
       </w:r>
     </w:p>
     <w:p/>
+    <w:p>
+      <w:r>
+        <w:br w:type="page"/>
+      </w:r>
+    </w:p>
+    <w:p>
+      <w:pPr>
+        <w:pStyle w:val="Heading1"/>
+        <w:spacing w:after="140"/>
+        <w:rPr>
+          <w:b/>
+          <w:bCs/>
+          <w:color w:val="1F3864"/>
+          <w:sz w:val="30"/>
+          <w:szCs w:val="30"/>
+        </w:rPr>
+      </w:pPr>
+      <w:r>
+        <w:rPr>
+          <w:b/>
+          <w:bCs/>
+          <w:color w:val="1F3864"/>
+          <w:sz w:val="30"/>
+          <w:szCs w:val="30"/>
+        </w:rPr>
+        <w:lastRenderedPageBreak/>
+        <w:t xml:space="preserve">Task </w:t>
+      </w:r>
+      <w:r>
+        <w:rPr>
+          <w:b/>
+          <w:bCs/>
+          <w:color w:val="1F3864"/>
+          <w:sz w:val="30"/>
+          <w:szCs w:val="30"/>
+        </w:rPr>
+        <w:t>6</w:t>
+      </w:r>
+      <w:r>
+        <w:rPr>
+          <w:b/>
+          <w:bCs/>
+          <w:color w:val="1F3864"/>
+          <w:sz w:val="30"/>
+          <w:szCs w:val="30"/>
+        </w:rPr>
+        <w:t>:</w:t>
+      </w:r>
+      <w:r>
+        <w:rPr>
+          <w:b/>
+          <w:bCs/>
+          <w:color w:val="1F3864"/>
+          <w:sz w:val="30"/>
+          <w:szCs w:val="30"/>
+        </w:rPr>
+        <w:t xml:space="preserve"> Runtime Behaviour Diagrams</w:t>
+      </w:r>
+    </w:p>
+    <w:p>
+      <w:pPr>
+        <w:pStyle w:val="Heading2"/>
+      </w:pPr>
+      <w:r>
+        <w:t>UML Sequence Diagram: Creating and starting a workflow instance</w:t>
+      </w:r>
+    </w:p>
+    <w:p/>
+    <w:p>
+      <w:r>
+        <w:rPr>
+          <w:noProof/>
+        </w:rPr>
+        <w:drawing>
+          <wp:inline distT="0" distB="0" distL="0" distR="0" wp14:anchorId="30D068E7" wp14:editId="24EE30AC">
+            <wp:extent cx="5806209" cy="3995420"/>
+            <wp:effectExtent l="0" t="0" r="4445" b="5080"/>
+            <wp:docPr id="239558196" name="Picture 2"/>
+            <wp:cNvGraphicFramePr>
+              <a:graphicFrameLocks xmlns:a="http://schemas.openxmlformats.org/drawingml/2006/main" noChangeAspect="1"/>
+            </wp:cNvGraphicFramePr>
+            <a:graphic xmlns:a="http://schemas.openxmlformats.org/drawingml/2006/main">
+              <a:graphicData uri="http://schemas.openxmlformats.org/drawingml/2006/picture">
+                <pic:pic xmlns:pic="http://schemas.openxmlformats.org/drawingml/2006/picture">
+                  <pic:nvPicPr>
+                    <pic:cNvPr id="239558196" name="Picture 2"/>
+                    <pic:cNvPicPr/>
+                  </pic:nvPicPr>
+                  <pic:blipFill>
+                    <a:blip r:embed="rId6" cstate="print">
+                      <a:extLst>
+                        <a:ext uri="{28A0092B-C50C-407E-A947-70E740481C1C}">
+                          <a14:useLocalDpi xmlns:a14="http://schemas.microsoft.com/office/drawing/2010/main" val="0"/>
+                        </a:ext>
+                      </a:extLst>
+                    </a:blip>
+                    <a:stretch>
+                      <a:fillRect/>
+                    </a:stretch>
+                  </pic:blipFill>
+                  <pic:spPr>
+                    <a:xfrm>
+                      <a:off x="0" y="0"/>
+                      <a:ext cx="5806209" cy="3995420"/>
+                    </a:xfrm>
+                    <a:prstGeom prst="rect">
+                      <a:avLst/>
+                    </a:prstGeom>
+                  </pic:spPr>
+                </pic:pic>
+              </a:graphicData>
+            </a:graphic>
+          </wp:inline>
+        </w:drawing>
+      </w:r>
+    </w:p>
+    <w:p/>
+    <w:p>
+      <w:pPr>
+        <w:pStyle w:val="Heading2"/>
+      </w:pPr>
+      <w:r>
+        <w:t>UML Sequence Diagram: C</w:t>
+      </w:r>
+      <w:r>
+        <w:t>ompleting a work item, assigning the next one, and handling a courier failure</w:t>
+      </w:r>
+    </w:p>
+    <w:p/>
+    <w:p>
+      <w:r>
+        <w:rPr>
+          <w:noProof/>
+        </w:rPr>
+        <w:lastRenderedPageBreak/>
+        <w:drawing>
+          <wp:inline distT="0" distB="0" distL="0" distR="0" wp14:anchorId="3AE3165F" wp14:editId="4B318B5F">
+            <wp:extent cx="6120130" cy="4547870"/>
+            <wp:effectExtent l="0" t="0" r="0" b="5080"/>
+            <wp:docPr id="635206058" name="Picture 4"/>
+            <wp:cNvGraphicFramePr>
+              <a:graphicFrameLocks xmlns:a="http://schemas.openxmlformats.org/drawingml/2006/main" noChangeAspect="1"/>
+            </wp:cNvGraphicFramePr>
+            <a:graphic xmlns:a="http://schemas.openxmlformats.org/drawingml/2006/main">
+              <a:graphicData uri="http://schemas.openxmlformats.org/drawingml/2006/picture">
+                <pic:pic xmlns:pic="http://schemas.openxmlformats.org/drawingml/2006/picture">
+                  <pic:nvPicPr>
+                    <pic:cNvPr id="635206058" name="Picture 635206058"/>
+                    <pic:cNvPicPr/>
+                  </pic:nvPicPr>
+                  <pic:blipFill>
+                    <a:blip r:embed="rId7" cstate="print">
+                      <a:extLst>
+                        <a:ext uri="{28A0092B-C50C-407E-A947-70E740481C1C}">
+                          <a14:useLocalDpi xmlns:a14="http://schemas.microsoft.com/office/drawing/2010/main" val="0"/>
+                        </a:ext>
+                      </a:extLst>
+                    </a:blip>
+                    <a:stretch>
+                      <a:fillRect/>
+                    </a:stretch>
+                  </pic:blipFill>
+                  <pic:spPr>
+                    <a:xfrm>
+                      <a:off x="0" y="0"/>
+                      <a:ext cx="6120130" cy="4547870"/>
+                    </a:xfrm>
+                    <a:prstGeom prst="rect">
+                      <a:avLst/>
+                    </a:prstGeom>
+                  </pic:spPr>
+                </pic:pic>
+              </a:graphicData>
+            </a:graphic>
+          </wp:inline>
+        </w:drawing>
+      </w:r>
+    </w:p>
+    <w:p/>
+    <w:p>
+      <w:pPr>
+        <w:pStyle w:val="Heading2"/>
+      </w:pPr>
+      <w:r>
+        <w:t>UML S</w:t>
+      </w:r>
+      <w:r>
+        <w:t>tate</w:t>
+      </w:r>
+      <w:r>
+        <w:t xml:space="preserve"> Diagram: </w:t>
+      </w:r>
+      <w:r>
+        <w:t>W</w:t>
+      </w:r>
+      <w:r>
+        <w:t>orkflow instance</w:t>
+      </w:r>
+      <w:r>
+        <w:t xml:space="preserve"> lifecycle</w:t>
+      </w:r>
+    </w:p>
+    <w:p>
+      <w:r>
+        <w:rPr>
+          <w:noProof/>
+        </w:rPr>
+        <w:drawing>
+          <wp:inline distT="0" distB="0" distL="0" distR="0" wp14:anchorId="27759F9F" wp14:editId="7B077B4E">
+            <wp:extent cx="6120130" cy="4040505"/>
+            <wp:effectExtent l="0" t="0" r="0" b="0"/>
+            <wp:docPr id="52598792" name="Picture 3"/>
+            <wp:cNvGraphicFramePr>
+              <a:graphicFrameLocks xmlns:a="http://schemas.openxmlformats.org/drawingml/2006/main" noChangeAspect="1"/>
+            </wp:cNvGraphicFramePr>
+            <a:graphic xmlns:a="http://schemas.openxmlformats.org/drawingml/2006/main">
+              <a:graphicData uri="http://schemas.openxmlformats.org/drawingml/2006/picture">
+                <pic:pic xmlns:pic="http://schemas.openxmlformats.org/drawingml/2006/picture">
+                  <pic:nvPicPr>
+                    <pic:cNvPr id="52598792" name="Picture 52598792"/>
+                    <pic:cNvPicPr/>
+                  </pic:nvPicPr>
+                  <pic:blipFill>
+                    <a:blip r:embed="rId8">
+                      <a:extLst>
+                        <a:ext uri="{28A0092B-C50C-407E-A947-70E740481C1C}">
+                          <a14:useLocalDpi xmlns:a14="http://schemas.microsoft.com/office/drawing/2010/main" val="0"/>
+                        </a:ext>
+                      </a:extLst>
+                    </a:blip>
+                    <a:stretch>
+                      <a:fillRect/>
+                    </a:stretch>
+                  </pic:blipFill>
+                  <pic:spPr>
+                    <a:xfrm>
+                      <a:off x="0" y="0"/>
+                      <a:ext cx="6120130" cy="4040505"/>
+                    </a:xfrm>
+                    <a:prstGeom prst="rect">
+                      <a:avLst/>
+                    </a:prstGeom>
+                  </pic:spPr>
+                </pic:pic>
+              </a:graphicData>
+            </a:graphic>
+          </wp:inline>
+        </w:drawing>
+      </w:r>
+    </w:p>
     <w:p>
       <w:r>
         <w:br w:type="page"/>
@@ -5618,8 +5320,8 @@
   </w:style>
   <w:style w:type="paragraph" w:styleId="Heading2">
     <w:name w:val="heading 2"/>
+    <w:link w:val="Heading2Char"/>
     <w:uiPriority w:val="9"/>
-    <w:semiHidden/>
     <w:unhideWhenUsed/>
     <w:qFormat/>
     <w:pPr>
@@ -5690,6 +5392,7 @@
   <w:style w:type="character" w:default="1" w:styleId="DefaultParagraphFont">
     <w:name w:val="Default Paragraph Font"/>
     <w:uiPriority w:val="1"/>
+    <w:semiHidden/>
     <w:unhideWhenUsed/>
   </w:style>
   <w:style w:type="table" w:default="1" w:styleId="TableNormal">
@@ -5840,6 +5543,18 @@
         <w:insideV w:val="single" w:sz="4" w:space="0" w:color="auto"/>
       </w:tblBorders>
     </w:tblPr>
+  </w:style>
+  <w:style w:type="character" w:customStyle="1" w:styleId="Heading2Char">
+    <w:name w:val="Heading 2 Char"/>
+    <w:basedOn w:val="DefaultParagraphFont"/>
+    <w:link w:val="Heading2"/>
+    <w:uiPriority w:val="9"/>
+    <w:rsid w:val="000E52A2"/>
+    <w:rPr>
+      <w:color w:val="2E74B5"/>
+      <w:sz w:val="26"/>
+      <w:szCs w:val="26"/>
+    </w:rPr>
   </w:style>
 </w:styles>
 </file>

</xml_diff>

<commit_message>
Added skeleton for four other patterns
</commit_message>
<xml_diff>
--- a/docs/Prac6-COS 214.docx
+++ b/docs/Prac6-COS 214.docx
@@ -168,14 +168,12 @@
       </w:pPr>
       <w:bookmarkStart w:id="2" w:name="_Ngeletshedzo_Mutwanamba_(Team_Leader)_"/>
       <w:bookmarkEnd w:id="2"/>
-      <w:proofErr w:type="spellStart"/>
       <w:r>
         <w:rPr>
           <w:sz w:val="24"/>
         </w:rPr>
         <w:t>Ngeletshedzo</w:t>
       </w:r>
-      <w:proofErr w:type="spellEnd"/>
       <w:r>
         <w:rPr>
           <w:spacing w:val="-2"/>
@@ -183,14 +181,12 @@
         </w:rPr>
         <w:t xml:space="preserve"> </w:t>
       </w:r>
-      <w:proofErr w:type="spellStart"/>
       <w:r>
         <w:rPr>
           <w:sz w:val="24"/>
         </w:rPr>
         <w:t>Mutwanamba</w:t>
       </w:r>
-      <w:proofErr w:type="spellEnd"/>
       <w:r>
         <w:rPr>
           <w:spacing w:val="-2"/>
@@ -1791,15 +1787,7 @@
         <w:t xml:space="preserve"> </w:t>
       </w:r>
       <w:r>
-        <w:t xml:space="preserve">support different ones, so it makes sense to keep routing flexible and not </w:t>
-      </w:r>
-      <w:proofErr w:type="gramStart"/>
-      <w:r>
-        <w:t>hard-code</w:t>
-      </w:r>
-      <w:proofErr w:type="gramEnd"/>
-      <w:r>
-        <w:t xml:space="preserve"> it (van der Aalst, et al., 2003).</w:t>
+        <w:t>support different ones, so it makes sense to keep routing flexible and not hard-code it (van der Aalst, et al., 2003).</w:t>
       </w:r>
     </w:p>
     <w:p>
@@ -5441,7 +5429,15 @@
         <w:t xml:space="preserve"> </w:t>
       </w:r>
       <w:r>
-        <w:t>to Supervisor to Manager until its solved (</w:t>
+        <w:t xml:space="preserve">to Supervisor to Manager until </w:t>
+      </w:r>
+      <w:proofErr w:type="gramStart"/>
+      <w:r>
+        <w:t>its</w:t>
+      </w:r>
+      <w:proofErr w:type="gramEnd"/>
+      <w:r>
+        <w:t xml:space="preserve"> solved (</w:t>
       </w:r>
       <w:r>
         <w:rPr>
@@ -7070,7 +7066,15 @@
         <w:t xml:space="preserve"> </w:t>
       </w:r>
       <w:r>
-        <w:t xml:space="preserve">records each step into the definition under construction. Once the designer finishes, the builder checks that the definition is complete and hands back a versioned </w:t>
+        <w:t xml:space="preserve">records each step into the definition under construction. Once the designer finishes, the builder checks that the definition is complete and hands back a </w:t>
+      </w:r>
+      <w:proofErr w:type="gramStart"/>
+      <w:r>
+        <w:t>versioned</w:t>
+      </w:r>
+      <w:proofErr w:type="gramEnd"/>
+      <w:r>
+        <w:t xml:space="preserve"> </w:t>
       </w:r>
       <w:proofErr w:type="spellStart"/>
       <w:r>
@@ -7568,16 +7572,16 @@
         </w:rPr>
         <w:t xml:space="preserve"> </w:t>
       </w:r>
+      <w:r>
+        <w:t>order</w:t>
+      </w:r>
+      <w:r>
+        <w:rPr>
+          <w:spacing w:val="-4"/>
+        </w:rPr>
+        <w:t xml:space="preserve"> </w:t>
+      </w:r>
       <w:proofErr w:type="gramStart"/>
-      <w:r>
-        <w:t>order</w:t>
-      </w:r>
-      <w:r>
-        <w:rPr>
-          <w:spacing w:val="-4"/>
-        </w:rPr>
-        <w:t xml:space="preserve"> </w:t>
-      </w:r>
       <w:r>
         <w:t>is</w:t>
       </w:r>
@@ -8335,9 +8339,11 @@
         </w:rPr>
         <w:t xml:space="preserve"> </w:t>
       </w:r>
+      <w:proofErr w:type="gramStart"/>
       <w:r>
         <w:t>differ</w:t>
       </w:r>
+      <w:proofErr w:type="gramEnd"/>
       <w:r>
         <w:rPr>
           <w:spacing w:val="-4"/>
@@ -10389,15 +10395,7 @@
       </w:r>
       <w:proofErr w:type="spellEnd"/>
       <w:r>
-        <w:t xml:space="preserve">, or </w:t>
-      </w:r>
-      <w:proofErr w:type="gramStart"/>
-      <w:r>
-        <w:t>refuses</w:t>
-      </w:r>
-      <w:proofErr w:type="gramEnd"/>
-      <w:r>
-        <w:t xml:space="preserve"> it, such as </w:t>
+        <w:t xml:space="preserve">, or refuses it, such as </w:t>
       </w:r>
       <w:proofErr w:type="spellStart"/>
       <w:r>
@@ -17191,6 +17189,513 @@
         <w:pStyle w:val="BodyText"/>
         <w:spacing w:before="1"/>
         <w:ind w:left="142"/>
+      </w:pPr>
+      <w:r>
+        <w:rPr>
+          <w:b/>
+          <w:color w:val="1F3863"/>
+        </w:rPr>
+        <w:t>Why</w:t>
+      </w:r>
+      <w:r>
+        <w:rPr>
+          <w:b/>
+          <w:color w:val="1F3863"/>
+          <w:spacing w:val="-3"/>
+        </w:rPr>
+        <w:t xml:space="preserve"> </w:t>
+      </w:r>
+      <w:r>
+        <w:rPr>
+          <w:b/>
+          <w:color w:val="1F3863"/>
+        </w:rPr>
+        <w:t>is</w:t>
+      </w:r>
+      <w:r>
+        <w:rPr>
+          <w:b/>
+          <w:color w:val="1F3863"/>
+          <w:spacing w:val="-3"/>
+        </w:rPr>
+        <w:t xml:space="preserve"> </w:t>
+      </w:r>
+      <w:r>
+        <w:rPr>
+          <w:b/>
+          <w:color w:val="1F3863"/>
+        </w:rPr>
+        <w:t>it</w:t>
+      </w:r>
+      <w:r>
+        <w:rPr>
+          <w:b/>
+          <w:color w:val="1F3863"/>
+          <w:spacing w:val="-3"/>
+        </w:rPr>
+        <w:t xml:space="preserve"> </w:t>
+      </w:r>
+      <w:r>
+        <w:rPr>
+          <w:b/>
+          <w:color w:val="1F3863"/>
+        </w:rPr>
+        <w:t>appropriate:</w:t>
+      </w:r>
+      <w:r>
+        <w:rPr>
+          <w:b/>
+          <w:color w:val="1F3863"/>
+          <w:spacing w:val="-2"/>
+        </w:rPr>
+        <w:t xml:space="preserve"> </w:t>
+      </w:r>
+      <w:proofErr w:type="gramStart"/>
+      <w:r>
+        <w:t>The</w:t>
+      </w:r>
+      <w:r>
+        <w:rPr>
+          <w:spacing w:val="-2"/>
+        </w:rPr>
+        <w:t xml:space="preserve"> </w:t>
+      </w:r>
+      <w:r>
+        <w:t>Memento</w:t>
+      </w:r>
+      <w:proofErr w:type="gramEnd"/>
+      <w:r>
+        <w:rPr>
+          <w:spacing w:val="-3"/>
+        </w:rPr>
+        <w:t xml:space="preserve"> </w:t>
+      </w:r>
+      <w:r>
+        <w:t>is</w:t>
+      </w:r>
+      <w:r>
+        <w:rPr>
+          <w:spacing w:val="-2"/>
+        </w:rPr>
+        <w:t xml:space="preserve"> </w:t>
+      </w:r>
+      <w:r>
+        <w:t>the</w:t>
+      </w:r>
+      <w:r>
+        <w:rPr>
+          <w:spacing w:val="-2"/>
+        </w:rPr>
+        <w:t xml:space="preserve"> </w:t>
+      </w:r>
+      <w:proofErr w:type="gramStart"/>
+      <w:r>
+        <w:t>undo</w:t>
+      </w:r>
+      <w:proofErr w:type="gramEnd"/>
+      <w:r>
+        <w:rPr>
+          <w:spacing w:val="-3"/>
+        </w:rPr>
+        <w:t xml:space="preserve"> </w:t>
+      </w:r>
+      <w:r>
+        <w:t>and</w:t>
+      </w:r>
+      <w:r>
+        <w:rPr>
+          <w:spacing w:val="-2"/>
+        </w:rPr>
+        <w:t xml:space="preserve"> </w:t>
+      </w:r>
+      <w:r>
+        <w:t>rollback</w:t>
+      </w:r>
+      <w:r>
+        <w:rPr>
+          <w:spacing w:val="-3"/>
+        </w:rPr>
+        <w:t xml:space="preserve"> </w:t>
+      </w:r>
+      <w:r>
+        <w:t>side</w:t>
+      </w:r>
+      <w:r>
+        <w:rPr>
+          <w:spacing w:val="-2"/>
+        </w:rPr>
+        <w:t xml:space="preserve"> </w:t>
+      </w:r>
+      <w:r>
+        <w:t>of</w:t>
+      </w:r>
+      <w:r>
+        <w:rPr>
+          <w:spacing w:val="-3"/>
+        </w:rPr>
+        <w:t xml:space="preserve"> </w:t>
+      </w:r>
+      <w:r>
+        <w:t>the</w:t>
+      </w:r>
+      <w:r>
+        <w:rPr>
+          <w:spacing w:val="-2"/>
+        </w:rPr>
+        <w:t xml:space="preserve"> </w:t>
+      </w:r>
+      <w:r>
+        <w:t>system.</w:t>
+      </w:r>
+      <w:r>
+        <w:rPr>
+          <w:spacing w:val="-3"/>
+        </w:rPr>
+        <w:t xml:space="preserve"> </w:t>
+      </w:r>
+      <w:r>
+        <w:t>Restoring</w:t>
+      </w:r>
+      <w:r>
+        <w:rPr>
+          <w:spacing w:val="-3"/>
+        </w:rPr>
+        <w:t xml:space="preserve"> </w:t>
+      </w:r>
+      <w:r>
+        <w:t>from</w:t>
+      </w:r>
+      <w:r>
+        <w:rPr>
+          <w:spacing w:val="-3"/>
+        </w:rPr>
+        <w:t xml:space="preserve"> </w:t>
+      </w:r>
+      <w:r>
+        <w:t>a</w:t>
+      </w:r>
+      <w:r>
+        <w:rPr>
+          <w:spacing w:val="-3"/>
+        </w:rPr>
+        <w:t xml:space="preserve"> </w:t>
+      </w:r>
+      <w:r>
+        <w:t xml:space="preserve">snapshot returns the order to a known-good point while </w:t>
+      </w:r>
+      <w:proofErr w:type="gramStart"/>
+      <w:r>
+        <w:t>the history</w:t>
+      </w:r>
+      <w:proofErr w:type="gramEnd"/>
+      <w:r>
+        <w:t xml:space="preserve"> only grows, so the record stays a</w:t>
+      </w:r>
+    </w:p>
+    <w:p>
+      <w:pPr>
+        <w:pStyle w:val="Heading3"/>
+        <w:numPr>
+          <w:ilvl w:val="0"/>
+          <w:numId w:val="2"/>
+        </w:numPr>
+        <w:tabs>
+          <w:tab w:val="left" w:pos="561"/>
+        </w:tabs>
+        <w:spacing w:before="268" w:line="342" w:lineRule="exact"/>
+        <w:ind w:left="561" w:hanging="419"/>
+      </w:pPr>
+      <w:r>
+        <w:rPr>
+          <w:color w:val="1F3863"/>
+          <w:spacing w:val="-2"/>
+        </w:rPr>
+        <w:t>Pattern 1</w:t>
+      </w:r>
+    </w:p>
+    <w:p>
+      <w:pPr>
+        <w:pStyle w:val="BodyText"/>
+        <w:ind w:left="142" w:right="251"/>
+      </w:pPr>
+      <w:r>
+        <w:rPr>
+          <w:b/>
+          <w:color w:val="1F3863"/>
+        </w:rPr>
+        <w:t>Problem:</w:t>
+      </w:r>
+      <w:r>
+        <w:rPr>
+          <w:b/>
+          <w:color w:val="1F3863"/>
+          <w:spacing w:val="-3"/>
+        </w:rPr>
+        <w:t xml:space="preserve"> </w:t>
+      </w:r>
+    </w:p>
+    <w:p>
+      <w:pPr>
+        <w:pStyle w:val="BodyText"/>
+        <w:spacing w:before="1"/>
+      </w:pPr>
+    </w:p>
+    <w:p>
+      <w:pPr>
+        <w:pStyle w:val="Heading4"/>
+      </w:pPr>
+      <w:r>
+        <w:rPr>
+          <w:color w:val="1F3863"/>
+          <w:spacing w:val="-2"/>
+        </w:rPr>
+        <w:t>Participants:</w:t>
+      </w:r>
+    </w:p>
+    <w:tbl>
+      <w:tblPr>
+        <w:tblW w:w="0" w:type="auto"/>
+        <w:tblInd w:w="151" w:type="dxa"/>
+        <w:tblBorders>
+          <w:top w:val="single" w:sz="4" w:space="0" w:color="000000"/>
+          <w:left w:val="single" w:sz="4" w:space="0" w:color="000000"/>
+          <w:bottom w:val="single" w:sz="4" w:space="0" w:color="000000"/>
+          <w:right w:val="single" w:sz="4" w:space="0" w:color="000000"/>
+          <w:insideH w:val="single" w:sz="4" w:space="0" w:color="000000"/>
+          <w:insideV w:val="single" w:sz="4" w:space="0" w:color="000000"/>
+        </w:tblBorders>
+        <w:tblLayout w:type="fixed"/>
+        <w:tblCellMar>
+          <w:left w:w="0" w:type="dxa"/>
+          <w:right w:w="0" w:type="dxa"/>
+        </w:tblCellMar>
+        <w:tblLook w:val="01E0" w:firstRow="1" w:lastRow="1" w:firstColumn="1" w:lastColumn="1" w:noHBand="0" w:noVBand="0"/>
+      </w:tblPr>
+      <w:tblGrid>
+        <w:gridCol w:w="4815"/>
+        <w:gridCol w:w="4815"/>
+      </w:tblGrid>
+      <w:tr>
+        <w:trPr>
+          <w:trHeight w:val="268"/>
+        </w:trPr>
+        <w:tc>
+          <w:tcPr>
+            <w:tcW w:w="4815" w:type="dxa"/>
+          </w:tcPr>
+          <w:p>
+            <w:pPr>
+              <w:pStyle w:val="TableParagraph"/>
+              <w:ind w:left="107"/>
+              <w:rPr>
+                <w:b/>
+              </w:rPr>
+            </w:pPr>
+            <w:proofErr w:type="spellStart"/>
+            <w:r>
+              <w:rPr>
+                <w:b/>
+              </w:rPr>
+              <w:t>GoF</w:t>
+            </w:r>
+            <w:proofErr w:type="spellEnd"/>
+            <w:r>
+              <w:rPr>
+                <w:b/>
+                <w:spacing w:val="-4"/>
+              </w:rPr>
+              <w:t xml:space="preserve"> </w:t>
+            </w:r>
+            <w:r>
+              <w:rPr>
+                <w:b/>
+                <w:spacing w:val="-2"/>
+              </w:rPr>
+              <w:t>Participants</w:t>
+            </w:r>
+          </w:p>
+        </w:tc>
+        <w:tc>
+          <w:tcPr>
+            <w:tcW w:w="4815" w:type="dxa"/>
+          </w:tcPr>
+          <w:p>
+            <w:pPr>
+              <w:pStyle w:val="TableParagraph"/>
+              <w:rPr>
+                <w:b/>
+              </w:rPr>
+            </w:pPr>
+            <w:r>
+              <w:rPr>
+                <w:b/>
+              </w:rPr>
+              <w:t>Class</w:t>
+            </w:r>
+            <w:r>
+              <w:rPr>
+                <w:b/>
+                <w:spacing w:val="-6"/>
+              </w:rPr>
+              <w:t xml:space="preserve"> </w:t>
+            </w:r>
+            <w:r>
+              <w:rPr>
+                <w:b/>
+                <w:spacing w:val="-2"/>
+              </w:rPr>
+              <w:t>Names</w:t>
+            </w:r>
+          </w:p>
+        </w:tc>
+      </w:tr>
+      <w:tr>
+        <w:trPr>
+          <w:trHeight w:val="268"/>
+        </w:trPr>
+        <w:tc>
+          <w:tcPr>
+            <w:tcW w:w="4815" w:type="dxa"/>
+          </w:tcPr>
+          <w:p>
+            <w:pPr>
+              <w:pStyle w:val="TableParagraph"/>
+              <w:ind w:left="107"/>
+            </w:pPr>
+          </w:p>
+        </w:tc>
+        <w:tc>
+          <w:tcPr>
+            <w:tcW w:w="4815" w:type="dxa"/>
+          </w:tcPr>
+          <w:p>
+            <w:pPr>
+              <w:pStyle w:val="TableParagraph"/>
+            </w:pPr>
+          </w:p>
+        </w:tc>
+      </w:tr>
+      <w:tr>
+        <w:trPr>
+          <w:trHeight w:val="268"/>
+        </w:trPr>
+        <w:tc>
+          <w:tcPr>
+            <w:tcW w:w="4815" w:type="dxa"/>
+          </w:tcPr>
+          <w:p>
+            <w:pPr>
+              <w:pStyle w:val="TableParagraph"/>
+              <w:ind w:left="107"/>
+            </w:pPr>
+          </w:p>
+        </w:tc>
+        <w:tc>
+          <w:tcPr>
+            <w:tcW w:w="4815" w:type="dxa"/>
+          </w:tcPr>
+          <w:p>
+            <w:pPr>
+              <w:pStyle w:val="TableParagraph"/>
+            </w:pPr>
+          </w:p>
+        </w:tc>
+      </w:tr>
+      <w:tr>
+        <w:trPr>
+          <w:trHeight w:val="269"/>
+        </w:trPr>
+        <w:tc>
+          <w:tcPr>
+            <w:tcW w:w="4815" w:type="dxa"/>
+          </w:tcPr>
+          <w:p>
+            <w:pPr>
+              <w:pStyle w:val="TableParagraph"/>
+              <w:spacing w:line="249" w:lineRule="exact"/>
+              <w:ind w:left="107"/>
+            </w:pPr>
+          </w:p>
+        </w:tc>
+        <w:tc>
+          <w:tcPr>
+            <w:tcW w:w="4815" w:type="dxa"/>
+          </w:tcPr>
+          <w:p>
+            <w:pPr>
+              <w:pStyle w:val="TableParagraph"/>
+              <w:spacing w:line="249" w:lineRule="exact"/>
+            </w:pPr>
+          </w:p>
+        </w:tc>
+      </w:tr>
+    </w:tbl>
+    <w:p>
+      <w:pPr>
+        <w:pStyle w:val="BodyText"/>
+        <w:spacing w:before="1"/>
+        <w:rPr>
+          <w:b/>
+        </w:rPr>
+      </w:pPr>
+    </w:p>
+    <w:p>
+      <w:pPr>
+        <w:pStyle w:val="BodyText"/>
+        <w:ind w:left="142" w:right="247"/>
+      </w:pPr>
+      <w:r>
+        <w:rPr>
+          <w:b/>
+          <w:color w:val="1F3863"/>
+        </w:rPr>
+        <w:t>Collaboration:</w:t>
+      </w:r>
+      <w:r>
+        <w:rPr>
+          <w:b/>
+          <w:color w:val="1F3863"/>
+          <w:spacing w:val="-2"/>
+        </w:rPr>
+        <w:t xml:space="preserve"> </w:t>
+      </w:r>
+    </w:p>
+    <w:p>
+      <w:pPr>
+        <w:pStyle w:val="BodyText"/>
+      </w:pPr>
+    </w:p>
+    <w:p>
+      <w:pPr>
+        <w:pStyle w:val="BodyText"/>
+        <w:ind w:left="142"/>
+      </w:pPr>
+      <w:r>
+        <w:rPr>
+          <w:b/>
+          <w:color w:val="1F3863"/>
+        </w:rPr>
+        <w:t>Variation:</w:t>
+      </w:r>
+      <w:r>
+        <w:rPr>
+          <w:b/>
+          <w:color w:val="1F3863"/>
+          <w:spacing w:val="-3"/>
+        </w:rPr>
+        <w:t xml:space="preserve"> </w:t>
+      </w:r>
+    </w:p>
+    <w:p>
+      <w:pPr>
+        <w:pStyle w:val="BodyText"/>
+      </w:pPr>
+    </w:p>
+    <w:p>
+      <w:pPr>
+        <w:pStyle w:val="BodyText"/>
+        <w:spacing w:before="1"/>
+        <w:ind w:left="142"/>
         <w:sectPr>
           <w:type w:val="continuous"/>
           <w:pgSz w:w="11910" w:h="16840"/>
@@ -17258,139 +17763,1278 @@
         </w:rPr>
         <w:t xml:space="preserve"> </w:t>
       </w:r>
+    </w:p>
+    <w:p>
+      <w:pPr>
+        <w:pStyle w:val="BodyText"/>
+        <w:spacing w:before="1"/>
+        <w:ind w:left="142"/>
+      </w:pPr>
+    </w:p>
+    <w:p>
+      <w:pPr>
+        <w:pStyle w:val="BodyText"/>
+        <w:spacing w:before="1"/>
+        <w:ind w:left="142"/>
+      </w:pPr>
+    </w:p>
+    <w:p>
+      <w:pPr>
+        <w:pStyle w:val="Heading3"/>
+        <w:numPr>
+          <w:ilvl w:val="0"/>
+          <w:numId w:val="2"/>
+        </w:numPr>
+        <w:tabs>
+          <w:tab w:val="left" w:pos="561"/>
+        </w:tabs>
+        <w:spacing w:before="268" w:line="342" w:lineRule="exact"/>
+        <w:ind w:left="561" w:hanging="419"/>
+      </w:pPr>
+      <w:r>
+        <w:rPr>
+          <w:color w:val="1F3863"/>
+          <w:spacing w:val="-2"/>
+        </w:rPr>
+        <w:lastRenderedPageBreak/>
+        <w:t>Pattern 2</w:t>
+      </w:r>
+    </w:p>
+    <w:p>
+      <w:pPr>
+        <w:pStyle w:val="BodyText"/>
+        <w:ind w:left="142" w:right="251"/>
+      </w:pPr>
+      <w:r>
+        <w:rPr>
+          <w:b/>
+          <w:color w:val="1F3863"/>
+        </w:rPr>
+        <w:t>Problem:</w:t>
+      </w:r>
+      <w:r>
+        <w:rPr>
+          <w:b/>
+          <w:color w:val="1F3863"/>
+          <w:spacing w:val="-3"/>
+        </w:rPr>
+        <w:t xml:space="preserve"> </w:t>
+      </w:r>
+    </w:p>
+    <w:p>
+      <w:pPr>
+        <w:pStyle w:val="BodyText"/>
+        <w:spacing w:before="1"/>
+      </w:pPr>
+    </w:p>
+    <w:p>
+      <w:pPr>
+        <w:pStyle w:val="Heading4"/>
+      </w:pPr>
+      <w:r>
+        <w:rPr>
+          <w:color w:val="1F3863"/>
+          <w:spacing w:val="-2"/>
+        </w:rPr>
+        <w:t>Participants:</w:t>
+      </w:r>
+    </w:p>
+    <w:tbl>
+      <w:tblPr>
+        <w:tblW w:w="0" w:type="auto"/>
+        <w:tblInd w:w="151" w:type="dxa"/>
+        <w:tblBorders>
+          <w:top w:val="single" w:sz="4" w:space="0" w:color="000000"/>
+          <w:left w:val="single" w:sz="4" w:space="0" w:color="000000"/>
+          <w:bottom w:val="single" w:sz="4" w:space="0" w:color="000000"/>
+          <w:right w:val="single" w:sz="4" w:space="0" w:color="000000"/>
+          <w:insideH w:val="single" w:sz="4" w:space="0" w:color="000000"/>
+          <w:insideV w:val="single" w:sz="4" w:space="0" w:color="000000"/>
+        </w:tblBorders>
+        <w:tblLayout w:type="fixed"/>
+        <w:tblCellMar>
+          <w:left w:w="0" w:type="dxa"/>
+          <w:right w:w="0" w:type="dxa"/>
+        </w:tblCellMar>
+        <w:tblLook w:val="01E0" w:firstRow="1" w:lastRow="1" w:firstColumn="1" w:lastColumn="1" w:noHBand="0" w:noVBand="0"/>
+      </w:tblPr>
+      <w:tblGrid>
+        <w:gridCol w:w="4815"/>
+        <w:gridCol w:w="4815"/>
+      </w:tblGrid>
+      <w:tr>
+        <w:trPr>
+          <w:trHeight w:val="268"/>
+        </w:trPr>
+        <w:tc>
+          <w:tcPr>
+            <w:tcW w:w="4815" w:type="dxa"/>
+          </w:tcPr>
+          <w:p>
+            <w:pPr>
+              <w:pStyle w:val="TableParagraph"/>
+              <w:ind w:left="107"/>
+              <w:rPr>
+                <w:b/>
+              </w:rPr>
+            </w:pPr>
+            <w:proofErr w:type="spellStart"/>
+            <w:r>
+              <w:rPr>
+                <w:b/>
+              </w:rPr>
+              <w:t>GoF</w:t>
+            </w:r>
+            <w:proofErr w:type="spellEnd"/>
+            <w:r>
+              <w:rPr>
+                <w:b/>
+                <w:spacing w:val="-4"/>
+              </w:rPr>
+              <w:t xml:space="preserve"> </w:t>
+            </w:r>
+            <w:r>
+              <w:rPr>
+                <w:b/>
+                <w:spacing w:val="-2"/>
+              </w:rPr>
+              <w:t>Participants</w:t>
+            </w:r>
+          </w:p>
+        </w:tc>
+        <w:tc>
+          <w:tcPr>
+            <w:tcW w:w="4815" w:type="dxa"/>
+          </w:tcPr>
+          <w:p>
+            <w:pPr>
+              <w:pStyle w:val="TableParagraph"/>
+              <w:rPr>
+                <w:b/>
+              </w:rPr>
+            </w:pPr>
+            <w:r>
+              <w:rPr>
+                <w:b/>
+              </w:rPr>
+              <w:t>Class</w:t>
+            </w:r>
+            <w:r>
+              <w:rPr>
+                <w:b/>
+                <w:spacing w:val="-6"/>
+              </w:rPr>
+              <w:t xml:space="preserve"> </w:t>
+            </w:r>
+            <w:r>
+              <w:rPr>
+                <w:b/>
+                <w:spacing w:val="-2"/>
+              </w:rPr>
+              <w:t>Names</w:t>
+            </w:r>
+          </w:p>
+        </w:tc>
+      </w:tr>
+      <w:tr>
+        <w:trPr>
+          <w:trHeight w:val="268"/>
+        </w:trPr>
+        <w:tc>
+          <w:tcPr>
+            <w:tcW w:w="4815" w:type="dxa"/>
+          </w:tcPr>
+          <w:p>
+            <w:pPr>
+              <w:pStyle w:val="TableParagraph"/>
+              <w:ind w:left="107"/>
+            </w:pPr>
+          </w:p>
+        </w:tc>
+        <w:tc>
+          <w:tcPr>
+            <w:tcW w:w="4815" w:type="dxa"/>
+          </w:tcPr>
+          <w:p>
+            <w:pPr>
+              <w:pStyle w:val="TableParagraph"/>
+            </w:pPr>
+          </w:p>
+        </w:tc>
+      </w:tr>
+      <w:tr>
+        <w:trPr>
+          <w:trHeight w:val="268"/>
+        </w:trPr>
+        <w:tc>
+          <w:tcPr>
+            <w:tcW w:w="4815" w:type="dxa"/>
+          </w:tcPr>
+          <w:p>
+            <w:pPr>
+              <w:pStyle w:val="TableParagraph"/>
+              <w:ind w:left="107"/>
+            </w:pPr>
+          </w:p>
+        </w:tc>
+        <w:tc>
+          <w:tcPr>
+            <w:tcW w:w="4815" w:type="dxa"/>
+          </w:tcPr>
+          <w:p>
+            <w:pPr>
+              <w:pStyle w:val="TableParagraph"/>
+            </w:pPr>
+          </w:p>
+        </w:tc>
+      </w:tr>
+      <w:tr>
+        <w:trPr>
+          <w:trHeight w:val="269"/>
+        </w:trPr>
+        <w:tc>
+          <w:tcPr>
+            <w:tcW w:w="4815" w:type="dxa"/>
+          </w:tcPr>
+          <w:p>
+            <w:pPr>
+              <w:pStyle w:val="TableParagraph"/>
+              <w:spacing w:line="249" w:lineRule="exact"/>
+              <w:ind w:left="107"/>
+            </w:pPr>
+          </w:p>
+        </w:tc>
+        <w:tc>
+          <w:tcPr>
+            <w:tcW w:w="4815" w:type="dxa"/>
+          </w:tcPr>
+          <w:p>
+            <w:pPr>
+              <w:pStyle w:val="TableParagraph"/>
+              <w:spacing w:line="249" w:lineRule="exact"/>
+            </w:pPr>
+          </w:p>
+        </w:tc>
+      </w:tr>
+    </w:tbl>
+    <w:p>
+      <w:pPr>
+        <w:pStyle w:val="BodyText"/>
+        <w:spacing w:before="1"/>
+        <w:rPr>
+          <w:b/>
+        </w:rPr>
+      </w:pPr>
+    </w:p>
+    <w:p>
+      <w:pPr>
+        <w:pStyle w:val="BodyText"/>
+        <w:ind w:left="142" w:right="247"/>
+      </w:pPr>
+      <w:r>
+        <w:rPr>
+          <w:b/>
+          <w:color w:val="1F3863"/>
+        </w:rPr>
+        <w:t>Collaboration:</w:t>
+      </w:r>
+      <w:r>
+        <w:rPr>
+          <w:b/>
+          <w:color w:val="1F3863"/>
+          <w:spacing w:val="-2"/>
+        </w:rPr>
+        <w:t xml:space="preserve"> </w:t>
+      </w:r>
+    </w:p>
+    <w:p>
+      <w:pPr>
+        <w:pStyle w:val="BodyText"/>
+      </w:pPr>
+    </w:p>
+    <w:p>
+      <w:pPr>
+        <w:pStyle w:val="BodyText"/>
+        <w:ind w:left="142"/>
+      </w:pPr>
+      <w:r>
+        <w:rPr>
+          <w:b/>
+          <w:color w:val="1F3863"/>
+        </w:rPr>
+        <w:t>Variation:</w:t>
+      </w:r>
+      <w:r>
+        <w:rPr>
+          <w:b/>
+          <w:color w:val="1F3863"/>
+          <w:spacing w:val="-3"/>
+        </w:rPr>
+        <w:t xml:space="preserve"> </w:t>
+      </w:r>
+    </w:p>
+    <w:p>
+      <w:pPr>
+        <w:pStyle w:val="BodyText"/>
+      </w:pPr>
+    </w:p>
+    <w:p>
+      <w:pPr>
+        <w:pStyle w:val="BodyText"/>
+        <w:spacing w:before="1"/>
+        <w:ind w:left="142"/>
+        <w:sectPr>
+          <w:type w:val="continuous"/>
+          <w:pgSz w:w="11910" w:h="16840"/>
+          <w:pgMar w:top="1100" w:right="992" w:bottom="280" w:left="992" w:header="720" w:footer="720" w:gutter="0"/>
+          <w:cols w:space="720"/>
+        </w:sectPr>
+      </w:pPr>
+      <w:r>
+        <w:rPr>
+          <w:b/>
+          <w:color w:val="1F3863"/>
+        </w:rPr>
+        <w:t>Why</w:t>
+      </w:r>
+      <w:r>
+        <w:rPr>
+          <w:b/>
+          <w:color w:val="1F3863"/>
+          <w:spacing w:val="-3"/>
+        </w:rPr>
+        <w:t xml:space="preserve"> </w:t>
+      </w:r>
+      <w:r>
+        <w:rPr>
+          <w:b/>
+          <w:color w:val="1F3863"/>
+        </w:rPr>
+        <w:t>is</w:t>
+      </w:r>
+      <w:r>
+        <w:rPr>
+          <w:b/>
+          <w:color w:val="1F3863"/>
+          <w:spacing w:val="-3"/>
+        </w:rPr>
+        <w:t xml:space="preserve"> </w:t>
+      </w:r>
+      <w:r>
+        <w:rPr>
+          <w:b/>
+          <w:color w:val="1F3863"/>
+        </w:rPr>
+        <w:t>it</w:t>
+      </w:r>
+      <w:r>
+        <w:rPr>
+          <w:b/>
+          <w:color w:val="1F3863"/>
+          <w:spacing w:val="-3"/>
+        </w:rPr>
+        <w:t xml:space="preserve"> </w:t>
+      </w:r>
+      <w:r>
+        <w:rPr>
+          <w:b/>
+          <w:color w:val="1F3863"/>
+        </w:rPr>
+        <w:t>appropriate:</w:t>
+      </w:r>
+      <w:r>
+        <w:rPr>
+          <w:b/>
+          <w:color w:val="1F3863"/>
+          <w:spacing w:val="-2"/>
+        </w:rPr>
+        <w:t xml:space="preserve"> </w:t>
+      </w:r>
+    </w:p>
+    <w:p>
+      <w:pPr>
+        <w:pStyle w:val="BodyText"/>
+        <w:spacing w:before="1"/>
+        <w:ind w:left="142"/>
+      </w:pPr>
+    </w:p>
+    <w:p>
+      <w:pPr>
+        <w:pStyle w:val="BodyText"/>
+        <w:spacing w:before="1"/>
+        <w:ind w:left="142"/>
+      </w:pPr>
+    </w:p>
+    <w:p>
+      <w:pPr>
+        <w:pStyle w:val="Heading3"/>
+        <w:numPr>
+          <w:ilvl w:val="0"/>
+          <w:numId w:val="2"/>
+        </w:numPr>
+        <w:tabs>
+          <w:tab w:val="left" w:pos="561"/>
+        </w:tabs>
+        <w:spacing w:before="268" w:line="342" w:lineRule="exact"/>
+        <w:ind w:left="561" w:hanging="419"/>
+      </w:pPr>
+      <w:r>
+        <w:rPr>
+          <w:color w:val="1F3863"/>
+          <w:spacing w:val="-2"/>
+        </w:rPr>
+        <w:t>Pattern 3</w:t>
+      </w:r>
+    </w:p>
+    <w:p>
+      <w:pPr>
+        <w:pStyle w:val="BodyText"/>
+        <w:ind w:left="142" w:right="251"/>
+      </w:pPr>
+      <w:r>
+        <w:rPr>
+          <w:b/>
+          <w:color w:val="1F3863"/>
+        </w:rPr>
+        <w:t>Problem:</w:t>
+      </w:r>
+      <w:r>
+        <w:rPr>
+          <w:b/>
+          <w:color w:val="1F3863"/>
+          <w:spacing w:val="-3"/>
+        </w:rPr>
+        <w:t xml:space="preserve"> </w:t>
+      </w:r>
+    </w:p>
+    <w:p>
+      <w:pPr>
+        <w:pStyle w:val="BodyText"/>
+        <w:spacing w:before="1"/>
+      </w:pPr>
+    </w:p>
+    <w:p>
+      <w:pPr>
+        <w:pStyle w:val="Heading4"/>
+      </w:pPr>
+      <w:r>
+        <w:rPr>
+          <w:color w:val="1F3863"/>
+          <w:spacing w:val="-2"/>
+        </w:rPr>
+        <w:t>Participants:</w:t>
+      </w:r>
+    </w:p>
+    <w:tbl>
+      <w:tblPr>
+        <w:tblW w:w="0" w:type="auto"/>
+        <w:tblInd w:w="151" w:type="dxa"/>
+        <w:tblBorders>
+          <w:top w:val="single" w:sz="4" w:space="0" w:color="000000"/>
+          <w:left w:val="single" w:sz="4" w:space="0" w:color="000000"/>
+          <w:bottom w:val="single" w:sz="4" w:space="0" w:color="000000"/>
+          <w:right w:val="single" w:sz="4" w:space="0" w:color="000000"/>
+          <w:insideH w:val="single" w:sz="4" w:space="0" w:color="000000"/>
+          <w:insideV w:val="single" w:sz="4" w:space="0" w:color="000000"/>
+        </w:tblBorders>
+        <w:tblLayout w:type="fixed"/>
+        <w:tblCellMar>
+          <w:left w:w="0" w:type="dxa"/>
+          <w:right w:w="0" w:type="dxa"/>
+        </w:tblCellMar>
+        <w:tblLook w:val="01E0" w:firstRow="1" w:lastRow="1" w:firstColumn="1" w:lastColumn="1" w:noHBand="0" w:noVBand="0"/>
+      </w:tblPr>
+      <w:tblGrid>
+        <w:gridCol w:w="4815"/>
+        <w:gridCol w:w="4815"/>
+      </w:tblGrid>
+      <w:tr>
+        <w:trPr>
+          <w:trHeight w:val="268"/>
+        </w:trPr>
+        <w:tc>
+          <w:tcPr>
+            <w:tcW w:w="4815" w:type="dxa"/>
+          </w:tcPr>
+          <w:p>
+            <w:pPr>
+              <w:pStyle w:val="TableParagraph"/>
+              <w:ind w:left="107"/>
+              <w:rPr>
+                <w:b/>
+              </w:rPr>
+            </w:pPr>
+            <w:proofErr w:type="spellStart"/>
+            <w:r>
+              <w:rPr>
+                <w:b/>
+              </w:rPr>
+              <w:t>GoF</w:t>
+            </w:r>
+            <w:proofErr w:type="spellEnd"/>
+            <w:r>
+              <w:rPr>
+                <w:b/>
+                <w:spacing w:val="-4"/>
+              </w:rPr>
+              <w:t xml:space="preserve"> </w:t>
+            </w:r>
+            <w:r>
+              <w:rPr>
+                <w:b/>
+                <w:spacing w:val="-2"/>
+              </w:rPr>
+              <w:t>Participants</w:t>
+            </w:r>
+          </w:p>
+        </w:tc>
+        <w:tc>
+          <w:tcPr>
+            <w:tcW w:w="4815" w:type="dxa"/>
+          </w:tcPr>
+          <w:p>
+            <w:pPr>
+              <w:pStyle w:val="TableParagraph"/>
+              <w:rPr>
+                <w:b/>
+              </w:rPr>
+            </w:pPr>
+            <w:r>
+              <w:rPr>
+                <w:b/>
+              </w:rPr>
+              <w:t>Class</w:t>
+            </w:r>
+            <w:r>
+              <w:rPr>
+                <w:b/>
+                <w:spacing w:val="-6"/>
+              </w:rPr>
+              <w:t xml:space="preserve"> </w:t>
+            </w:r>
+            <w:r>
+              <w:rPr>
+                <w:b/>
+                <w:spacing w:val="-2"/>
+              </w:rPr>
+              <w:t>Names</w:t>
+            </w:r>
+          </w:p>
+        </w:tc>
+      </w:tr>
+      <w:tr>
+        <w:trPr>
+          <w:trHeight w:val="268"/>
+        </w:trPr>
+        <w:tc>
+          <w:tcPr>
+            <w:tcW w:w="4815" w:type="dxa"/>
+          </w:tcPr>
+          <w:p>
+            <w:pPr>
+              <w:pStyle w:val="TableParagraph"/>
+              <w:ind w:left="107"/>
+            </w:pPr>
+          </w:p>
+        </w:tc>
+        <w:tc>
+          <w:tcPr>
+            <w:tcW w:w="4815" w:type="dxa"/>
+          </w:tcPr>
+          <w:p>
+            <w:pPr>
+              <w:pStyle w:val="TableParagraph"/>
+            </w:pPr>
+          </w:p>
+        </w:tc>
+      </w:tr>
+      <w:tr>
+        <w:trPr>
+          <w:trHeight w:val="268"/>
+        </w:trPr>
+        <w:tc>
+          <w:tcPr>
+            <w:tcW w:w="4815" w:type="dxa"/>
+          </w:tcPr>
+          <w:p>
+            <w:pPr>
+              <w:pStyle w:val="TableParagraph"/>
+              <w:ind w:left="107"/>
+            </w:pPr>
+          </w:p>
+        </w:tc>
+        <w:tc>
+          <w:tcPr>
+            <w:tcW w:w="4815" w:type="dxa"/>
+          </w:tcPr>
+          <w:p>
+            <w:pPr>
+              <w:pStyle w:val="TableParagraph"/>
+            </w:pPr>
+          </w:p>
+        </w:tc>
+      </w:tr>
+      <w:tr>
+        <w:trPr>
+          <w:trHeight w:val="269"/>
+        </w:trPr>
+        <w:tc>
+          <w:tcPr>
+            <w:tcW w:w="4815" w:type="dxa"/>
+          </w:tcPr>
+          <w:p>
+            <w:pPr>
+              <w:pStyle w:val="TableParagraph"/>
+              <w:spacing w:line="249" w:lineRule="exact"/>
+              <w:ind w:left="107"/>
+            </w:pPr>
+          </w:p>
+        </w:tc>
+        <w:tc>
+          <w:tcPr>
+            <w:tcW w:w="4815" w:type="dxa"/>
+          </w:tcPr>
+          <w:p>
+            <w:pPr>
+              <w:pStyle w:val="TableParagraph"/>
+              <w:spacing w:line="249" w:lineRule="exact"/>
+            </w:pPr>
+          </w:p>
+        </w:tc>
+      </w:tr>
+      <w:tr>
+        <w:trPr>
+          <w:trHeight w:val="269"/>
+        </w:trPr>
+        <w:tc>
+          <w:tcPr>
+            <w:tcW w:w="4815" w:type="dxa"/>
+          </w:tcPr>
+          <w:p>
+            <w:pPr>
+              <w:pStyle w:val="TableParagraph"/>
+              <w:spacing w:line="249" w:lineRule="exact"/>
+              <w:ind w:left="107"/>
+              <w:rPr>
+                <w:spacing w:val="-2"/>
+              </w:rPr>
+            </w:pPr>
+          </w:p>
+        </w:tc>
+        <w:tc>
+          <w:tcPr>
+            <w:tcW w:w="4815" w:type="dxa"/>
+          </w:tcPr>
+          <w:p>
+            <w:pPr>
+              <w:pStyle w:val="TableParagraph"/>
+              <w:spacing w:line="249" w:lineRule="exact"/>
+              <w:rPr>
+                <w:spacing w:val="-2"/>
+              </w:rPr>
+            </w:pPr>
+          </w:p>
+        </w:tc>
+      </w:tr>
+      <w:tr>
+        <w:trPr>
+          <w:trHeight w:val="269"/>
+        </w:trPr>
+        <w:tc>
+          <w:tcPr>
+            <w:tcW w:w="4815" w:type="dxa"/>
+          </w:tcPr>
+          <w:p>
+            <w:pPr>
+              <w:pStyle w:val="TableParagraph"/>
+              <w:spacing w:line="249" w:lineRule="exact"/>
+              <w:ind w:left="107"/>
+              <w:rPr>
+                <w:spacing w:val="-2"/>
+              </w:rPr>
+            </w:pPr>
+          </w:p>
+        </w:tc>
+        <w:tc>
+          <w:tcPr>
+            <w:tcW w:w="4815" w:type="dxa"/>
+          </w:tcPr>
+          <w:p>
+            <w:pPr>
+              <w:pStyle w:val="TableParagraph"/>
+              <w:spacing w:line="249" w:lineRule="exact"/>
+              <w:rPr>
+                <w:spacing w:val="-2"/>
+              </w:rPr>
+            </w:pPr>
+          </w:p>
+        </w:tc>
+      </w:tr>
+    </w:tbl>
+    <w:p>
+      <w:pPr>
+        <w:pStyle w:val="BodyText"/>
+        <w:spacing w:before="1"/>
+        <w:rPr>
+          <w:b/>
+        </w:rPr>
+      </w:pPr>
+    </w:p>
+    <w:p>
+      <w:pPr>
+        <w:pStyle w:val="BodyText"/>
+        <w:ind w:left="142" w:right="247"/>
+      </w:pPr>
+      <w:r>
+        <w:rPr>
+          <w:b/>
+          <w:color w:val="1F3863"/>
+        </w:rPr>
+        <w:t>Collaboration:</w:t>
+      </w:r>
+      <w:r>
+        <w:rPr>
+          <w:b/>
+          <w:color w:val="1F3863"/>
+          <w:spacing w:val="-2"/>
+        </w:rPr>
+        <w:t xml:space="preserve"> </w:t>
+      </w:r>
+    </w:p>
+    <w:p>
+      <w:pPr>
+        <w:pStyle w:val="BodyText"/>
+      </w:pPr>
+    </w:p>
+    <w:p>
+      <w:pPr>
+        <w:pStyle w:val="BodyText"/>
+        <w:ind w:left="142"/>
+      </w:pPr>
+      <w:r>
+        <w:rPr>
+          <w:b/>
+          <w:color w:val="1F3863"/>
+        </w:rPr>
+        <w:t>Variation:</w:t>
+      </w:r>
+      <w:r>
+        <w:rPr>
+          <w:b/>
+          <w:color w:val="1F3863"/>
+          <w:spacing w:val="-3"/>
+        </w:rPr>
+        <w:t xml:space="preserve"> </w:t>
+      </w:r>
+    </w:p>
+    <w:p>
+      <w:pPr>
+        <w:pStyle w:val="BodyText"/>
+      </w:pPr>
+    </w:p>
+    <w:p>
+      <w:pPr>
+        <w:pStyle w:val="BodyText"/>
+        <w:spacing w:before="1"/>
+        <w:ind w:left="142"/>
+        <w:sectPr>
+          <w:type w:val="continuous"/>
+          <w:pgSz w:w="11910" w:h="16840"/>
+          <w:pgMar w:top="1100" w:right="992" w:bottom="280" w:left="992" w:header="720" w:footer="720" w:gutter="0"/>
+          <w:cols w:space="720"/>
+        </w:sectPr>
+      </w:pPr>
+      <w:r>
+        <w:rPr>
+          <w:b/>
+          <w:color w:val="1F3863"/>
+        </w:rPr>
+        <w:t>Why</w:t>
+      </w:r>
+      <w:r>
+        <w:rPr>
+          <w:b/>
+          <w:color w:val="1F3863"/>
+          <w:spacing w:val="-3"/>
+        </w:rPr>
+        <w:t xml:space="preserve"> </w:t>
+      </w:r>
+      <w:r>
+        <w:rPr>
+          <w:b/>
+          <w:color w:val="1F3863"/>
+        </w:rPr>
+        <w:t>is</w:t>
+      </w:r>
+      <w:r>
+        <w:rPr>
+          <w:b/>
+          <w:color w:val="1F3863"/>
+          <w:spacing w:val="-3"/>
+        </w:rPr>
+        <w:t xml:space="preserve"> </w:t>
+      </w:r>
+      <w:r>
+        <w:rPr>
+          <w:b/>
+          <w:color w:val="1F3863"/>
+        </w:rPr>
+        <w:t>it</w:t>
+      </w:r>
+      <w:r>
+        <w:rPr>
+          <w:b/>
+          <w:color w:val="1F3863"/>
+          <w:spacing w:val="-3"/>
+        </w:rPr>
+        <w:t xml:space="preserve"> </w:t>
+      </w:r>
+      <w:r>
+        <w:rPr>
+          <w:b/>
+          <w:color w:val="1F3863"/>
+        </w:rPr>
+        <w:t>appropriate:</w:t>
+      </w:r>
+      <w:r>
+        <w:rPr>
+          <w:b/>
+          <w:color w:val="1F3863"/>
+          <w:spacing w:val="-2"/>
+        </w:rPr>
+        <w:t xml:space="preserve"> </w:t>
+      </w:r>
+    </w:p>
+    <w:p>
+      <w:pPr>
+        <w:pStyle w:val="BodyText"/>
+        <w:spacing w:before="1"/>
+        <w:ind w:left="142"/>
+      </w:pPr>
+    </w:p>
+    <w:p>
+      <w:pPr>
+        <w:pStyle w:val="BodyText"/>
+        <w:spacing w:before="1"/>
+        <w:ind w:left="142"/>
+      </w:pPr>
+    </w:p>
+    <w:p>
+      <w:pPr>
+        <w:pStyle w:val="Heading3"/>
+        <w:numPr>
+          <w:ilvl w:val="0"/>
+          <w:numId w:val="2"/>
+        </w:numPr>
+        <w:tabs>
+          <w:tab w:val="left" w:pos="561"/>
+        </w:tabs>
+        <w:spacing w:before="268" w:line="342" w:lineRule="exact"/>
+        <w:ind w:left="561" w:hanging="419"/>
+      </w:pPr>
+      <w:r>
+        <w:rPr>
+          <w:color w:val="1F3863"/>
+          <w:spacing w:val="-2"/>
+        </w:rPr>
+        <w:t>Facade</w:t>
+      </w:r>
+    </w:p>
+    <w:p>
+      <w:pPr>
+        <w:pStyle w:val="BodyText"/>
+        <w:ind w:left="142" w:right="251"/>
+      </w:pPr>
+      <w:r>
+        <w:rPr>
+          <w:b/>
+          <w:color w:val="1F3863"/>
+        </w:rPr>
+        <w:t>Problem:</w:t>
+      </w:r>
+      <w:r>
+        <w:rPr>
+          <w:b/>
+          <w:color w:val="1F3863"/>
+          <w:spacing w:val="-3"/>
+        </w:rPr>
+        <w:t xml:space="preserve"> </w:t>
+      </w:r>
+      <w:r>
+        <w:t>To place an order, the outside world would otherwise have to deal with the designer and builder, the engine, the rollback and command history, the assignment service and the audit log. This leaks the system’s structure to every user of TIVIDY and makes it easy to call things in the wrong order.</w:t>
+      </w:r>
+    </w:p>
+    <w:p>
+      <w:pPr>
+        <w:pStyle w:val="BodyText"/>
+        <w:spacing w:before="1"/>
+      </w:pPr>
+    </w:p>
+    <w:p>
+      <w:pPr>
+        <w:pStyle w:val="Heading4"/>
+      </w:pPr>
+      <w:r>
+        <w:rPr>
+          <w:color w:val="1F3863"/>
+          <w:spacing w:val="-2"/>
+        </w:rPr>
+        <w:t>Participants:</w:t>
+      </w:r>
+    </w:p>
+    <w:tbl>
+      <w:tblPr>
+        <w:tblW w:w="0" w:type="auto"/>
+        <w:tblInd w:w="151" w:type="dxa"/>
+        <w:tblBorders>
+          <w:top w:val="single" w:sz="4" w:space="0" w:color="000000"/>
+          <w:left w:val="single" w:sz="4" w:space="0" w:color="000000"/>
+          <w:bottom w:val="single" w:sz="4" w:space="0" w:color="000000"/>
+          <w:right w:val="single" w:sz="4" w:space="0" w:color="000000"/>
+          <w:insideH w:val="single" w:sz="4" w:space="0" w:color="000000"/>
+          <w:insideV w:val="single" w:sz="4" w:space="0" w:color="000000"/>
+        </w:tblBorders>
+        <w:tblLayout w:type="fixed"/>
+        <w:tblCellMar>
+          <w:left w:w="0" w:type="dxa"/>
+          <w:right w:w="0" w:type="dxa"/>
+        </w:tblCellMar>
+        <w:tblLook w:val="01E0" w:firstRow="1" w:lastRow="1" w:firstColumn="1" w:lastColumn="1" w:noHBand="0" w:noVBand="0"/>
+      </w:tblPr>
+      <w:tblGrid>
+        <w:gridCol w:w="4815"/>
+        <w:gridCol w:w="4815"/>
+      </w:tblGrid>
+      <w:tr>
+        <w:trPr>
+          <w:trHeight w:val="268"/>
+        </w:trPr>
+        <w:tc>
+          <w:tcPr>
+            <w:tcW w:w="4815" w:type="dxa"/>
+          </w:tcPr>
+          <w:p>
+            <w:pPr>
+              <w:pStyle w:val="TableParagraph"/>
+              <w:ind w:left="107"/>
+              <w:rPr>
+                <w:b/>
+              </w:rPr>
+            </w:pPr>
+            <w:proofErr w:type="spellStart"/>
+            <w:r>
+              <w:rPr>
+                <w:b/>
+              </w:rPr>
+              <w:t>GoF</w:t>
+            </w:r>
+            <w:proofErr w:type="spellEnd"/>
+            <w:r>
+              <w:rPr>
+                <w:b/>
+                <w:spacing w:val="-4"/>
+              </w:rPr>
+              <w:t xml:space="preserve"> </w:t>
+            </w:r>
+            <w:r>
+              <w:rPr>
+                <w:b/>
+                <w:spacing w:val="-2"/>
+              </w:rPr>
+              <w:t>Participants</w:t>
+            </w:r>
+          </w:p>
+        </w:tc>
+        <w:tc>
+          <w:tcPr>
+            <w:tcW w:w="4815" w:type="dxa"/>
+          </w:tcPr>
+          <w:p>
+            <w:pPr>
+              <w:pStyle w:val="TableParagraph"/>
+              <w:rPr>
+                <w:b/>
+              </w:rPr>
+            </w:pPr>
+            <w:r>
+              <w:rPr>
+                <w:b/>
+              </w:rPr>
+              <w:t>Class</w:t>
+            </w:r>
+            <w:r>
+              <w:rPr>
+                <w:b/>
+                <w:spacing w:val="-6"/>
+              </w:rPr>
+              <w:t xml:space="preserve"> </w:t>
+            </w:r>
+            <w:r>
+              <w:rPr>
+                <w:b/>
+                <w:spacing w:val="-2"/>
+              </w:rPr>
+              <w:t>Names</w:t>
+            </w:r>
+          </w:p>
+        </w:tc>
+      </w:tr>
+      <w:tr>
+        <w:trPr>
+          <w:trHeight w:val="268"/>
+        </w:trPr>
+        <w:tc>
+          <w:tcPr>
+            <w:tcW w:w="4815" w:type="dxa"/>
+          </w:tcPr>
+          <w:p>
+            <w:pPr>
+              <w:pStyle w:val="TableParagraph"/>
+              <w:ind w:left="107"/>
+            </w:pPr>
+            <w:r>
+              <w:rPr>
+                <w:spacing w:val="-2"/>
+              </w:rPr>
+              <w:t>Facade</w:t>
+            </w:r>
+          </w:p>
+        </w:tc>
+        <w:tc>
+          <w:tcPr>
+            <w:tcW w:w="4815" w:type="dxa"/>
+          </w:tcPr>
+          <w:p>
+            <w:pPr>
+              <w:pStyle w:val="TableParagraph"/>
+            </w:pPr>
+            <w:proofErr w:type="spellStart"/>
+            <w:r>
+              <w:rPr>
+                <w:spacing w:val="-2"/>
+              </w:rPr>
+              <w:t>TividyFacade</w:t>
+            </w:r>
+            <w:proofErr w:type="spellEnd"/>
+          </w:p>
+        </w:tc>
+      </w:tr>
+      <w:tr>
+        <w:trPr>
+          <w:trHeight w:val="268"/>
+        </w:trPr>
+        <w:tc>
+          <w:tcPr>
+            <w:tcW w:w="4815" w:type="dxa"/>
+          </w:tcPr>
+          <w:p>
+            <w:pPr>
+              <w:pStyle w:val="TableParagraph"/>
+              <w:ind w:left="107"/>
+            </w:pPr>
+            <w:r>
+              <w:rPr>
+                <w:spacing w:val="-2"/>
+              </w:rPr>
+              <w:t>Subsystem classes</w:t>
+            </w:r>
+          </w:p>
+        </w:tc>
+        <w:tc>
+          <w:tcPr>
+            <w:tcW w:w="4815" w:type="dxa"/>
+          </w:tcPr>
+          <w:p>
+            <w:pPr>
+              <w:pStyle w:val="TableParagraph"/>
+            </w:pPr>
+          </w:p>
+        </w:tc>
+      </w:tr>
+    </w:tbl>
+    <w:p>
+      <w:pPr>
+        <w:pStyle w:val="BodyText"/>
+        <w:spacing w:before="1"/>
+        <w:rPr>
+          <w:b/>
+        </w:rPr>
+      </w:pPr>
+    </w:p>
+    <w:p>
+      <w:pPr>
+        <w:pStyle w:val="BodyText"/>
+        <w:ind w:left="142" w:right="247"/>
+      </w:pPr>
+      <w:r>
+        <w:rPr>
+          <w:b/>
+          <w:color w:val="1F3863"/>
+        </w:rPr>
+        <w:t>Collaboration:</w:t>
+      </w:r>
+      <w:r>
+        <w:rPr>
+          <w:b/>
+          <w:color w:val="1F3863"/>
+          <w:spacing w:val="-2"/>
+        </w:rPr>
+        <w:t xml:space="preserve"> </w:t>
+      </w:r>
+      <w:r>
+        <w:t>T</w:t>
+      </w:r>
+      <w:r>
+        <w:t xml:space="preserve">he client talks only to </w:t>
+      </w:r>
       <w:proofErr w:type="gramStart"/>
       <w:r>
-        <w:t>The</w:t>
-      </w:r>
-      <w:r>
-        <w:rPr>
-          <w:spacing w:val="-2"/>
-        </w:rPr>
-        <w:t xml:space="preserve"> </w:t>
-      </w:r>
-      <w:r>
-        <w:t>Memento</w:t>
-      </w:r>
+        <w:t xml:space="preserve">the </w:t>
+      </w:r>
+      <w:proofErr w:type="spellStart"/>
+      <w:r>
+        <w:t>TividyFacade</w:t>
+      </w:r>
+      <w:proofErr w:type="spellEnd"/>
       <w:proofErr w:type="gramEnd"/>
       <w:r>
-        <w:rPr>
-          <w:spacing w:val="-3"/>
-        </w:rPr>
-        <w:t xml:space="preserve"> </w:t>
-      </w:r>
-      <w:r>
+        <w:t>. When it asks to place an order, the facade gets a definition from the designer, has the engine start an instance from it, and sets up the listeners. When the client asks to cancel or change an order, the facade passes the request to the command invoker. The subsystem classes do the work and do not know the facade exists.</w:t>
+      </w:r>
+    </w:p>
+    <w:p>
+      <w:pPr>
+        <w:pStyle w:val="BodyText"/>
+      </w:pPr>
+    </w:p>
+    <w:p>
+      <w:pPr>
+        <w:pStyle w:val="BodyText"/>
+        <w:ind w:left="142"/>
+      </w:pPr>
+      <w:r>
+        <w:rPr>
+          <w:b/>
+          <w:color w:val="1F3863"/>
+        </w:rPr>
+        <w:t>Variation:</w:t>
+      </w:r>
+      <w:r>
+        <w:rPr>
+          <w:b/>
+          <w:color w:val="1F3863"/>
+          <w:spacing w:val="-3"/>
+        </w:rPr>
+        <w:t xml:space="preserve"> </w:t>
+      </w:r>
+      <w:r>
+        <w:t>The set of simple operations that clients need (place an order, cancel, track, report) can change and grow without changing the subsystem classes behind them.</w:t>
+      </w:r>
+    </w:p>
+    <w:p>
+      <w:pPr>
+        <w:pStyle w:val="BodyText"/>
+      </w:pPr>
+    </w:p>
+    <w:p>
+      <w:pPr>
+        <w:pStyle w:val="BodyText"/>
+        <w:spacing w:before="1"/>
+        <w:ind w:left="142"/>
+        <w:sectPr>
+          <w:type w:val="continuous"/>
+          <w:pgSz w:w="11910" w:h="16840"/>
+          <w:pgMar w:top="1100" w:right="992" w:bottom="280" w:left="992" w:header="720" w:footer="720" w:gutter="0"/>
+          <w:cols w:space="720"/>
+        </w:sectPr>
+      </w:pPr>
+      <w:r>
+        <w:rPr>
+          <w:b/>
+          <w:color w:val="1F3863"/>
+        </w:rPr>
+        <w:t>Why</w:t>
+      </w:r>
+      <w:r>
+        <w:rPr>
+          <w:b/>
+          <w:color w:val="1F3863"/>
+          <w:spacing w:val="-3"/>
+        </w:rPr>
+        <w:t xml:space="preserve"> </w:t>
+      </w:r>
+      <w:r>
+        <w:rPr>
+          <w:b/>
+          <w:color w:val="1F3863"/>
+        </w:rPr>
         <w:t>is</w:t>
       </w:r>
       <w:r>
         <w:rPr>
-          <w:spacing w:val="-2"/>
-        </w:rPr>
-        <w:t xml:space="preserve"> </w:t>
-      </w:r>
-      <w:r>
-        <w:t>the</w:t>
-      </w:r>
-      <w:r>
-        <w:rPr>
-          <w:spacing w:val="-2"/>
-        </w:rPr>
-        <w:t xml:space="preserve"> </w:t>
-      </w:r>
-      <w:proofErr w:type="gramStart"/>
-      <w:r>
-        <w:t>undo</w:t>
-      </w:r>
-      <w:proofErr w:type="gramEnd"/>
-      <w:r>
-        <w:rPr>
-          <w:spacing w:val="-3"/>
-        </w:rPr>
-        <w:t xml:space="preserve"> </w:t>
-      </w:r>
-      <w:r>
-        <w:t>and</w:t>
-      </w:r>
-      <w:r>
-        <w:rPr>
-          <w:spacing w:val="-2"/>
-        </w:rPr>
-        <w:t xml:space="preserve"> </w:t>
-      </w:r>
-      <w:r>
-        <w:t>rollback</w:t>
-      </w:r>
-      <w:r>
-        <w:rPr>
-          <w:spacing w:val="-3"/>
-        </w:rPr>
-        <w:t xml:space="preserve"> </w:t>
-      </w:r>
-      <w:r>
-        <w:t>side</w:t>
-      </w:r>
-      <w:r>
-        <w:rPr>
-          <w:spacing w:val="-2"/>
-        </w:rPr>
-        <w:t xml:space="preserve"> </w:t>
-      </w:r>
-      <w:r>
-        <w:t>of</w:t>
-      </w:r>
-      <w:r>
-        <w:rPr>
-          <w:spacing w:val="-3"/>
-        </w:rPr>
-        <w:t xml:space="preserve"> </w:t>
-      </w:r>
-      <w:r>
-        <w:t>the</w:t>
-      </w:r>
-      <w:r>
-        <w:rPr>
-          <w:spacing w:val="-2"/>
-        </w:rPr>
-        <w:t xml:space="preserve"> </w:t>
-      </w:r>
-      <w:r>
-        <w:t>system.</w:t>
-      </w:r>
-      <w:r>
-        <w:rPr>
-          <w:spacing w:val="-3"/>
-        </w:rPr>
-        <w:t xml:space="preserve"> </w:t>
-      </w:r>
-      <w:r>
-        <w:t>Restoring</w:t>
-      </w:r>
-      <w:r>
-        <w:rPr>
-          <w:spacing w:val="-3"/>
-        </w:rPr>
-        <w:t xml:space="preserve"> </w:t>
-      </w:r>
-      <w:r>
-        <w:t>from</w:t>
-      </w:r>
-      <w:r>
-        <w:rPr>
-          <w:spacing w:val="-3"/>
-        </w:rPr>
-        <w:t xml:space="preserve"> </w:t>
-      </w:r>
-      <w:r>
-        <w:t>a</w:t>
-      </w:r>
-      <w:r>
-        <w:rPr>
-          <w:spacing w:val="-3"/>
-        </w:rPr>
-        <w:t xml:space="preserve"> </w:t>
-      </w:r>
-      <w:r>
-        <w:t>snapshot returns the order to a known-good point while the history only grows, so the record stays a</w:t>
-      </w:r>
+          <w:b/>
+          <w:color w:val="1F3863"/>
+          <w:spacing w:val="-3"/>
+        </w:rPr>
+        <w:t xml:space="preserve"> </w:t>
+      </w:r>
+      <w:r>
+        <w:rPr>
+          <w:b/>
+          <w:color w:val="1F3863"/>
+        </w:rPr>
+        <w:t>it</w:t>
+      </w:r>
+      <w:r>
+        <w:rPr>
+          <w:b/>
+          <w:color w:val="1F3863"/>
+          <w:spacing w:val="-3"/>
+        </w:rPr>
+        <w:t xml:space="preserve"> </w:t>
+      </w:r>
+      <w:r>
+        <w:rPr>
+          <w:b/>
+          <w:color w:val="1F3863"/>
+        </w:rPr>
+        <w:t>appropriate:</w:t>
+      </w:r>
+      <w:r>
+        <w:rPr>
+          <w:b/>
+          <w:color w:val="1F3863"/>
+          <w:spacing w:val="-2"/>
+        </w:rPr>
+        <w:t xml:space="preserve"> </w:t>
+      </w:r>
+      <w:r>
+        <w:t xml:space="preserve">Facade is the entry point of the system. It hides the many cooperating subsystems behind a few operations, so the rest of the application can use TIVIDY without knowing its structure, and the </w:t>
+      </w:r>
+      <w:r>
+        <w:lastRenderedPageBreak/>
+        <w:t xml:space="preserve">subsystems can be </w:t>
+      </w:r>
+      <w:proofErr w:type="spellStart"/>
+      <w:r>
+        <w:t>reorganised</w:t>
+      </w:r>
+      <w:proofErr w:type="spellEnd"/>
+      <w:r>
+        <w:t xml:space="preserve"> without affecting users.</w:t>
+      </w:r>
+    </w:p>
+    <w:p>
+      <w:pPr>
+        <w:pStyle w:val="BodyText"/>
+        <w:spacing w:before="1"/>
+        <w:ind w:left="142"/>
+        <w:sectPr>
+          <w:type w:val="continuous"/>
+          <w:pgSz w:w="11910" w:h="16840"/>
+          <w:pgMar w:top="1100" w:right="992" w:bottom="280" w:left="992" w:header="720" w:footer="720" w:gutter="0"/>
+          <w:cols w:space="720"/>
+        </w:sectPr>
+      </w:pPr>
     </w:p>
     <w:p>
       <w:pPr>
@@ -18924,7 +20568,15 @@
         <w:t>decided</w:t>
       </w:r>
       <w:r>
-        <w:t xml:space="preserve"> as a group we will then make the relevant updates to the required diagrams/sections.</w:t>
+        <w:t xml:space="preserve"> as a </w:t>
+      </w:r>
+      <w:proofErr w:type="gramStart"/>
+      <w:r>
+        <w:t>group</w:t>
+      </w:r>
+      <w:proofErr w:type="gramEnd"/>
+      <w:r>
+        <w:t xml:space="preserve"> we will then make the relevant updates to the required diagrams/sections.</w:t>
       </w:r>
     </w:p>
     <w:p>
@@ -19775,7 +21427,6 @@
         </w:rPr>
         <w:t xml:space="preserve"> </w:t>
       </w:r>
-      <w:proofErr w:type="spellStart"/>
       <w:r>
         <w:rPr>
           <w:spacing w:val="-2"/>
@@ -19783,7 +21434,6 @@
         </w:rPr>
         <w:t>Ngeletshedzo</w:t>
       </w:r>
-      <w:proofErr w:type="spellEnd"/>
     </w:p>
     <w:p>
       <w:pPr>
@@ -21817,6 +23467,7 @@
   <w:style w:type="paragraph" w:styleId="Heading3">
     <w:name w:val="heading 3"/>
     <w:basedOn w:val="Normal"/>
+    <w:link w:val="Heading3Char"/>
     <w:uiPriority w:val="9"/>
     <w:unhideWhenUsed/>
     <w:qFormat/>
@@ -21834,6 +23485,7 @@
   <w:style w:type="paragraph" w:styleId="Heading4">
     <w:name w:val="heading 4"/>
     <w:basedOn w:val="Normal"/>
+    <w:link w:val="Heading4Char"/>
     <w:uiPriority w:val="9"/>
     <w:unhideWhenUsed/>
     <w:qFormat/>
@@ -21876,6 +23528,7 @@
   <w:style w:type="paragraph" w:styleId="BodyText">
     <w:name w:val="Body Text"/>
     <w:basedOn w:val="Normal"/>
+    <w:link w:val="BodyTextChar"/>
     <w:uiPriority w:val="1"/>
     <w:qFormat/>
   </w:style>
@@ -21910,6 +23563,42 @@
       <w:bCs/>
       <w:sz w:val="30"/>
       <w:szCs w:val="30"/>
+    </w:rPr>
+  </w:style>
+  <w:style w:type="character" w:customStyle="1" w:styleId="Heading3Char">
+    <w:name w:val="Heading 3 Char"/>
+    <w:basedOn w:val="DefaultParagraphFont"/>
+    <w:link w:val="Heading3"/>
+    <w:uiPriority w:val="9"/>
+    <w:rsid w:val="00190679"/>
+    <w:rPr>
+      <w:rFonts w:ascii="Calibri" w:eastAsia="Calibri" w:hAnsi="Calibri" w:cs="Calibri"/>
+      <w:b/>
+      <w:bCs/>
+      <w:sz w:val="28"/>
+      <w:szCs w:val="28"/>
+    </w:rPr>
+  </w:style>
+  <w:style w:type="character" w:customStyle="1" w:styleId="Heading4Char">
+    <w:name w:val="Heading 4 Char"/>
+    <w:basedOn w:val="DefaultParagraphFont"/>
+    <w:link w:val="Heading4"/>
+    <w:uiPriority w:val="9"/>
+    <w:rsid w:val="00190679"/>
+    <w:rPr>
+      <w:rFonts w:ascii="Calibri" w:eastAsia="Calibri" w:hAnsi="Calibri" w:cs="Calibri"/>
+      <w:b/>
+      <w:bCs/>
+    </w:rPr>
+  </w:style>
+  <w:style w:type="character" w:customStyle="1" w:styleId="BodyTextChar">
+    <w:name w:val="Body Text Char"/>
+    <w:basedOn w:val="DefaultParagraphFont"/>
+    <w:link w:val="BodyText"/>
+    <w:uiPriority w:val="1"/>
+    <w:rsid w:val="00190679"/>
+    <w:rPr>
+      <w:rFonts w:ascii="Calibri" w:eastAsia="Calibri" w:hAnsi="Calibri" w:cs="Calibri"/>
     </w:rPr>
   </w:style>
 </w:styles>

</xml_diff>

<commit_message>
Add State pattern: State.h and tests
</commit_message>
<xml_diff>
--- a/docs/Prac6-COS 214.docx
+++ b/docs/Prac6-COS 214.docx
@@ -168,12 +168,14 @@
       </w:pPr>
       <w:bookmarkStart w:id="2" w:name="_Ngeletshedzo_Mutwanamba_(Team_Leader)_"/>
       <w:bookmarkEnd w:id="2"/>
+      <w:proofErr w:type="spellStart"/>
       <w:r>
         <w:rPr>
           <w:sz w:val="24"/>
         </w:rPr>
         <w:t>Ngeletshedzo</w:t>
       </w:r>
+      <w:proofErr w:type="spellEnd"/>
       <w:r>
         <w:rPr>
           <w:spacing w:val="-2"/>
@@ -181,12 +183,14 @@
         </w:rPr>
         <w:t xml:space="preserve"> </w:t>
       </w:r>
+      <w:proofErr w:type="spellStart"/>
       <w:r>
         <w:rPr>
           <w:sz w:val="24"/>
         </w:rPr>
         <w:t>Mutwanamba</w:t>
       </w:r>
+      <w:proofErr w:type="spellEnd"/>
       <w:r>
         <w:rPr>
           <w:spacing w:val="-2"/>
@@ -1787,7 +1791,15 @@
         <w:t xml:space="preserve"> </w:t>
       </w:r>
       <w:r>
-        <w:t>support different ones, so it makes sense to keep routing flexible and not hard-code it (van der Aalst, et al., 2003).</w:t>
+        <w:t xml:space="preserve">support different ones, so it makes sense to keep routing flexible and not </w:t>
+      </w:r>
+      <w:proofErr w:type="gramStart"/>
+      <w:r>
+        <w:t>hard-code</w:t>
+      </w:r>
+      <w:proofErr w:type="gramEnd"/>
+      <w:r>
+        <w:t xml:space="preserve"> it (van der Aalst, et al., 2003).</w:t>
       </w:r>
     </w:p>
     <w:p>
@@ -5429,15 +5441,7 @@
         <w:t xml:space="preserve"> </w:t>
       </w:r>
       <w:r>
-        <w:t xml:space="preserve">to Supervisor to Manager until </w:t>
-      </w:r>
-      <w:proofErr w:type="gramStart"/>
-      <w:r>
-        <w:t>its</w:t>
-      </w:r>
-      <w:proofErr w:type="gramEnd"/>
-      <w:r>
-        <w:t xml:space="preserve"> solved (</w:t>
+        <w:t>to Supervisor to Manager until its solved (</w:t>
       </w:r>
       <w:r>
         <w:rPr>
@@ -7066,15 +7070,7 @@
         <w:t xml:space="preserve"> </w:t>
       </w:r>
       <w:r>
-        <w:t xml:space="preserve">records each step into the definition under construction. Once the designer finishes, the builder checks that the definition is complete and hands back a </w:t>
-      </w:r>
-      <w:proofErr w:type="gramStart"/>
-      <w:r>
-        <w:t>versioned</w:t>
-      </w:r>
-      <w:proofErr w:type="gramEnd"/>
-      <w:r>
-        <w:t xml:space="preserve"> </w:t>
+        <w:t xml:space="preserve">records each step into the definition under construction. Once the designer finishes, the builder checks that the definition is complete and hands back a versioned </w:t>
       </w:r>
       <w:proofErr w:type="spellStart"/>
       <w:r>
@@ -7572,6 +7568,7 @@
         </w:rPr>
         <w:t xml:space="preserve"> </w:t>
       </w:r>
+      <w:proofErr w:type="gramStart"/>
       <w:r>
         <w:t>order</w:t>
       </w:r>
@@ -7581,7 +7578,6 @@
         </w:rPr>
         <w:t xml:space="preserve"> </w:t>
       </w:r>
-      <w:proofErr w:type="gramStart"/>
       <w:r>
         <w:t>is</w:t>
       </w:r>
@@ -8339,11 +8335,9 @@
         </w:rPr>
         <w:t xml:space="preserve"> </w:t>
       </w:r>
-      <w:proofErr w:type="gramStart"/>
       <w:r>
         <w:t>differ</w:t>
       </w:r>
-      <w:proofErr w:type="gramEnd"/>
       <w:r>
         <w:rPr>
           <w:spacing w:val="-4"/>
@@ -10395,7 +10389,15 @@
       </w:r>
       <w:proofErr w:type="spellEnd"/>
       <w:r>
-        <w:t xml:space="preserve">, or refuses it, such as </w:t>
+        <w:t xml:space="preserve">, or </w:t>
+      </w:r>
+      <w:proofErr w:type="gramStart"/>
+      <w:r>
+        <w:t>refuses</w:t>
+      </w:r>
+      <w:proofErr w:type="gramEnd"/>
+      <w:r>
+        <w:t xml:space="preserve"> it, such as </w:t>
       </w:r>
       <w:proofErr w:type="spellStart"/>
       <w:r>
@@ -17189,513 +17191,6 @@
         <w:pStyle w:val="BodyText"/>
         <w:spacing w:before="1"/>
         <w:ind w:left="142"/>
-      </w:pPr>
-      <w:r>
-        <w:rPr>
-          <w:b/>
-          <w:color w:val="1F3863"/>
-        </w:rPr>
-        <w:t>Why</w:t>
-      </w:r>
-      <w:r>
-        <w:rPr>
-          <w:b/>
-          <w:color w:val="1F3863"/>
-          <w:spacing w:val="-3"/>
-        </w:rPr>
-        <w:t xml:space="preserve"> </w:t>
-      </w:r>
-      <w:r>
-        <w:rPr>
-          <w:b/>
-          <w:color w:val="1F3863"/>
-        </w:rPr>
-        <w:t>is</w:t>
-      </w:r>
-      <w:r>
-        <w:rPr>
-          <w:b/>
-          <w:color w:val="1F3863"/>
-          <w:spacing w:val="-3"/>
-        </w:rPr>
-        <w:t xml:space="preserve"> </w:t>
-      </w:r>
-      <w:r>
-        <w:rPr>
-          <w:b/>
-          <w:color w:val="1F3863"/>
-        </w:rPr>
-        <w:t>it</w:t>
-      </w:r>
-      <w:r>
-        <w:rPr>
-          <w:b/>
-          <w:color w:val="1F3863"/>
-          <w:spacing w:val="-3"/>
-        </w:rPr>
-        <w:t xml:space="preserve"> </w:t>
-      </w:r>
-      <w:r>
-        <w:rPr>
-          <w:b/>
-          <w:color w:val="1F3863"/>
-        </w:rPr>
-        <w:t>appropriate:</w:t>
-      </w:r>
-      <w:r>
-        <w:rPr>
-          <w:b/>
-          <w:color w:val="1F3863"/>
-          <w:spacing w:val="-2"/>
-        </w:rPr>
-        <w:t xml:space="preserve"> </w:t>
-      </w:r>
-      <w:proofErr w:type="gramStart"/>
-      <w:r>
-        <w:t>The</w:t>
-      </w:r>
-      <w:r>
-        <w:rPr>
-          <w:spacing w:val="-2"/>
-        </w:rPr>
-        <w:t xml:space="preserve"> </w:t>
-      </w:r>
-      <w:r>
-        <w:t>Memento</w:t>
-      </w:r>
-      <w:proofErr w:type="gramEnd"/>
-      <w:r>
-        <w:rPr>
-          <w:spacing w:val="-3"/>
-        </w:rPr>
-        <w:t xml:space="preserve"> </w:t>
-      </w:r>
-      <w:r>
-        <w:t>is</w:t>
-      </w:r>
-      <w:r>
-        <w:rPr>
-          <w:spacing w:val="-2"/>
-        </w:rPr>
-        <w:t xml:space="preserve"> </w:t>
-      </w:r>
-      <w:r>
-        <w:t>the</w:t>
-      </w:r>
-      <w:r>
-        <w:rPr>
-          <w:spacing w:val="-2"/>
-        </w:rPr>
-        <w:t xml:space="preserve"> </w:t>
-      </w:r>
-      <w:proofErr w:type="gramStart"/>
-      <w:r>
-        <w:t>undo</w:t>
-      </w:r>
-      <w:proofErr w:type="gramEnd"/>
-      <w:r>
-        <w:rPr>
-          <w:spacing w:val="-3"/>
-        </w:rPr>
-        <w:t xml:space="preserve"> </w:t>
-      </w:r>
-      <w:r>
-        <w:t>and</w:t>
-      </w:r>
-      <w:r>
-        <w:rPr>
-          <w:spacing w:val="-2"/>
-        </w:rPr>
-        <w:t xml:space="preserve"> </w:t>
-      </w:r>
-      <w:r>
-        <w:t>rollback</w:t>
-      </w:r>
-      <w:r>
-        <w:rPr>
-          <w:spacing w:val="-3"/>
-        </w:rPr>
-        <w:t xml:space="preserve"> </w:t>
-      </w:r>
-      <w:r>
-        <w:t>side</w:t>
-      </w:r>
-      <w:r>
-        <w:rPr>
-          <w:spacing w:val="-2"/>
-        </w:rPr>
-        <w:t xml:space="preserve"> </w:t>
-      </w:r>
-      <w:r>
-        <w:t>of</w:t>
-      </w:r>
-      <w:r>
-        <w:rPr>
-          <w:spacing w:val="-3"/>
-        </w:rPr>
-        <w:t xml:space="preserve"> </w:t>
-      </w:r>
-      <w:r>
-        <w:t>the</w:t>
-      </w:r>
-      <w:r>
-        <w:rPr>
-          <w:spacing w:val="-2"/>
-        </w:rPr>
-        <w:t xml:space="preserve"> </w:t>
-      </w:r>
-      <w:r>
-        <w:t>system.</w:t>
-      </w:r>
-      <w:r>
-        <w:rPr>
-          <w:spacing w:val="-3"/>
-        </w:rPr>
-        <w:t xml:space="preserve"> </w:t>
-      </w:r>
-      <w:r>
-        <w:t>Restoring</w:t>
-      </w:r>
-      <w:r>
-        <w:rPr>
-          <w:spacing w:val="-3"/>
-        </w:rPr>
-        <w:t xml:space="preserve"> </w:t>
-      </w:r>
-      <w:r>
-        <w:t>from</w:t>
-      </w:r>
-      <w:r>
-        <w:rPr>
-          <w:spacing w:val="-3"/>
-        </w:rPr>
-        <w:t xml:space="preserve"> </w:t>
-      </w:r>
-      <w:r>
-        <w:t>a</w:t>
-      </w:r>
-      <w:r>
-        <w:rPr>
-          <w:spacing w:val="-3"/>
-        </w:rPr>
-        <w:t xml:space="preserve"> </w:t>
-      </w:r>
-      <w:r>
-        <w:t xml:space="preserve">snapshot returns the order to a known-good point while </w:t>
-      </w:r>
-      <w:proofErr w:type="gramStart"/>
-      <w:r>
-        <w:t>the history</w:t>
-      </w:r>
-      <w:proofErr w:type="gramEnd"/>
-      <w:r>
-        <w:t xml:space="preserve"> only grows, so the record stays a</w:t>
-      </w:r>
-    </w:p>
-    <w:p>
-      <w:pPr>
-        <w:pStyle w:val="Heading3"/>
-        <w:numPr>
-          <w:ilvl w:val="0"/>
-          <w:numId w:val="2"/>
-        </w:numPr>
-        <w:tabs>
-          <w:tab w:val="left" w:pos="561"/>
-        </w:tabs>
-        <w:spacing w:before="268" w:line="342" w:lineRule="exact"/>
-        <w:ind w:left="561" w:hanging="419"/>
-      </w:pPr>
-      <w:r>
-        <w:rPr>
-          <w:color w:val="1F3863"/>
-          <w:spacing w:val="-2"/>
-        </w:rPr>
-        <w:t>Pattern 1</w:t>
-      </w:r>
-    </w:p>
-    <w:p>
-      <w:pPr>
-        <w:pStyle w:val="BodyText"/>
-        <w:ind w:left="142" w:right="251"/>
-      </w:pPr>
-      <w:r>
-        <w:rPr>
-          <w:b/>
-          <w:color w:val="1F3863"/>
-        </w:rPr>
-        <w:t>Problem:</w:t>
-      </w:r>
-      <w:r>
-        <w:rPr>
-          <w:b/>
-          <w:color w:val="1F3863"/>
-          <w:spacing w:val="-3"/>
-        </w:rPr>
-        <w:t xml:space="preserve"> </w:t>
-      </w:r>
-    </w:p>
-    <w:p>
-      <w:pPr>
-        <w:pStyle w:val="BodyText"/>
-        <w:spacing w:before="1"/>
-      </w:pPr>
-    </w:p>
-    <w:p>
-      <w:pPr>
-        <w:pStyle w:val="Heading4"/>
-      </w:pPr>
-      <w:r>
-        <w:rPr>
-          <w:color w:val="1F3863"/>
-          <w:spacing w:val="-2"/>
-        </w:rPr>
-        <w:t>Participants:</w:t>
-      </w:r>
-    </w:p>
-    <w:tbl>
-      <w:tblPr>
-        <w:tblW w:w="0" w:type="auto"/>
-        <w:tblInd w:w="151" w:type="dxa"/>
-        <w:tblBorders>
-          <w:top w:val="single" w:sz="4" w:space="0" w:color="000000"/>
-          <w:left w:val="single" w:sz="4" w:space="0" w:color="000000"/>
-          <w:bottom w:val="single" w:sz="4" w:space="0" w:color="000000"/>
-          <w:right w:val="single" w:sz="4" w:space="0" w:color="000000"/>
-          <w:insideH w:val="single" w:sz="4" w:space="0" w:color="000000"/>
-          <w:insideV w:val="single" w:sz="4" w:space="0" w:color="000000"/>
-        </w:tblBorders>
-        <w:tblLayout w:type="fixed"/>
-        <w:tblCellMar>
-          <w:left w:w="0" w:type="dxa"/>
-          <w:right w:w="0" w:type="dxa"/>
-        </w:tblCellMar>
-        <w:tblLook w:val="01E0" w:firstRow="1" w:lastRow="1" w:firstColumn="1" w:lastColumn="1" w:noHBand="0" w:noVBand="0"/>
-      </w:tblPr>
-      <w:tblGrid>
-        <w:gridCol w:w="4815"/>
-        <w:gridCol w:w="4815"/>
-      </w:tblGrid>
-      <w:tr>
-        <w:trPr>
-          <w:trHeight w:val="268"/>
-        </w:trPr>
-        <w:tc>
-          <w:tcPr>
-            <w:tcW w:w="4815" w:type="dxa"/>
-          </w:tcPr>
-          <w:p>
-            <w:pPr>
-              <w:pStyle w:val="TableParagraph"/>
-              <w:ind w:left="107"/>
-              <w:rPr>
-                <w:b/>
-              </w:rPr>
-            </w:pPr>
-            <w:proofErr w:type="spellStart"/>
-            <w:r>
-              <w:rPr>
-                <w:b/>
-              </w:rPr>
-              <w:t>GoF</w:t>
-            </w:r>
-            <w:proofErr w:type="spellEnd"/>
-            <w:r>
-              <w:rPr>
-                <w:b/>
-                <w:spacing w:val="-4"/>
-              </w:rPr>
-              <w:t xml:space="preserve"> </w:t>
-            </w:r>
-            <w:r>
-              <w:rPr>
-                <w:b/>
-                <w:spacing w:val="-2"/>
-              </w:rPr>
-              <w:t>Participants</w:t>
-            </w:r>
-          </w:p>
-        </w:tc>
-        <w:tc>
-          <w:tcPr>
-            <w:tcW w:w="4815" w:type="dxa"/>
-          </w:tcPr>
-          <w:p>
-            <w:pPr>
-              <w:pStyle w:val="TableParagraph"/>
-              <w:rPr>
-                <w:b/>
-              </w:rPr>
-            </w:pPr>
-            <w:r>
-              <w:rPr>
-                <w:b/>
-              </w:rPr>
-              <w:t>Class</w:t>
-            </w:r>
-            <w:r>
-              <w:rPr>
-                <w:b/>
-                <w:spacing w:val="-6"/>
-              </w:rPr>
-              <w:t xml:space="preserve"> </w:t>
-            </w:r>
-            <w:r>
-              <w:rPr>
-                <w:b/>
-                <w:spacing w:val="-2"/>
-              </w:rPr>
-              <w:t>Names</w:t>
-            </w:r>
-          </w:p>
-        </w:tc>
-      </w:tr>
-      <w:tr>
-        <w:trPr>
-          <w:trHeight w:val="268"/>
-        </w:trPr>
-        <w:tc>
-          <w:tcPr>
-            <w:tcW w:w="4815" w:type="dxa"/>
-          </w:tcPr>
-          <w:p>
-            <w:pPr>
-              <w:pStyle w:val="TableParagraph"/>
-              <w:ind w:left="107"/>
-            </w:pPr>
-          </w:p>
-        </w:tc>
-        <w:tc>
-          <w:tcPr>
-            <w:tcW w:w="4815" w:type="dxa"/>
-          </w:tcPr>
-          <w:p>
-            <w:pPr>
-              <w:pStyle w:val="TableParagraph"/>
-            </w:pPr>
-          </w:p>
-        </w:tc>
-      </w:tr>
-      <w:tr>
-        <w:trPr>
-          <w:trHeight w:val="268"/>
-        </w:trPr>
-        <w:tc>
-          <w:tcPr>
-            <w:tcW w:w="4815" w:type="dxa"/>
-          </w:tcPr>
-          <w:p>
-            <w:pPr>
-              <w:pStyle w:val="TableParagraph"/>
-              <w:ind w:left="107"/>
-            </w:pPr>
-          </w:p>
-        </w:tc>
-        <w:tc>
-          <w:tcPr>
-            <w:tcW w:w="4815" w:type="dxa"/>
-          </w:tcPr>
-          <w:p>
-            <w:pPr>
-              <w:pStyle w:val="TableParagraph"/>
-            </w:pPr>
-          </w:p>
-        </w:tc>
-      </w:tr>
-      <w:tr>
-        <w:trPr>
-          <w:trHeight w:val="269"/>
-        </w:trPr>
-        <w:tc>
-          <w:tcPr>
-            <w:tcW w:w="4815" w:type="dxa"/>
-          </w:tcPr>
-          <w:p>
-            <w:pPr>
-              <w:pStyle w:val="TableParagraph"/>
-              <w:spacing w:line="249" w:lineRule="exact"/>
-              <w:ind w:left="107"/>
-            </w:pPr>
-          </w:p>
-        </w:tc>
-        <w:tc>
-          <w:tcPr>
-            <w:tcW w:w="4815" w:type="dxa"/>
-          </w:tcPr>
-          <w:p>
-            <w:pPr>
-              <w:pStyle w:val="TableParagraph"/>
-              <w:spacing w:line="249" w:lineRule="exact"/>
-            </w:pPr>
-          </w:p>
-        </w:tc>
-      </w:tr>
-    </w:tbl>
-    <w:p>
-      <w:pPr>
-        <w:pStyle w:val="BodyText"/>
-        <w:spacing w:before="1"/>
-        <w:rPr>
-          <w:b/>
-        </w:rPr>
-      </w:pPr>
-    </w:p>
-    <w:p>
-      <w:pPr>
-        <w:pStyle w:val="BodyText"/>
-        <w:ind w:left="142" w:right="247"/>
-      </w:pPr>
-      <w:r>
-        <w:rPr>
-          <w:b/>
-          <w:color w:val="1F3863"/>
-        </w:rPr>
-        <w:t>Collaboration:</w:t>
-      </w:r>
-      <w:r>
-        <w:rPr>
-          <w:b/>
-          <w:color w:val="1F3863"/>
-          <w:spacing w:val="-2"/>
-        </w:rPr>
-        <w:t xml:space="preserve"> </w:t>
-      </w:r>
-    </w:p>
-    <w:p>
-      <w:pPr>
-        <w:pStyle w:val="BodyText"/>
-      </w:pPr>
-    </w:p>
-    <w:p>
-      <w:pPr>
-        <w:pStyle w:val="BodyText"/>
-        <w:ind w:left="142"/>
-      </w:pPr>
-      <w:r>
-        <w:rPr>
-          <w:b/>
-          <w:color w:val="1F3863"/>
-        </w:rPr>
-        <w:t>Variation:</w:t>
-      </w:r>
-      <w:r>
-        <w:rPr>
-          <w:b/>
-          <w:color w:val="1F3863"/>
-          <w:spacing w:val="-3"/>
-        </w:rPr>
-        <w:t xml:space="preserve"> </w:t>
-      </w:r>
-    </w:p>
-    <w:p>
-      <w:pPr>
-        <w:pStyle w:val="BodyText"/>
-      </w:pPr>
-    </w:p>
-    <w:p>
-      <w:pPr>
-        <w:pStyle w:val="BodyText"/>
-        <w:spacing w:before="1"/>
-        <w:ind w:left="142"/>
         <w:sectPr>
           <w:type w:val="continuous"/>
           <w:pgSz w:w="11910" w:h="16840"/>
@@ -17763,1278 +17258,139 @@
         </w:rPr>
         <w:t xml:space="preserve"> </w:t>
       </w:r>
-    </w:p>
-    <w:p>
-      <w:pPr>
-        <w:pStyle w:val="BodyText"/>
-        <w:spacing w:before="1"/>
-        <w:ind w:left="142"/>
-      </w:pPr>
-    </w:p>
-    <w:p>
-      <w:pPr>
-        <w:pStyle w:val="BodyText"/>
-        <w:spacing w:before="1"/>
-        <w:ind w:left="142"/>
-      </w:pPr>
-    </w:p>
-    <w:p>
-      <w:pPr>
-        <w:pStyle w:val="Heading3"/>
-        <w:numPr>
-          <w:ilvl w:val="0"/>
-          <w:numId w:val="2"/>
-        </w:numPr>
-        <w:tabs>
-          <w:tab w:val="left" w:pos="561"/>
-        </w:tabs>
-        <w:spacing w:before="268" w:line="342" w:lineRule="exact"/>
-        <w:ind w:left="561" w:hanging="419"/>
-      </w:pPr>
-      <w:r>
-        <w:rPr>
-          <w:color w:val="1F3863"/>
-          <w:spacing w:val="-2"/>
-        </w:rPr>
-        <w:lastRenderedPageBreak/>
-        <w:t>Pattern 2</w:t>
-      </w:r>
-    </w:p>
-    <w:p>
-      <w:pPr>
-        <w:pStyle w:val="BodyText"/>
-        <w:ind w:left="142" w:right="251"/>
-      </w:pPr>
-      <w:r>
-        <w:rPr>
-          <w:b/>
-          <w:color w:val="1F3863"/>
-        </w:rPr>
-        <w:t>Problem:</w:t>
-      </w:r>
-      <w:r>
-        <w:rPr>
-          <w:b/>
-          <w:color w:val="1F3863"/>
-          <w:spacing w:val="-3"/>
-        </w:rPr>
-        <w:t xml:space="preserve"> </w:t>
-      </w:r>
-    </w:p>
-    <w:p>
-      <w:pPr>
-        <w:pStyle w:val="BodyText"/>
-        <w:spacing w:before="1"/>
-      </w:pPr>
-    </w:p>
-    <w:p>
-      <w:pPr>
-        <w:pStyle w:val="Heading4"/>
-      </w:pPr>
-      <w:r>
-        <w:rPr>
-          <w:color w:val="1F3863"/>
-          <w:spacing w:val="-2"/>
-        </w:rPr>
-        <w:t>Participants:</w:t>
-      </w:r>
-    </w:p>
-    <w:tbl>
-      <w:tblPr>
-        <w:tblW w:w="0" w:type="auto"/>
-        <w:tblInd w:w="151" w:type="dxa"/>
-        <w:tblBorders>
-          <w:top w:val="single" w:sz="4" w:space="0" w:color="000000"/>
-          <w:left w:val="single" w:sz="4" w:space="0" w:color="000000"/>
-          <w:bottom w:val="single" w:sz="4" w:space="0" w:color="000000"/>
-          <w:right w:val="single" w:sz="4" w:space="0" w:color="000000"/>
-          <w:insideH w:val="single" w:sz="4" w:space="0" w:color="000000"/>
-          <w:insideV w:val="single" w:sz="4" w:space="0" w:color="000000"/>
-        </w:tblBorders>
-        <w:tblLayout w:type="fixed"/>
-        <w:tblCellMar>
-          <w:left w:w="0" w:type="dxa"/>
-          <w:right w:w="0" w:type="dxa"/>
-        </w:tblCellMar>
-        <w:tblLook w:val="01E0" w:firstRow="1" w:lastRow="1" w:firstColumn="1" w:lastColumn="1" w:noHBand="0" w:noVBand="0"/>
-      </w:tblPr>
-      <w:tblGrid>
-        <w:gridCol w:w="4815"/>
-        <w:gridCol w:w="4815"/>
-      </w:tblGrid>
-      <w:tr>
-        <w:trPr>
-          <w:trHeight w:val="268"/>
-        </w:trPr>
-        <w:tc>
-          <w:tcPr>
-            <w:tcW w:w="4815" w:type="dxa"/>
-          </w:tcPr>
-          <w:p>
-            <w:pPr>
-              <w:pStyle w:val="TableParagraph"/>
-              <w:ind w:left="107"/>
-              <w:rPr>
-                <w:b/>
-              </w:rPr>
-            </w:pPr>
-            <w:proofErr w:type="spellStart"/>
-            <w:r>
-              <w:rPr>
-                <w:b/>
-              </w:rPr>
-              <w:t>GoF</w:t>
-            </w:r>
-            <w:proofErr w:type="spellEnd"/>
-            <w:r>
-              <w:rPr>
-                <w:b/>
-                <w:spacing w:val="-4"/>
-              </w:rPr>
-              <w:t xml:space="preserve"> </w:t>
-            </w:r>
-            <w:r>
-              <w:rPr>
-                <w:b/>
-                <w:spacing w:val="-2"/>
-              </w:rPr>
-              <w:t>Participants</w:t>
-            </w:r>
-          </w:p>
-        </w:tc>
-        <w:tc>
-          <w:tcPr>
-            <w:tcW w:w="4815" w:type="dxa"/>
-          </w:tcPr>
-          <w:p>
-            <w:pPr>
-              <w:pStyle w:val="TableParagraph"/>
-              <w:rPr>
-                <w:b/>
-              </w:rPr>
-            </w:pPr>
-            <w:r>
-              <w:rPr>
-                <w:b/>
-              </w:rPr>
-              <w:t>Class</w:t>
-            </w:r>
-            <w:r>
-              <w:rPr>
-                <w:b/>
-                <w:spacing w:val="-6"/>
-              </w:rPr>
-              <w:t xml:space="preserve"> </w:t>
-            </w:r>
-            <w:r>
-              <w:rPr>
-                <w:b/>
-                <w:spacing w:val="-2"/>
-              </w:rPr>
-              <w:t>Names</w:t>
-            </w:r>
-          </w:p>
-        </w:tc>
-      </w:tr>
-      <w:tr>
-        <w:trPr>
-          <w:trHeight w:val="268"/>
-        </w:trPr>
-        <w:tc>
-          <w:tcPr>
-            <w:tcW w:w="4815" w:type="dxa"/>
-          </w:tcPr>
-          <w:p>
-            <w:pPr>
-              <w:pStyle w:val="TableParagraph"/>
-              <w:ind w:left="107"/>
-            </w:pPr>
-          </w:p>
-        </w:tc>
-        <w:tc>
-          <w:tcPr>
-            <w:tcW w:w="4815" w:type="dxa"/>
-          </w:tcPr>
-          <w:p>
-            <w:pPr>
-              <w:pStyle w:val="TableParagraph"/>
-            </w:pPr>
-          </w:p>
-        </w:tc>
-      </w:tr>
-      <w:tr>
-        <w:trPr>
-          <w:trHeight w:val="268"/>
-        </w:trPr>
-        <w:tc>
-          <w:tcPr>
-            <w:tcW w:w="4815" w:type="dxa"/>
-          </w:tcPr>
-          <w:p>
-            <w:pPr>
-              <w:pStyle w:val="TableParagraph"/>
-              <w:ind w:left="107"/>
-            </w:pPr>
-          </w:p>
-        </w:tc>
-        <w:tc>
-          <w:tcPr>
-            <w:tcW w:w="4815" w:type="dxa"/>
-          </w:tcPr>
-          <w:p>
-            <w:pPr>
-              <w:pStyle w:val="TableParagraph"/>
-            </w:pPr>
-          </w:p>
-        </w:tc>
-      </w:tr>
-      <w:tr>
-        <w:trPr>
-          <w:trHeight w:val="269"/>
-        </w:trPr>
-        <w:tc>
-          <w:tcPr>
-            <w:tcW w:w="4815" w:type="dxa"/>
-          </w:tcPr>
-          <w:p>
-            <w:pPr>
-              <w:pStyle w:val="TableParagraph"/>
-              <w:spacing w:line="249" w:lineRule="exact"/>
-              <w:ind w:left="107"/>
-            </w:pPr>
-          </w:p>
-        </w:tc>
-        <w:tc>
-          <w:tcPr>
-            <w:tcW w:w="4815" w:type="dxa"/>
-          </w:tcPr>
-          <w:p>
-            <w:pPr>
-              <w:pStyle w:val="TableParagraph"/>
-              <w:spacing w:line="249" w:lineRule="exact"/>
-            </w:pPr>
-          </w:p>
-        </w:tc>
-      </w:tr>
-    </w:tbl>
-    <w:p>
-      <w:pPr>
-        <w:pStyle w:val="BodyText"/>
-        <w:spacing w:before="1"/>
-        <w:rPr>
-          <w:b/>
-        </w:rPr>
-      </w:pPr>
-    </w:p>
-    <w:p>
-      <w:pPr>
-        <w:pStyle w:val="BodyText"/>
-        <w:ind w:left="142" w:right="247"/>
-      </w:pPr>
-      <w:r>
-        <w:rPr>
-          <w:b/>
-          <w:color w:val="1F3863"/>
-        </w:rPr>
-        <w:t>Collaboration:</w:t>
-      </w:r>
-      <w:r>
-        <w:rPr>
-          <w:b/>
-          <w:color w:val="1F3863"/>
-          <w:spacing w:val="-2"/>
-        </w:rPr>
-        <w:t xml:space="preserve"> </w:t>
-      </w:r>
-    </w:p>
-    <w:p>
-      <w:pPr>
-        <w:pStyle w:val="BodyText"/>
-      </w:pPr>
-    </w:p>
-    <w:p>
-      <w:pPr>
-        <w:pStyle w:val="BodyText"/>
-        <w:ind w:left="142"/>
-      </w:pPr>
-      <w:r>
-        <w:rPr>
-          <w:b/>
-          <w:color w:val="1F3863"/>
-        </w:rPr>
-        <w:t>Variation:</w:t>
-      </w:r>
-      <w:r>
-        <w:rPr>
-          <w:b/>
-          <w:color w:val="1F3863"/>
-          <w:spacing w:val="-3"/>
-        </w:rPr>
-        <w:t xml:space="preserve"> </w:t>
-      </w:r>
-    </w:p>
-    <w:p>
-      <w:pPr>
-        <w:pStyle w:val="BodyText"/>
-      </w:pPr>
-    </w:p>
-    <w:p>
-      <w:pPr>
-        <w:pStyle w:val="BodyText"/>
-        <w:spacing w:before="1"/>
-        <w:ind w:left="142"/>
-        <w:sectPr>
-          <w:type w:val="continuous"/>
-          <w:pgSz w:w="11910" w:h="16840"/>
-          <w:pgMar w:top="1100" w:right="992" w:bottom="280" w:left="992" w:header="720" w:footer="720" w:gutter="0"/>
-          <w:cols w:space="720"/>
-        </w:sectPr>
-      </w:pPr>
-      <w:r>
-        <w:rPr>
-          <w:b/>
-          <w:color w:val="1F3863"/>
-        </w:rPr>
-        <w:t>Why</w:t>
-      </w:r>
-      <w:r>
-        <w:rPr>
-          <w:b/>
-          <w:color w:val="1F3863"/>
-          <w:spacing w:val="-3"/>
-        </w:rPr>
-        <w:t xml:space="preserve"> </w:t>
-      </w:r>
-      <w:r>
-        <w:rPr>
-          <w:b/>
-          <w:color w:val="1F3863"/>
-        </w:rPr>
+      <w:proofErr w:type="gramStart"/>
+      <w:r>
+        <w:t>The</w:t>
+      </w:r>
+      <w:r>
+        <w:rPr>
+          <w:spacing w:val="-2"/>
+        </w:rPr>
+        <w:t xml:space="preserve"> </w:t>
+      </w:r>
+      <w:r>
+        <w:t>Memento</w:t>
+      </w:r>
+      <w:proofErr w:type="gramEnd"/>
+      <w:r>
+        <w:rPr>
+          <w:spacing w:val="-3"/>
+        </w:rPr>
+        <w:t xml:space="preserve"> </w:t>
+      </w:r>
+      <w:r>
         <w:t>is</w:t>
       </w:r>
       <w:r>
         <w:rPr>
-          <w:b/>
-          <w:color w:val="1F3863"/>
-          <w:spacing w:val="-3"/>
-        </w:rPr>
-        <w:t xml:space="preserve"> </w:t>
-      </w:r>
-      <w:r>
-        <w:rPr>
-          <w:b/>
-          <w:color w:val="1F3863"/>
-        </w:rPr>
-        <w:t>it</w:t>
-      </w:r>
-      <w:r>
-        <w:rPr>
-          <w:b/>
-          <w:color w:val="1F3863"/>
-          <w:spacing w:val="-3"/>
-        </w:rPr>
-        <w:t xml:space="preserve"> </w:t>
-      </w:r>
-      <w:r>
-        <w:rPr>
-          <w:b/>
-          <w:color w:val="1F3863"/>
-        </w:rPr>
-        <w:t>appropriate:</w:t>
-      </w:r>
-      <w:r>
-        <w:rPr>
-          <w:b/>
-          <w:color w:val="1F3863"/>
-          <w:spacing w:val="-2"/>
-        </w:rPr>
-        <w:t xml:space="preserve"> </w:t>
-      </w:r>
-    </w:p>
-    <w:p>
-      <w:pPr>
-        <w:pStyle w:val="BodyText"/>
-        <w:spacing w:before="1"/>
-        <w:ind w:left="142"/>
-      </w:pPr>
-    </w:p>
-    <w:p>
-      <w:pPr>
-        <w:pStyle w:val="BodyText"/>
-        <w:spacing w:before="1"/>
-        <w:ind w:left="142"/>
-      </w:pPr>
-    </w:p>
-    <w:p>
-      <w:pPr>
-        <w:pStyle w:val="Heading3"/>
-        <w:numPr>
-          <w:ilvl w:val="0"/>
-          <w:numId w:val="2"/>
-        </w:numPr>
-        <w:tabs>
-          <w:tab w:val="left" w:pos="561"/>
-        </w:tabs>
-        <w:spacing w:before="268" w:line="342" w:lineRule="exact"/>
-        <w:ind w:left="561" w:hanging="419"/>
-      </w:pPr>
-      <w:r>
-        <w:rPr>
-          <w:color w:val="1F3863"/>
-          <w:spacing w:val="-2"/>
-        </w:rPr>
-        <w:t>Pattern 3</w:t>
-      </w:r>
-    </w:p>
-    <w:p>
-      <w:pPr>
-        <w:pStyle w:val="BodyText"/>
-        <w:ind w:left="142" w:right="251"/>
-      </w:pPr>
-      <w:r>
-        <w:rPr>
-          <w:b/>
-          <w:color w:val="1F3863"/>
-        </w:rPr>
-        <w:t>Problem:</w:t>
-      </w:r>
-      <w:r>
-        <w:rPr>
-          <w:b/>
-          <w:color w:val="1F3863"/>
-          <w:spacing w:val="-3"/>
-        </w:rPr>
-        <w:t xml:space="preserve"> </w:t>
-      </w:r>
-    </w:p>
-    <w:p>
-      <w:pPr>
-        <w:pStyle w:val="BodyText"/>
-        <w:spacing w:before="1"/>
-      </w:pPr>
-    </w:p>
-    <w:p>
-      <w:pPr>
-        <w:pStyle w:val="Heading4"/>
-      </w:pPr>
-      <w:r>
-        <w:rPr>
-          <w:color w:val="1F3863"/>
-          <w:spacing w:val="-2"/>
-        </w:rPr>
-        <w:t>Participants:</w:t>
-      </w:r>
-    </w:p>
-    <w:tbl>
-      <w:tblPr>
-        <w:tblW w:w="0" w:type="auto"/>
-        <w:tblInd w:w="151" w:type="dxa"/>
-        <w:tblBorders>
-          <w:top w:val="single" w:sz="4" w:space="0" w:color="000000"/>
-          <w:left w:val="single" w:sz="4" w:space="0" w:color="000000"/>
-          <w:bottom w:val="single" w:sz="4" w:space="0" w:color="000000"/>
-          <w:right w:val="single" w:sz="4" w:space="0" w:color="000000"/>
-          <w:insideH w:val="single" w:sz="4" w:space="0" w:color="000000"/>
-          <w:insideV w:val="single" w:sz="4" w:space="0" w:color="000000"/>
-        </w:tblBorders>
-        <w:tblLayout w:type="fixed"/>
-        <w:tblCellMar>
-          <w:left w:w="0" w:type="dxa"/>
-          <w:right w:w="0" w:type="dxa"/>
-        </w:tblCellMar>
-        <w:tblLook w:val="01E0" w:firstRow="1" w:lastRow="1" w:firstColumn="1" w:lastColumn="1" w:noHBand="0" w:noVBand="0"/>
-      </w:tblPr>
-      <w:tblGrid>
-        <w:gridCol w:w="4815"/>
-        <w:gridCol w:w="4815"/>
-      </w:tblGrid>
-      <w:tr>
-        <w:trPr>
-          <w:trHeight w:val="268"/>
-        </w:trPr>
-        <w:tc>
-          <w:tcPr>
-            <w:tcW w:w="4815" w:type="dxa"/>
-          </w:tcPr>
-          <w:p>
-            <w:pPr>
-              <w:pStyle w:val="TableParagraph"/>
-              <w:ind w:left="107"/>
-              <w:rPr>
-                <w:b/>
-              </w:rPr>
-            </w:pPr>
-            <w:proofErr w:type="spellStart"/>
-            <w:r>
-              <w:rPr>
-                <w:b/>
-              </w:rPr>
-              <w:t>GoF</w:t>
-            </w:r>
-            <w:proofErr w:type="spellEnd"/>
-            <w:r>
-              <w:rPr>
-                <w:b/>
-                <w:spacing w:val="-4"/>
-              </w:rPr>
-              <w:t xml:space="preserve"> </w:t>
-            </w:r>
-            <w:r>
-              <w:rPr>
-                <w:b/>
-                <w:spacing w:val="-2"/>
-              </w:rPr>
-              <w:t>Participants</w:t>
-            </w:r>
-          </w:p>
-        </w:tc>
-        <w:tc>
-          <w:tcPr>
-            <w:tcW w:w="4815" w:type="dxa"/>
-          </w:tcPr>
-          <w:p>
-            <w:pPr>
-              <w:pStyle w:val="TableParagraph"/>
-              <w:rPr>
-                <w:b/>
-              </w:rPr>
-            </w:pPr>
-            <w:r>
-              <w:rPr>
-                <w:b/>
-              </w:rPr>
-              <w:t>Class</w:t>
-            </w:r>
-            <w:r>
-              <w:rPr>
-                <w:b/>
-                <w:spacing w:val="-6"/>
-              </w:rPr>
-              <w:t xml:space="preserve"> </w:t>
-            </w:r>
-            <w:r>
-              <w:rPr>
-                <w:b/>
-                <w:spacing w:val="-2"/>
-              </w:rPr>
-              <w:t>Names</w:t>
-            </w:r>
-          </w:p>
-        </w:tc>
-      </w:tr>
-      <w:tr>
-        <w:trPr>
-          <w:trHeight w:val="268"/>
-        </w:trPr>
-        <w:tc>
-          <w:tcPr>
-            <w:tcW w:w="4815" w:type="dxa"/>
-          </w:tcPr>
-          <w:p>
-            <w:pPr>
-              <w:pStyle w:val="TableParagraph"/>
-              <w:ind w:left="107"/>
-            </w:pPr>
-          </w:p>
-        </w:tc>
-        <w:tc>
-          <w:tcPr>
-            <w:tcW w:w="4815" w:type="dxa"/>
-          </w:tcPr>
-          <w:p>
-            <w:pPr>
-              <w:pStyle w:val="TableParagraph"/>
-            </w:pPr>
-          </w:p>
-        </w:tc>
-      </w:tr>
-      <w:tr>
-        <w:trPr>
-          <w:trHeight w:val="268"/>
-        </w:trPr>
-        <w:tc>
-          <w:tcPr>
-            <w:tcW w:w="4815" w:type="dxa"/>
-          </w:tcPr>
-          <w:p>
-            <w:pPr>
-              <w:pStyle w:val="TableParagraph"/>
-              <w:ind w:left="107"/>
-            </w:pPr>
-          </w:p>
-        </w:tc>
-        <w:tc>
-          <w:tcPr>
-            <w:tcW w:w="4815" w:type="dxa"/>
-          </w:tcPr>
-          <w:p>
-            <w:pPr>
-              <w:pStyle w:val="TableParagraph"/>
-            </w:pPr>
-          </w:p>
-        </w:tc>
-      </w:tr>
-      <w:tr>
-        <w:trPr>
-          <w:trHeight w:val="269"/>
-        </w:trPr>
-        <w:tc>
-          <w:tcPr>
-            <w:tcW w:w="4815" w:type="dxa"/>
-          </w:tcPr>
-          <w:p>
-            <w:pPr>
-              <w:pStyle w:val="TableParagraph"/>
-              <w:spacing w:line="249" w:lineRule="exact"/>
-              <w:ind w:left="107"/>
-            </w:pPr>
-          </w:p>
-        </w:tc>
-        <w:tc>
-          <w:tcPr>
-            <w:tcW w:w="4815" w:type="dxa"/>
-          </w:tcPr>
-          <w:p>
-            <w:pPr>
-              <w:pStyle w:val="TableParagraph"/>
-              <w:spacing w:line="249" w:lineRule="exact"/>
-            </w:pPr>
-          </w:p>
-        </w:tc>
-      </w:tr>
-      <w:tr>
-        <w:trPr>
-          <w:trHeight w:val="269"/>
-        </w:trPr>
-        <w:tc>
-          <w:tcPr>
-            <w:tcW w:w="4815" w:type="dxa"/>
-          </w:tcPr>
-          <w:p>
-            <w:pPr>
-              <w:pStyle w:val="TableParagraph"/>
-              <w:spacing w:line="249" w:lineRule="exact"/>
-              <w:ind w:left="107"/>
-              <w:rPr>
-                <w:spacing w:val="-2"/>
-              </w:rPr>
-            </w:pPr>
-          </w:p>
-        </w:tc>
-        <w:tc>
-          <w:tcPr>
-            <w:tcW w:w="4815" w:type="dxa"/>
-          </w:tcPr>
-          <w:p>
-            <w:pPr>
-              <w:pStyle w:val="TableParagraph"/>
-              <w:spacing w:line="249" w:lineRule="exact"/>
-              <w:rPr>
-                <w:spacing w:val="-2"/>
-              </w:rPr>
-            </w:pPr>
-          </w:p>
-        </w:tc>
-      </w:tr>
-      <w:tr>
-        <w:trPr>
-          <w:trHeight w:val="269"/>
-        </w:trPr>
-        <w:tc>
-          <w:tcPr>
-            <w:tcW w:w="4815" w:type="dxa"/>
-          </w:tcPr>
-          <w:p>
-            <w:pPr>
-              <w:pStyle w:val="TableParagraph"/>
-              <w:spacing w:line="249" w:lineRule="exact"/>
-              <w:ind w:left="107"/>
-              <w:rPr>
-                <w:spacing w:val="-2"/>
-              </w:rPr>
-            </w:pPr>
-          </w:p>
-        </w:tc>
-        <w:tc>
-          <w:tcPr>
-            <w:tcW w:w="4815" w:type="dxa"/>
-          </w:tcPr>
-          <w:p>
-            <w:pPr>
-              <w:pStyle w:val="TableParagraph"/>
-              <w:spacing w:line="249" w:lineRule="exact"/>
-              <w:rPr>
-                <w:spacing w:val="-2"/>
-              </w:rPr>
-            </w:pPr>
-          </w:p>
-        </w:tc>
-      </w:tr>
-    </w:tbl>
-    <w:p>
-      <w:pPr>
-        <w:pStyle w:val="BodyText"/>
-        <w:spacing w:before="1"/>
-        <w:rPr>
-          <w:b/>
-        </w:rPr>
-      </w:pPr>
-    </w:p>
-    <w:p>
-      <w:pPr>
-        <w:pStyle w:val="BodyText"/>
-        <w:ind w:left="142" w:right="247"/>
-      </w:pPr>
-      <w:r>
-        <w:rPr>
-          <w:b/>
-          <w:color w:val="1F3863"/>
-        </w:rPr>
-        <w:t>Collaboration:</w:t>
-      </w:r>
-      <w:r>
-        <w:rPr>
-          <w:b/>
-          <w:color w:val="1F3863"/>
-          <w:spacing w:val="-2"/>
-        </w:rPr>
-        <w:t xml:space="preserve"> </w:t>
-      </w:r>
-    </w:p>
-    <w:p>
-      <w:pPr>
-        <w:pStyle w:val="BodyText"/>
-      </w:pPr>
-    </w:p>
-    <w:p>
-      <w:pPr>
-        <w:pStyle w:val="BodyText"/>
-        <w:ind w:left="142"/>
-      </w:pPr>
-      <w:r>
-        <w:rPr>
-          <w:b/>
-          <w:color w:val="1F3863"/>
-        </w:rPr>
-        <w:t>Variation:</w:t>
-      </w:r>
-      <w:r>
-        <w:rPr>
-          <w:b/>
-          <w:color w:val="1F3863"/>
-          <w:spacing w:val="-3"/>
-        </w:rPr>
-        <w:t xml:space="preserve"> </w:t>
-      </w:r>
-    </w:p>
-    <w:p>
-      <w:pPr>
-        <w:pStyle w:val="BodyText"/>
-      </w:pPr>
-    </w:p>
-    <w:p>
-      <w:pPr>
-        <w:pStyle w:val="BodyText"/>
-        <w:spacing w:before="1"/>
-        <w:ind w:left="142"/>
-        <w:sectPr>
-          <w:type w:val="continuous"/>
-          <w:pgSz w:w="11910" w:h="16840"/>
-          <w:pgMar w:top="1100" w:right="992" w:bottom="280" w:left="992" w:header="720" w:footer="720" w:gutter="0"/>
-          <w:cols w:space="720"/>
-        </w:sectPr>
-      </w:pPr>
-      <w:r>
-        <w:rPr>
-          <w:b/>
-          <w:color w:val="1F3863"/>
-        </w:rPr>
-        <w:t>Why</w:t>
-      </w:r>
-      <w:r>
-        <w:rPr>
-          <w:b/>
-          <w:color w:val="1F3863"/>
-          <w:spacing w:val="-3"/>
-        </w:rPr>
-        <w:t xml:space="preserve"> </w:t>
-      </w:r>
-      <w:r>
-        <w:rPr>
-          <w:b/>
-          <w:color w:val="1F3863"/>
-        </w:rPr>
-        <w:t>is</w:t>
-      </w:r>
-      <w:r>
-        <w:rPr>
-          <w:b/>
-          <w:color w:val="1F3863"/>
-          <w:spacing w:val="-3"/>
-        </w:rPr>
-        <w:t xml:space="preserve"> </w:t>
-      </w:r>
-      <w:r>
-        <w:rPr>
-          <w:b/>
-          <w:color w:val="1F3863"/>
-        </w:rPr>
-        <w:t>it</w:t>
-      </w:r>
-      <w:r>
-        <w:rPr>
-          <w:b/>
-          <w:color w:val="1F3863"/>
-          <w:spacing w:val="-3"/>
-        </w:rPr>
-        <w:t xml:space="preserve"> </w:t>
-      </w:r>
-      <w:r>
-        <w:rPr>
-          <w:b/>
-          <w:color w:val="1F3863"/>
-        </w:rPr>
-        <w:t>appropriate:</w:t>
-      </w:r>
-      <w:r>
-        <w:rPr>
-          <w:b/>
-          <w:color w:val="1F3863"/>
-          <w:spacing w:val="-2"/>
-        </w:rPr>
-        <w:t xml:space="preserve"> </w:t>
-      </w:r>
-    </w:p>
-    <w:p>
-      <w:pPr>
-        <w:pStyle w:val="BodyText"/>
-        <w:spacing w:before="1"/>
-        <w:ind w:left="142"/>
-      </w:pPr>
-    </w:p>
-    <w:p>
-      <w:pPr>
-        <w:pStyle w:val="BodyText"/>
-        <w:spacing w:before="1"/>
-        <w:ind w:left="142"/>
-      </w:pPr>
-    </w:p>
-    <w:p>
-      <w:pPr>
-        <w:pStyle w:val="Heading3"/>
-        <w:numPr>
-          <w:ilvl w:val="0"/>
-          <w:numId w:val="2"/>
-        </w:numPr>
-        <w:tabs>
-          <w:tab w:val="left" w:pos="561"/>
-        </w:tabs>
-        <w:spacing w:before="268" w:line="342" w:lineRule="exact"/>
-        <w:ind w:left="561" w:hanging="419"/>
-      </w:pPr>
-      <w:r>
-        <w:rPr>
-          <w:color w:val="1F3863"/>
-          <w:spacing w:val="-2"/>
-        </w:rPr>
-        <w:t>Facade</w:t>
-      </w:r>
-    </w:p>
-    <w:p>
-      <w:pPr>
-        <w:pStyle w:val="BodyText"/>
-        <w:ind w:left="142" w:right="251"/>
-      </w:pPr>
-      <w:r>
-        <w:rPr>
-          <w:b/>
-          <w:color w:val="1F3863"/>
-        </w:rPr>
-        <w:t>Problem:</w:t>
-      </w:r>
-      <w:r>
-        <w:rPr>
-          <w:b/>
-          <w:color w:val="1F3863"/>
-          <w:spacing w:val="-3"/>
-        </w:rPr>
-        <w:t xml:space="preserve"> </w:t>
-      </w:r>
-      <w:r>
-        <w:t>To place an order, the outside world would otherwise have to deal with the designer and builder, the engine, the rollback and command history, the assignment service and the audit log. This leaks the system’s structure to every user of TIVIDY and makes it easy to call things in the wrong order.</w:t>
-      </w:r>
-    </w:p>
-    <w:p>
-      <w:pPr>
-        <w:pStyle w:val="BodyText"/>
-        <w:spacing w:before="1"/>
-      </w:pPr>
-    </w:p>
-    <w:p>
-      <w:pPr>
-        <w:pStyle w:val="Heading4"/>
-      </w:pPr>
-      <w:r>
-        <w:rPr>
-          <w:color w:val="1F3863"/>
-          <w:spacing w:val="-2"/>
-        </w:rPr>
-        <w:t>Participants:</w:t>
-      </w:r>
-    </w:p>
-    <w:tbl>
-      <w:tblPr>
-        <w:tblW w:w="0" w:type="auto"/>
-        <w:tblInd w:w="151" w:type="dxa"/>
-        <w:tblBorders>
-          <w:top w:val="single" w:sz="4" w:space="0" w:color="000000"/>
-          <w:left w:val="single" w:sz="4" w:space="0" w:color="000000"/>
-          <w:bottom w:val="single" w:sz="4" w:space="0" w:color="000000"/>
-          <w:right w:val="single" w:sz="4" w:space="0" w:color="000000"/>
-          <w:insideH w:val="single" w:sz="4" w:space="0" w:color="000000"/>
-          <w:insideV w:val="single" w:sz="4" w:space="0" w:color="000000"/>
-        </w:tblBorders>
-        <w:tblLayout w:type="fixed"/>
-        <w:tblCellMar>
-          <w:left w:w="0" w:type="dxa"/>
-          <w:right w:w="0" w:type="dxa"/>
-        </w:tblCellMar>
-        <w:tblLook w:val="01E0" w:firstRow="1" w:lastRow="1" w:firstColumn="1" w:lastColumn="1" w:noHBand="0" w:noVBand="0"/>
-      </w:tblPr>
-      <w:tblGrid>
-        <w:gridCol w:w="4815"/>
-        <w:gridCol w:w="4815"/>
-      </w:tblGrid>
-      <w:tr>
-        <w:trPr>
-          <w:trHeight w:val="268"/>
-        </w:trPr>
-        <w:tc>
-          <w:tcPr>
-            <w:tcW w:w="4815" w:type="dxa"/>
-          </w:tcPr>
-          <w:p>
-            <w:pPr>
-              <w:pStyle w:val="TableParagraph"/>
-              <w:ind w:left="107"/>
-              <w:rPr>
-                <w:b/>
-              </w:rPr>
-            </w:pPr>
-            <w:proofErr w:type="spellStart"/>
-            <w:r>
-              <w:rPr>
-                <w:b/>
-              </w:rPr>
-              <w:t>GoF</w:t>
-            </w:r>
-            <w:proofErr w:type="spellEnd"/>
-            <w:r>
-              <w:rPr>
-                <w:b/>
-                <w:spacing w:val="-4"/>
-              </w:rPr>
-              <w:t xml:space="preserve"> </w:t>
-            </w:r>
-            <w:r>
-              <w:rPr>
-                <w:b/>
-                <w:spacing w:val="-2"/>
-              </w:rPr>
-              <w:t>Participants</w:t>
-            </w:r>
-          </w:p>
-        </w:tc>
-        <w:tc>
-          <w:tcPr>
-            <w:tcW w:w="4815" w:type="dxa"/>
-          </w:tcPr>
-          <w:p>
-            <w:pPr>
-              <w:pStyle w:val="TableParagraph"/>
-              <w:rPr>
-                <w:b/>
-              </w:rPr>
-            </w:pPr>
-            <w:r>
-              <w:rPr>
-                <w:b/>
-              </w:rPr>
-              <w:t>Class</w:t>
-            </w:r>
-            <w:r>
-              <w:rPr>
-                <w:b/>
-                <w:spacing w:val="-6"/>
-              </w:rPr>
-              <w:t xml:space="preserve"> </w:t>
-            </w:r>
-            <w:r>
-              <w:rPr>
-                <w:b/>
-                <w:spacing w:val="-2"/>
-              </w:rPr>
-              <w:t>Names</w:t>
-            </w:r>
-          </w:p>
-        </w:tc>
-      </w:tr>
-      <w:tr>
-        <w:trPr>
-          <w:trHeight w:val="268"/>
-        </w:trPr>
-        <w:tc>
-          <w:tcPr>
-            <w:tcW w:w="4815" w:type="dxa"/>
-          </w:tcPr>
-          <w:p>
-            <w:pPr>
-              <w:pStyle w:val="TableParagraph"/>
-              <w:ind w:left="107"/>
-            </w:pPr>
-            <w:r>
-              <w:rPr>
-                <w:spacing w:val="-2"/>
-              </w:rPr>
-              <w:t>Facade</w:t>
-            </w:r>
-          </w:p>
-        </w:tc>
-        <w:tc>
-          <w:tcPr>
-            <w:tcW w:w="4815" w:type="dxa"/>
-          </w:tcPr>
-          <w:p>
-            <w:pPr>
-              <w:pStyle w:val="TableParagraph"/>
-            </w:pPr>
-            <w:proofErr w:type="spellStart"/>
-            <w:r>
-              <w:rPr>
-                <w:spacing w:val="-2"/>
-              </w:rPr>
-              <w:t>TividyFacade</w:t>
-            </w:r>
-            <w:proofErr w:type="spellEnd"/>
-          </w:p>
-        </w:tc>
-      </w:tr>
-      <w:tr>
-        <w:trPr>
-          <w:trHeight w:val="268"/>
-        </w:trPr>
-        <w:tc>
-          <w:tcPr>
-            <w:tcW w:w="4815" w:type="dxa"/>
-          </w:tcPr>
-          <w:p>
-            <w:pPr>
-              <w:pStyle w:val="TableParagraph"/>
-              <w:ind w:left="107"/>
-            </w:pPr>
-            <w:r>
-              <w:rPr>
-                <w:spacing w:val="-2"/>
-              </w:rPr>
-              <w:t>Subsystem classes</w:t>
-            </w:r>
-          </w:p>
-        </w:tc>
-        <w:tc>
-          <w:tcPr>
-            <w:tcW w:w="4815" w:type="dxa"/>
-          </w:tcPr>
-          <w:p>
-            <w:pPr>
-              <w:pStyle w:val="TableParagraph"/>
-            </w:pPr>
-          </w:p>
-        </w:tc>
-      </w:tr>
-    </w:tbl>
-    <w:p>
-      <w:pPr>
-        <w:pStyle w:val="BodyText"/>
-        <w:spacing w:before="1"/>
-        <w:rPr>
-          <w:b/>
-        </w:rPr>
-      </w:pPr>
-    </w:p>
-    <w:p>
-      <w:pPr>
-        <w:pStyle w:val="BodyText"/>
-        <w:ind w:left="142" w:right="247"/>
-      </w:pPr>
-      <w:r>
-        <w:rPr>
-          <w:b/>
-          <w:color w:val="1F3863"/>
-        </w:rPr>
-        <w:t>Collaboration:</w:t>
-      </w:r>
-      <w:r>
-        <w:rPr>
-          <w:b/>
-          <w:color w:val="1F3863"/>
-          <w:spacing w:val="-2"/>
-        </w:rPr>
-        <w:t xml:space="preserve"> </w:t>
-      </w:r>
-      <w:r>
-        <w:t>T</w:t>
-      </w:r>
-      <w:r>
-        <w:t xml:space="preserve">he client talks only to </w:t>
+          <w:spacing w:val="-2"/>
+        </w:rPr>
+        <w:t xml:space="preserve"> </w:t>
+      </w:r>
+      <w:r>
+        <w:t>the</w:t>
+      </w:r>
+      <w:r>
+        <w:rPr>
+          <w:spacing w:val="-2"/>
+        </w:rPr>
+        <w:t xml:space="preserve"> </w:t>
       </w:r>
       <w:proofErr w:type="gramStart"/>
       <w:r>
-        <w:t xml:space="preserve">the </w:t>
-      </w:r>
-      <w:proofErr w:type="spellStart"/>
-      <w:r>
-        <w:t>TividyFacade</w:t>
-      </w:r>
-      <w:proofErr w:type="spellEnd"/>
+        <w:t>undo</w:t>
+      </w:r>
       <w:proofErr w:type="gramEnd"/>
       <w:r>
-        <w:t>. When it asks to place an order, the facade gets a definition from the designer, has the engine start an instance from it, and sets up the listeners. When the client asks to cancel or change an order, the facade passes the request to the command invoker. The subsystem classes do the work and do not know the facade exists.</w:t>
-      </w:r>
-    </w:p>
-    <w:p>
-      <w:pPr>
-        <w:pStyle w:val="BodyText"/>
-      </w:pPr>
-    </w:p>
-    <w:p>
-      <w:pPr>
-        <w:pStyle w:val="BodyText"/>
-        <w:ind w:left="142"/>
-      </w:pPr>
-      <w:r>
-        <w:rPr>
-          <w:b/>
-          <w:color w:val="1F3863"/>
-        </w:rPr>
-        <w:t>Variation:</w:t>
-      </w:r>
-      <w:r>
-        <w:rPr>
-          <w:b/>
-          <w:color w:val="1F3863"/>
-          <w:spacing w:val="-3"/>
-        </w:rPr>
-        <w:t xml:space="preserve"> </w:t>
-      </w:r>
-      <w:r>
-        <w:t>The set of simple operations that clients need (place an order, cancel, track, report) can change and grow without changing the subsystem classes behind them.</w:t>
-      </w:r>
-    </w:p>
-    <w:p>
-      <w:pPr>
-        <w:pStyle w:val="BodyText"/>
-      </w:pPr>
-    </w:p>
-    <w:p>
-      <w:pPr>
-        <w:pStyle w:val="BodyText"/>
-        <w:spacing w:before="1"/>
-        <w:ind w:left="142"/>
-        <w:sectPr>
-          <w:type w:val="continuous"/>
-          <w:pgSz w:w="11910" w:h="16840"/>
-          <w:pgMar w:top="1100" w:right="992" w:bottom="280" w:left="992" w:header="720" w:footer="720" w:gutter="0"/>
-          <w:cols w:space="720"/>
-        </w:sectPr>
-      </w:pPr>
-      <w:r>
-        <w:rPr>
-          <w:b/>
-          <w:color w:val="1F3863"/>
-        </w:rPr>
-        <w:t>Why</w:t>
-      </w:r>
-      <w:r>
-        <w:rPr>
-          <w:b/>
-          <w:color w:val="1F3863"/>
-          <w:spacing w:val="-3"/>
-        </w:rPr>
-        <w:t xml:space="preserve"> </w:t>
-      </w:r>
-      <w:r>
-        <w:rPr>
-          <w:b/>
-          <w:color w:val="1F3863"/>
-        </w:rPr>
-        <w:t>is</w:t>
-      </w:r>
-      <w:r>
-        <w:rPr>
-          <w:b/>
-          <w:color w:val="1F3863"/>
-          <w:spacing w:val="-3"/>
-        </w:rPr>
-        <w:t xml:space="preserve"> </w:t>
-      </w:r>
-      <w:r>
-        <w:rPr>
-          <w:b/>
-          <w:color w:val="1F3863"/>
-        </w:rPr>
-        <w:t>it</w:t>
-      </w:r>
-      <w:r>
-        <w:rPr>
-          <w:b/>
-          <w:color w:val="1F3863"/>
-          <w:spacing w:val="-3"/>
-        </w:rPr>
-        <w:t xml:space="preserve"> </w:t>
-      </w:r>
-      <w:r>
-        <w:rPr>
-          <w:b/>
-          <w:color w:val="1F3863"/>
-        </w:rPr>
-        <w:t>appropriate:</w:t>
-      </w:r>
-      <w:r>
-        <w:rPr>
-          <w:b/>
-          <w:color w:val="1F3863"/>
-          <w:spacing w:val="-2"/>
-        </w:rPr>
-        <w:t xml:space="preserve"> </w:t>
-      </w:r>
-      <w:r>
-        <w:t xml:space="preserve">Facade is the entry point of the system. It hides the many cooperating subsystems behind a few operations, so the rest of the application can use TIVIDY without knowing its structure, and the </w:t>
-      </w:r>
-      <w:r>
-        <w:lastRenderedPageBreak/>
-        <w:t xml:space="preserve">subsystems can be </w:t>
-      </w:r>
-      <w:proofErr w:type="spellStart"/>
-      <w:r>
-        <w:t>reorganised</w:t>
-      </w:r>
-      <w:proofErr w:type="spellEnd"/>
-      <w:r>
-        <w:t xml:space="preserve"> without affecting users.</w:t>
-      </w:r>
-    </w:p>
-    <w:p>
-      <w:pPr>
-        <w:pStyle w:val="BodyText"/>
-        <w:spacing w:before="1"/>
-        <w:ind w:left="142"/>
-        <w:sectPr>
-          <w:type w:val="continuous"/>
-          <w:pgSz w:w="11910" w:h="16840"/>
-          <w:pgMar w:top="1100" w:right="992" w:bottom="280" w:left="992" w:header="720" w:footer="720" w:gutter="0"/>
-          <w:cols w:space="720"/>
-        </w:sectPr>
-      </w:pPr>
+        <w:rPr>
+          <w:spacing w:val="-3"/>
+        </w:rPr>
+        <w:t xml:space="preserve"> </w:t>
+      </w:r>
+      <w:r>
+        <w:t>and</w:t>
+      </w:r>
+      <w:r>
+        <w:rPr>
+          <w:spacing w:val="-2"/>
+        </w:rPr>
+        <w:t xml:space="preserve"> </w:t>
+      </w:r>
+      <w:r>
+        <w:t>rollback</w:t>
+      </w:r>
+      <w:r>
+        <w:rPr>
+          <w:spacing w:val="-3"/>
+        </w:rPr>
+        <w:t xml:space="preserve"> </w:t>
+      </w:r>
+      <w:r>
+        <w:t>side</w:t>
+      </w:r>
+      <w:r>
+        <w:rPr>
+          <w:spacing w:val="-2"/>
+        </w:rPr>
+        <w:t xml:space="preserve"> </w:t>
+      </w:r>
+      <w:r>
+        <w:t>of</w:t>
+      </w:r>
+      <w:r>
+        <w:rPr>
+          <w:spacing w:val="-3"/>
+        </w:rPr>
+        <w:t xml:space="preserve"> </w:t>
+      </w:r>
+      <w:r>
+        <w:t>the</w:t>
+      </w:r>
+      <w:r>
+        <w:rPr>
+          <w:spacing w:val="-2"/>
+        </w:rPr>
+        <w:t xml:space="preserve"> </w:t>
+      </w:r>
+      <w:r>
+        <w:t>system.</w:t>
+      </w:r>
+      <w:r>
+        <w:rPr>
+          <w:spacing w:val="-3"/>
+        </w:rPr>
+        <w:t xml:space="preserve"> </w:t>
+      </w:r>
+      <w:r>
+        <w:t>Restoring</w:t>
+      </w:r>
+      <w:r>
+        <w:rPr>
+          <w:spacing w:val="-3"/>
+        </w:rPr>
+        <w:t xml:space="preserve"> </w:t>
+      </w:r>
+      <w:r>
+        <w:t>from</w:t>
+      </w:r>
+      <w:r>
+        <w:rPr>
+          <w:spacing w:val="-3"/>
+        </w:rPr>
+        <w:t xml:space="preserve"> </w:t>
+      </w:r>
+      <w:r>
+        <w:t>a</w:t>
+      </w:r>
+      <w:r>
+        <w:rPr>
+          <w:spacing w:val="-3"/>
+        </w:rPr>
+        <w:t xml:space="preserve"> </w:t>
+      </w:r>
+      <w:r>
+        <w:t>snapshot returns the order to a known-good point while the history only grows, so the record stays a</w:t>
+      </w:r>
     </w:p>
     <w:p>
       <w:pPr>
@@ -20568,15 +18924,7 @@
         <w:t>decided</w:t>
       </w:r>
       <w:r>
-        <w:t xml:space="preserve"> as a </w:t>
-      </w:r>
-      <w:proofErr w:type="gramStart"/>
-      <w:r>
-        <w:t>group</w:t>
-      </w:r>
-      <w:proofErr w:type="gramEnd"/>
-      <w:r>
-        <w:t xml:space="preserve"> we will then make the relevant updates to the required diagrams/sections.</w:t>
+        <w:t xml:space="preserve"> as a group we will then make the relevant updates to the required diagrams/sections.</w:t>
       </w:r>
     </w:p>
     <w:p>
@@ -21427,6 +19775,7 @@
         </w:rPr>
         <w:t xml:space="preserve"> </w:t>
       </w:r>
+      <w:proofErr w:type="spellStart"/>
       <w:r>
         <w:rPr>
           <w:spacing w:val="-2"/>
@@ -21434,6 +19783,7 @@
         </w:rPr>
         <w:t>Ngeletshedzo</w:t>
       </w:r>
+      <w:proofErr w:type="spellEnd"/>
     </w:p>
     <w:p>
       <w:pPr>
@@ -23467,7 +21817,6 @@
   <w:style w:type="paragraph" w:styleId="Heading3">
     <w:name w:val="heading 3"/>
     <w:basedOn w:val="Normal"/>
-    <w:link w:val="Heading3Char"/>
     <w:uiPriority w:val="9"/>
     <w:unhideWhenUsed/>
     <w:qFormat/>
@@ -23485,7 +21834,6 @@
   <w:style w:type="paragraph" w:styleId="Heading4">
     <w:name w:val="heading 4"/>
     <w:basedOn w:val="Normal"/>
-    <w:link w:val="Heading4Char"/>
     <w:uiPriority w:val="9"/>
     <w:unhideWhenUsed/>
     <w:qFormat/>
@@ -23528,7 +21876,6 @@
   <w:style w:type="paragraph" w:styleId="BodyText">
     <w:name w:val="Body Text"/>
     <w:basedOn w:val="Normal"/>
-    <w:link w:val="BodyTextChar"/>
     <w:uiPriority w:val="1"/>
     <w:qFormat/>
   </w:style>
@@ -23563,42 +21910,6 @@
       <w:bCs/>
       <w:sz w:val="30"/>
       <w:szCs w:val="30"/>
-    </w:rPr>
-  </w:style>
-  <w:style w:type="character" w:customStyle="1" w:styleId="Heading3Char">
-    <w:name w:val="Heading 3 Char"/>
-    <w:basedOn w:val="DefaultParagraphFont"/>
-    <w:link w:val="Heading3"/>
-    <w:uiPriority w:val="9"/>
-    <w:rsid w:val="00190679"/>
-    <w:rPr>
-      <w:rFonts w:ascii="Calibri" w:eastAsia="Calibri" w:hAnsi="Calibri" w:cs="Calibri"/>
-      <w:b/>
-      <w:bCs/>
-      <w:sz w:val="28"/>
-      <w:szCs w:val="28"/>
-    </w:rPr>
-  </w:style>
-  <w:style w:type="character" w:customStyle="1" w:styleId="Heading4Char">
-    <w:name w:val="Heading 4 Char"/>
-    <w:basedOn w:val="DefaultParagraphFont"/>
-    <w:link w:val="Heading4"/>
-    <w:uiPriority w:val="9"/>
-    <w:rsid w:val="00190679"/>
-    <w:rPr>
-      <w:rFonts w:ascii="Calibri" w:eastAsia="Calibri" w:hAnsi="Calibri" w:cs="Calibri"/>
-      <w:b/>
-      <w:bCs/>
-    </w:rPr>
-  </w:style>
-  <w:style w:type="character" w:customStyle="1" w:styleId="BodyTextChar">
-    <w:name w:val="Body Text Char"/>
-    <w:basedOn w:val="DefaultParagraphFont"/>
-    <w:link w:val="BodyText"/>
-    <w:uiPriority w:val="1"/>
-    <w:rsid w:val="00190679"/>
-    <w:rPr>
-      <w:rFonts w:ascii="Calibri" w:eastAsia="Calibri" w:hAnsi="Calibri" w:cs="Calibri"/>
     </w:rPr>
   </w:style>
 </w:styles>

</xml_diff>